<commit_message>
Tài liệu nối anh Tune: kết quả kiểm swagger tối 01/10 (705 đường không đổi, chưa có đường nhận phiếu đề nghị)
Co-Authored-By: Claude Opus 5.5 (1M context) <noreply@anthropic.com>
</commit_message>
<xml_diff>
--- a/DOCS/word/NOI_API_ANH_TUNE.docx
+++ b/DOCS/word/NOI_API_ANH_TUNE.docx
@@ -6838,6 +6838,211 @@
       </w:r>
       <w:r>
         <w:t xml:space="preserve"> đang nối thẳng sang hệ anh.</w:t>
+      </w:r>
+    </w:p>
+    <w:p>
+      <w:pPr>
+        <w:jc w:val="both"/>
+      </w:pPr>
+      <w:r>
+        <w:rPr>
+          <w:b/>
+        </w:rPr>
+        <w:t>Kiểm lại tối 01/10 trên máy `demo-lao-api`</w:t>
+      </w:r>
+      <w:r>
+        <w:t xml:space="preserve"> (tải swagger </w:t>
+      </w:r>
+      <w:r>
+        <w:rPr>
+          <w:rFonts w:ascii="Consolas" w:hAnsi="Consolas"/>
+          <w:sz w:val="19"/>
+        </w:rPr>
+        <w:t>/swagger/v1/swagger.json</w:t>
+      </w:r>
+      <w:r>
+        <w:t>, chỉ đọc):</w:t>
+      </w:r>
+    </w:p>
+    <w:p>
+      <w:pPr>
+        <w:pStyle w:val="ListBullet"/>
+      </w:pPr>
+      <w:r>
+        <w:t xml:space="preserve">Hệ anh có </w:t>
+      </w:r>
+      <w:r>
+        <w:rPr>
+          <w:b/>
+        </w:rPr>
+        <w:t>705 đường, không đổi</w:t>
+      </w:r>
+      <w:r>
+        <w:t xml:space="preserve"> so với bản chụp 30/09.</w:t>
+      </w:r>
+    </w:p>
+    <w:p>
+      <w:pPr>
+        <w:pStyle w:val="ListBullet"/>
+      </w:pPr>
+      <w:r>
+        <w:rPr>
+          <w:b/>
+        </w:rPr>
+        <w:t>Không có</w:t>
+      </w:r>
+      <w:r>
+        <w:t xml:space="preserve"> đường nhận phong bì chứng từ (</w:t>
+      </w:r>
+      <w:r>
+        <w:rPr>
+          <w:rFonts w:ascii="Consolas" w:hAnsi="Consolas"/>
+          <w:sz w:val="19"/>
+        </w:rPr>
+        <w:t>/api/v1/epl-lao/vouchers</w:t>
+      </w:r>
+      <w:r>
+        <w:t>) hay đường "phiếu đề nghị" nào.</w:t>
+      </w:r>
+    </w:p>
+    <w:p>
+      <w:pPr>
+        <w:pStyle w:val="ListBullet"/>
+      </w:pPr>
+      <w:r>
+        <w:t xml:space="preserve">Đường dành cho logistics chỉ có </w:t>
+      </w:r>
+      <w:r>
+        <w:rPr>
+          <w:rFonts w:ascii="Consolas" w:hAnsi="Consolas"/>
+          <w:sz w:val="19"/>
+        </w:rPr>
+        <w:t>POST /api/v1/integrations/logistics/sales-orders</w:t>
+      </w:r>
+      <w:r>
+        <w:t xml:space="preserve"> (đã nối, A2).</w:t>
+      </w:r>
+    </w:p>
+    <w:p>
+      <w:pPr>
+        <w:pStyle w:val="ListBullet"/>
+      </w:pPr>
+      <w:r>
+        <w:t xml:space="preserve">Đường </w:t>
+      </w:r>
+      <w:r>
+        <w:rPr>
+          <w:b/>
+        </w:rPr>
+        <w:t>có thể dùng</w:t>
+      </w:r>
+      <w:r>
+        <w:t xml:space="preserve"> cho đề nghị tạm ứng: nhóm phiếu thu chi </w:t>
+      </w:r>
+      <w:r>
+        <w:rPr>
+          <w:rFonts w:ascii="Consolas" w:hAnsi="Consolas"/>
+          <w:sz w:val="19"/>
+        </w:rPr>
+        <w:t>…/cmpayment-receipt/*</w:t>
+      </w:r>
+      <w:r>
+        <w:t xml:space="preserve">, tức </w:t>
+      </w:r>
+      <w:r>
+        <w:rPr>
+          <w:rFonts w:ascii="Consolas" w:hAnsi="Consolas"/>
+          <w:sz w:val="19"/>
+        </w:rPr>
+        <w:t>save-and-commit</w:t>
+      </w:r>
+      <w:r>
+        <w:t xml:space="preserve">, hoặc chuỗi </w:t>
+      </w:r>
+      <w:r>
+        <w:rPr>
+          <w:rFonts w:ascii="Consolas" w:hAnsi="Consolas"/>
+          <w:sz w:val="19"/>
+        </w:rPr>
+        <w:t>create-session</w:t>
+      </w:r>
+      <w:r>
+        <w:t xml:space="preserve"> → </w:t>
+      </w:r>
+      <w:r>
+        <w:rPr>
+          <w:rFonts w:ascii="Consolas" w:hAnsi="Consolas"/>
+          <w:sz w:val="19"/>
+        </w:rPr>
+        <w:t>save-session</w:t>
+      </w:r>
+      <w:r>
+        <w:t xml:space="preserve"> → </w:t>
+      </w:r>
+      <w:r>
+        <w:rPr>
+          <w:rFonts w:ascii="Consolas" w:hAnsi="Consolas"/>
+          <w:sz w:val="19"/>
+        </w:rPr>
+        <w:t>commit-session</w:t>
+      </w:r>
+      <w:r>
+        <w:t xml:space="preserve">; mục 1.4. Muốn dùng thì cần mã số ở mục 1.4, và </w:t>
+      </w:r>
+      <w:r>
+        <w:rPr>
+          <w:b/>
+        </w:rPr>
+        <w:t>đối tượng tài xế</w:t>
+      </w:r>
+      <w:r>
+        <w:t xml:space="preserve"> phải có trong danh mục của anh (</w:t>
+      </w:r>
+      <w:r>
+        <w:rPr>
+          <w:rFonts w:ascii="Consolas" w:hAnsi="Consolas"/>
+          <w:sz w:val="19"/>
+        </w:rPr>
+        <w:t>ObjectId</w:t>
+      </w:r>
+      <w:r>
+        <w:t xml:space="preserve"> bắt buộc &gt; 0).</w:t>
+      </w:r>
+    </w:p>
+    <w:p>
+      <w:pPr>
+        <w:pStyle w:val="ListBullet"/>
+      </w:pPr>
+      <w:r>
+        <w:t xml:space="preserve">Nhóm </w:t>
+      </w:r>
+      <w:r>
+        <w:rPr>
+          <w:rFonts w:ascii="Consolas" w:hAnsi="Consolas"/>
+          <w:sz w:val="19"/>
+        </w:rPr>
+        <w:t>/api/v1/hr/salary-advances/*</w:t>
+      </w:r>
+      <w:r>
+        <w:t xml:space="preserve"> là </w:t>
+      </w:r>
+      <w:r>
+        <w:rPr>
+          <w:b/>
+        </w:rPr>
+        <w:t>tạm ứng lương</w:t>
+      </w:r>
+      <w:r>
+        <w:t xml:space="preserve"> của nhân sự, </w:t>
+      </w:r>
+      <w:r>
+        <w:rPr>
+          <w:b/>
+        </w:rPr>
+        <w:t>không phải</w:t>
+      </w:r>
+      <w:r>
+        <w:t xml:space="preserve"> tạm ứng chuyến (Nợ 1601 theo từng DO), nên bên em không dùng.</w:t>
       </w:r>
     </w:p>
     <w:p>

</xml_diff>

<commit_message>
Tài liệu anh Tune (đợt 4): bỏ phần tiền trang tạm, bút toán chờ, trừ hàng quầy, quy đổi từng dòng, kho tạm
- f85078b / ca7b630 / 938b007 / a938301, EPL_KETOAN 1d8d91c, API ae0e7f6 vào hợp đồng, nối API, tổng hợp, hướng dẫn
- hướng dẫn triển khai mục 1.5 kho tạm (ba đường trừ hàng quầy, mã lỗi); hai SO 162 / 163 giữ nguyên (công nợ thật)
- người làm: "bên EPL làm" hoặc "cần quyền host"; tài khoản tích hợp tuỳ chọn (dùng token anh Tune)

Co-Authored-By: Claude Opus 5.5 (1M context) <noreply@anthropic.com>
</commit_message>
<xml_diff>
--- a/DOCS/word/NOI_API_ANH_TUNE.docx
+++ b/DOCS/word/NOI_API_ANH_TUNE.docx
@@ -73,7 +73,7 @@
           <w:rFonts w:ascii="Consolas" w:hAnsi="Consolas"/>
           <w:sz w:val="19"/>
         </w:rPr>
-        <w:t>feat/HonTunedaHai@ce95b3c</w:t>
+        <w:t>feat/HonTunedaHai@ae0e7f6</w:t>
       </w:r>
       <w:r>
         <w:t xml:space="preserve">, WEB </w:t>
@@ -93,10 +93,186 @@
           <w:rFonts w:ascii="Consolas" w:hAnsi="Consolas"/>
           <w:sz w:val="19"/>
         </w:rPr>
-        <w:t>feat/hontunedhai_Laos@7e14421c</w:t>
-      </w:r>
-      <w:r>
-        <w:t xml:space="preserve"> (mục 8).</w:t>
+        <w:t>feat/hontunedhai_Laos@77bcb0a1</w:t>
+      </w:r>
+      <w:r>
+        <w:t xml:space="preserve"> (mục 8). Mã trang điều xe theo </w:t>
+      </w:r>
+      <w:r>
+        <w:rPr>
+          <w:rFonts w:ascii="Consolas" w:hAnsi="Consolas"/>
+          <w:sz w:val="19"/>
+        </w:rPr>
+        <w:t>f85078b</w:t>
+      </w:r>
+      <w:r>
+        <w:t xml:space="preserve">, </w:t>
+      </w:r>
+      <w:r>
+        <w:rPr>
+          <w:rFonts w:ascii="Consolas" w:hAnsi="Consolas"/>
+          <w:sz w:val="19"/>
+        </w:rPr>
+        <w:t>ca7b630</w:t>
+      </w:r>
+      <w:r>
+        <w:t xml:space="preserve">, </w:t>
+      </w:r>
+      <w:r>
+        <w:rPr>
+          <w:rFonts w:ascii="Consolas" w:hAnsi="Consolas"/>
+          <w:sz w:val="19"/>
+        </w:rPr>
+        <w:t>938b007</w:t>
+      </w:r>
+      <w:r>
+        <w:t xml:space="preserve"> (dọn lớp tạm: gói bàn giao </w:t>
+      </w:r>
+      <w:r>
+        <w:rPr>
+          <w:rFonts w:ascii="Consolas" w:hAnsi="Consolas"/>
+          <w:sz w:val="19"/>
+        </w:rPr>
+        <w:t>invoiced</w:t>
+      </w:r>
+      <w:r>
+        <w:t xml:space="preserve"> / </w:t>
+      </w:r>
+      <w:r>
+        <w:rPr>
+          <w:rFonts w:ascii="Consolas" w:hAnsi="Consolas"/>
+          <w:sz w:val="19"/>
+        </w:rPr>
+        <w:t>inv_no</w:t>
+      </w:r>
+      <w:r>
+        <w:t xml:space="preserve"> theo SO bên anh); kho tạm </w:t>
+      </w:r>
+      <w:r>
+        <w:rPr>
+          <w:rFonts w:ascii="Consolas" w:hAnsi="Consolas"/>
+          <w:sz w:val="19"/>
+        </w:rPr>
+        <w:t>EPL_KETOAN@1d8d91c</w:t>
+      </w:r>
+      <w:r>
+        <w:t xml:space="preserve">. Mã còn đổi nhỏ: chỗ chưa chắc ghi </w:t>
+      </w:r>
+      <w:r>
+        <w:rPr>
+          <w:b/>
+        </w:rPr>
+        <w:t>đang chốt</w:t>
+      </w:r>
+      <w:r>
+        <w:t>.</w:t>
+      </w:r>
+    </w:p>
+    <w:p>
+      <w:pPr>
+        <w:jc w:val="both"/>
+      </w:pPr>
+      <w:r>
+        <w:rPr>
+          <w:b/>
+        </w:rPr>
+        <w:t>Người làm (chủ dự án chốt 01/10: "bên mình với anh Tune giờ là một"):</w:t>
+      </w:r>
+      <w:r>
+        <w:t xml:space="preserve"> việc ghi "bên EPL làm" là bên EPL làm luôn, kể cả trên source của anh. Việc cần máy chủ host của anh (triển khai, dữ liệu trên DB host, token / mật khẩu tài khoản của anh) ghi </w:t>
+      </w:r>
+      <w:r>
+        <w:rPr>
+          <w:b/>
+        </w:rPr>
+        <w:t>cần quyền host</w:t>
+      </w:r>
+      <w:r>
+        <w:t>.</w:t>
+      </w:r>
+    </w:p>
+    <w:p>
+      <w:pPr>
+        <w:jc w:val="both"/>
+      </w:pPr>
+      <w:r>
+        <w:rPr>
+          <w:b/>
+        </w:rPr>
+        <w:t>Token (chủ dự án chốt 01/10):</w:t>
+      </w:r>
+      <w:r>
+        <w:t xml:space="preserve"> tạm gác tài khoản tích hợp; trang điều xe tiếp tục dùng token của anh (</w:t>
+      </w:r>
+      <w:r>
+        <w:rPr>
+          <w:rFonts w:ascii="Consolas" w:hAnsi="Consolas"/>
+          <w:sz w:val="19"/>
+        </w:rPr>
+        <w:t>EPL_ACC_CODE_TOKEN</w:t>
+      </w:r>
+      <w:r>
+        <w:t xml:space="preserve">). Hết hạn khoảng 10/10 thì thay token mới trong </w:t>
+      </w:r>
+      <w:r>
+        <w:rPr>
+          <w:rFonts w:ascii="Consolas" w:hAnsi="Consolas"/>
+          <w:sz w:val="19"/>
+        </w:rPr>
+        <w:t>.env</w:t>
+      </w:r>
+      <w:r>
+        <w:t xml:space="preserve">, hoặc đặt </w:t>
+      </w:r>
+      <w:r>
+        <w:rPr>
+          <w:rFonts w:ascii="Consolas" w:hAnsi="Consolas"/>
+          <w:sz w:val="19"/>
+        </w:rPr>
+        <w:t>QLSX_USERNAME</w:t>
+      </w:r>
+      <w:r>
+        <w:t xml:space="preserve"> / </w:t>
+      </w:r>
+      <w:r>
+        <w:rPr>
+          <w:rFonts w:ascii="Consolas" w:hAnsi="Consolas"/>
+          <w:sz w:val="19"/>
+        </w:rPr>
+        <w:t>QLSX_PASSWORD</w:t>
+      </w:r>
+      <w:r>
+        <w:t xml:space="preserve"> của anh để tự đăng nhập lại (đường này đã có sẵn). Mật khẩu tối đa 20 ký tự (</w:t>
+      </w:r>
+      <w:r>
+        <w:rPr>
+          <w:rFonts w:ascii="Consolas" w:hAnsi="Consolas"/>
+          <w:sz w:val="19"/>
+        </w:rPr>
+        <w:t>proc_LoginWithUsAndPw</w:t>
+      </w:r>
+      <w:r>
+        <w:t xml:space="preserve">, </w:t>
+      </w:r>
+      <w:r>
+        <w:rPr>
+          <w:rFonts w:ascii="Consolas" w:hAnsi="Consolas"/>
+          <w:sz w:val="19"/>
+        </w:rPr>
+        <w:t>VARCHAR(20)</w:t>
+      </w:r>
+      <w:r>
+        <w:t>); tài khoản phải được gán chi nhánh (</w:t>
+      </w:r>
+      <w:r>
+        <w:rPr>
+          <w:rFonts w:ascii="Consolas" w:hAnsi="Consolas"/>
+          <w:sz w:val="19"/>
+        </w:rPr>
+        <w:t>USERS_ORG</w:t>
+      </w:r>
+      <w:r>
+        <w:t>).</w:t>
       </w:r>
     </w:p>
     <w:p>
@@ -961,7 +1137,14 @@
               <w:t>chi mục V – VI</w:t>
             </w:r>
             <w:r>
-              <w:t>: dòng quỹ trả ngay</w:t>
+              <w:t xml:space="preserve">: dòng quỹ trả ngay, định khoản theo tờ </w:t>
+            </w:r>
+            <w:r>
+              <w:rPr>
+                <w:rFonts w:ascii="Consolas" w:hAnsi="Consolas"/>
+                <w:sz w:val="19"/>
+              </w:rPr>
+              <w:t>PC_SC</w:t>
             </w:r>
           </w:p>
         </w:tc>
@@ -975,7 +1158,10 @@
               <w:rPr>
                 <w:b/>
               </w:rPr>
-              <w:t>đang làm</w:t>
+              <w:t>chạy</w:t>
+            </w:r>
+            <w:r>
+              <w:t xml:space="preserve"> ở máy</w:t>
             </w:r>
           </w:p>
         </w:tc>
@@ -1023,7 +1209,14 @@
               <w:t>tất toán tài xế</w:t>
             </w:r>
             <w:r>
-              <w:t>: chi bù / thu hoàn, đứng tên tài xế</w:t>
+              <w:t xml:space="preserve">: chi bù TT_CHI / thu hoàn TT_THU, đứng tên tài xế </w:t>
+            </w:r>
+            <w:r>
+              <w:rPr>
+                <w:rFonts w:ascii="Consolas" w:hAnsi="Consolas"/>
+                <w:sz w:val="19"/>
+              </w:rPr>
+              <w:t>EPLTX-</w:t>
             </w:r>
           </w:p>
         </w:tc>
@@ -1037,7 +1230,10 @@
               <w:rPr>
                 <w:b/>
               </w:rPr>
-              <w:t>đang làm</w:t>
+              <w:t>chạy</w:t>
+            </w:r>
+            <w:r>
+              <w:t xml:space="preserve"> ở máy</w:t>
             </w:r>
           </w:p>
         </w:tc>
@@ -1085,7 +1281,14 @@
               <w:t>trả nhà cung cấp</w:t>
             </w:r>
             <w:r>
-              <w:t>: Nợ 4021, đứng tên nhà cung cấp</w:t>
+              <w:t xml:space="preserve">: Nợ 4021 / Có tiền, đứng tên nhà cung cấp </w:t>
+            </w:r>
+            <w:r>
+              <w:rPr>
+                <w:rFonts w:ascii="Consolas" w:hAnsi="Consolas"/>
+                <w:sz w:val="19"/>
+              </w:rPr>
+              <w:t>EPLNCC-</w:t>
             </w:r>
           </w:p>
         </w:tc>
@@ -1099,7 +1302,10 @@
               <w:rPr>
                 <w:b/>
               </w:rPr>
-              <w:t>đang làm</w:t>
+              <w:t>chạy</w:t>
+            </w:r>
+            <w:r>
+              <w:t xml:space="preserve"> ở máy</w:t>
             </w:r>
           </w:p>
         </w:tc>
@@ -1156,7 +1362,7 @@
               <w:t>bút toán chờ gửi</w:t>
             </w:r>
             <w:r>
-              <w:t>: thuê xe 621/4022, ghi nợ nhà cung cấp, quyết toán tạm ứng</w:t>
+              <w:t>: thuê xe 621/4022, ghi nợ nhà cung cấp 625 · 614 / 4021, quyết toán tạm ứng 625/1601, hàng bán cho chủ xe 4022/707</w:t>
             </w:r>
           </w:p>
         </w:tc>
@@ -1167,16 +1373,13 @@
           <w:p>
             <w:r/>
             <w:r>
-              <w:t xml:space="preserve">LAO giữ bút toán — </w:t>
+              <w:t xml:space="preserve">LAO giữ bút toán, màn "Bút toán chờ gửi"; API bút toán </w:t>
             </w:r>
             <w:r>
               <w:rPr>
                 <w:b/>
               </w:rPr>
-              <w:t>đang làm</w:t>
-            </w:r>
-            <w:r>
-              <w:t>; chờ API bên anh</w:t>
+              <w:t>bên EPL làm (đang làm)</w:t>
             </w:r>
           </w:p>
         </w:tc>
@@ -1529,7 +1732,14 @@
               <w:t>phần tiền đã gỡ 01/10</w:t>
             </w:r>
             <w:r>
-              <w:t xml:space="preserve"> (hoá đơn, đã thu, trả chủ xe, tất toán, nhà cung cấp, cấn trừ, bán hàng). Còn phần kho cho KT tạm (kho tạm)</w:t>
+              <w:t xml:space="preserve"> (hoá đơn, đã thu, trả chủ xe, tất toán, nhà cung cấp, cấn trừ). Còn phần kho cho KT tạm (kho tạm), gồm </w:t>
+            </w:r>
+            <w:r>
+              <w:rPr>
+                <w:rFonts w:ascii="Consolas" w:hAnsi="Consolas"/>
+                <w:sz w:val="19"/>
+              </w:rPr>
+              <w:t>nguoi-mua</w:t>
             </w:r>
           </w:p>
         </w:tc>
@@ -1550,6 +1760,108 @@
             </w:r>
             <w:r>
               <w:t>: LAO tự hỏi lại trạng thái phiếu bên anh</w:t>
+            </w:r>
+          </w:p>
+        </w:tc>
+      </w:tr>
+      <w:tr>
+        <w:tc>
+          <w:tcPr>
+            <w:tcW w:type="dxa" w:w="2160"/>
+          </w:tcPr>
+          <w:p>
+            <w:r/>
+            <w:r>
+              <w:t>—</w:t>
+            </w:r>
+          </w:p>
+        </w:tc>
+        <w:tc>
+          <w:tcPr>
+            <w:tcW w:type="dxa" w:w="2160"/>
+          </w:tcPr>
+          <w:p>
+            <w:r/>
+            <w:r>
+              <w:t xml:space="preserve">kho tạm </w:t>
+            </w:r>
+            <w:r>
+              <w:rPr>
+                <w:rFonts w:ascii="Consolas" w:hAnsi="Consolas"/>
+                <w:sz w:val="19"/>
+              </w:rPr>
+              <w:t>EPL_KETOAN</w:t>
+            </w:r>
+            <w:r>
+              <w:t xml:space="preserve">: </w:t>
+            </w:r>
+            <w:r>
+              <w:rPr>
+                <w:rFonts w:ascii="Consolas" w:hAnsi="Consolas"/>
+                <w:sz w:val="19"/>
+              </w:rPr>
+              <w:t>/api/lien-thong/ban-hang/cho-tru</w:t>
+            </w:r>
+            <w:r>
+              <w:t xml:space="preserve"> · </w:t>
+            </w:r>
+            <w:r>
+              <w:rPr>
+                <w:rFonts w:ascii="Consolas" w:hAnsi="Consolas"/>
+                <w:sz w:val="19"/>
+              </w:rPr>
+              <w:t>tru</w:t>
+            </w:r>
+            <w:r>
+              <w:t xml:space="preserve"> · </w:t>
+            </w:r>
+            <w:r>
+              <w:rPr>
+                <w:rFonts w:ascii="Consolas" w:hAnsi="Consolas"/>
+                <w:sz w:val="19"/>
+              </w:rPr>
+              <w:t>bo-tru</w:t>
+            </w:r>
+            <w:r>
+              <w:t xml:space="preserve"> (LAO gọi kho tạm)</w:t>
+            </w:r>
+          </w:p>
+        </w:tc>
+        <w:tc>
+          <w:tcPr>
+            <w:tcW w:type="dxa" w:w="2160"/>
+          </w:tcPr>
+          <w:p>
+            <w:r/>
+            <w:r>
+              <w:t>trừ hàng chủ xe mua ở quầy vào tiền trả chủ xe: giữ chỗ / chốt / thả phiếu bán</w:t>
+            </w:r>
+          </w:p>
+        </w:tc>
+        <w:tc>
+          <w:tcPr>
+            <w:tcW w:type="dxa" w:w="2160"/>
+          </w:tcPr>
+          <w:p>
+            <w:r/>
+            <w:r>
+              <w:rPr>
+                <w:b/>
+              </w:rPr>
+              <w:t>chạy</w:t>
+            </w:r>
+            <w:r>
+              <w:t xml:space="preserve"> (</w:t>
+            </w:r>
+            <w:r>
+              <w:rPr>
+                <w:rFonts w:ascii="Consolas" w:hAnsi="Consolas"/>
+                <w:sz w:val="19"/>
+              </w:rPr>
+              <w:t>1d8d91c</w:t>
+            </w:r>
+            <w:r>
+              <w:t>)</w:t>
             </w:r>
           </w:p>
         </w:tc>
@@ -1958,7 +2270,7 @@
           <w:p>
             <w:r/>
             <w:r>
-              <w:t>đang làm</w:t>
+              <w:t>chạy</w:t>
             </w:r>
           </w:p>
         </w:tc>
@@ -2117,7 +2429,7 @@
           <w:p>
             <w:r/>
             <w:r>
-              <w:t>đang làm</w:t>
+              <w:t>giữ ở LAO</w:t>
             </w:r>
           </w:p>
         </w:tc>
@@ -2180,7 +2492,7 @@
           <w:p>
             <w:r/>
             <w:r>
-              <w:t>đang làm</w:t>
+              <w:t>chạy</w:t>
             </w:r>
           </w:p>
         </w:tc>
@@ -2233,7 +2545,7 @@
           <w:p>
             <w:r/>
             <w:r>
-              <w:t>đang làm</w:t>
+              <w:t>chạy</w:t>
             </w:r>
           </w:p>
         </w:tc>
@@ -2279,7 +2591,7 @@
           <w:p>
             <w:r/>
             <w:r>
-              <w:t>đang làm</w:t>
+              <w:t>giữ ở LAO</w:t>
             </w:r>
           </w:p>
         </w:tc>
@@ -2292,24 +2604,7 @@
           <w:p>
             <w:r/>
             <w:r>
-              <w:rPr>
-                <w:rFonts w:ascii="Consolas" w:hAnsi="Consolas"/>
-                <w:sz w:val="19"/>
-              </w:rPr>
-              <w:t>HD</w:t>
-            </w:r>
-            <w:r>
-              <w:t xml:space="preserve"> hoá đơn · </w:t>
-            </w:r>
-            <w:r>
-              <w:rPr>
-                <w:rFonts w:ascii="Consolas" w:hAnsi="Consolas"/>
-                <w:sz w:val="19"/>
-              </w:rPr>
-              <w:t>PT</w:t>
-            </w:r>
-            <w:r>
-              <w:t xml:space="preserve"> thu tiền khách</w:t>
+              <w:t>hàng bán cho chủ xe (4022/707)</w:t>
             </w:r>
           </w:p>
         </w:tc>
@@ -2320,7 +2615,7 @@
           <w:p>
             <w:r/>
             <w:r>
-              <w:t>—</w:t>
+              <w:t>thủ quỹ bên anh đã chi phiếu trả chủ xe</w:t>
             </w:r>
           </w:p>
         </w:tc>
@@ -2331,13 +2626,7 @@
           <w:p>
             <w:r/>
             <w:r>
-              <w:rPr>
-                <w:b/>
-              </w:rPr>
-              <w:t>việc của hệ anh</w:t>
-            </w:r>
-            <w:r>
-              <w:t>, từ SO (A2)</w:t>
+              <w:t>bút toán chờ (A11)</w:t>
             </w:r>
           </w:p>
         </w:tc>
@@ -2348,6 +2637,75 @@
           <w:p>
             <w:r/>
             <w:r>
+              <w:t>giữ ở LAO</w:t>
+            </w:r>
+          </w:p>
+        </w:tc>
+      </w:tr>
+      <w:tr>
+        <w:tc>
+          <w:tcPr>
+            <w:tcW w:type="dxa" w:w="2160"/>
+          </w:tcPr>
+          <w:p>
+            <w:r/>
+            <w:r>
+              <w:rPr>
+                <w:rFonts w:ascii="Consolas" w:hAnsi="Consolas"/>
+                <w:sz w:val="19"/>
+              </w:rPr>
+              <w:t>HD</w:t>
+            </w:r>
+            <w:r>
+              <w:t xml:space="preserve"> hoá đơn · </w:t>
+            </w:r>
+            <w:r>
+              <w:rPr>
+                <w:rFonts w:ascii="Consolas" w:hAnsi="Consolas"/>
+                <w:sz w:val="19"/>
+              </w:rPr>
+              <w:t>PT</w:t>
+            </w:r>
+            <w:r>
+              <w:t xml:space="preserve"> thu tiền khách</w:t>
+            </w:r>
+          </w:p>
+        </w:tc>
+        <w:tc>
+          <w:tcPr>
+            <w:tcW w:type="dxa" w:w="2160"/>
+          </w:tcPr>
+          <w:p>
+            <w:r/>
+            <w:r>
+              <w:t>—</w:t>
+            </w:r>
+          </w:p>
+        </w:tc>
+        <w:tc>
+          <w:tcPr>
+            <w:tcW w:type="dxa" w:w="2160"/>
+          </w:tcPr>
+          <w:p>
+            <w:r/>
+            <w:r>
+              <w:rPr>
+                <w:b/>
+              </w:rPr>
+              <w:t>việc của hệ anh</w:t>
+            </w:r>
+            <w:r>
+              <w:t>, từ SO (A2)</w:t>
+            </w:r>
+          </w:p>
+        </w:tc>
+        <w:tc>
+          <w:tcPr>
+            <w:tcW w:type="dxa" w:w="2160"/>
+          </w:tcPr>
+          <w:p>
+            <w:r/>
+            <w:r>
               <w:t>—</w:t>
             </w:r>
           </w:p>
@@ -2398,7 +2756,7 @@
         <w:t>hết hạn 10/10/2026 09:05 giờ Lào</w:t>
       </w:r>
       <w:r>
-        <w:t>) cho tới khi có tài khoản tích hợp (mục 5);</w:t>
+        <w:t>) — chủ dự án chốt tiếp tục dùng; hết hạn thì thay token hoặc tự đăng nhập bằng tài khoản anh (mục 5);</w:t>
       </w:r>
     </w:p>
     <w:p>
@@ -3304,7 +3662,7 @@
         <w:rPr>
           <w:b/>
         </w:rPr>
-        <w:t>tài khoản tích hợp</w:t>
+        <w:t>tự đăng nhập</w:t>
       </w:r>
       <w:r>
         <w:t xml:space="preserve"> (</w:t>
@@ -3337,7 +3695,7 @@
         <w:t>QLSX_ORG_ID</w:t>
       </w:r>
       <w:r>
-        <w:t xml:space="preserve">, tự đăng nhập — hợp đồng 12.11.4); không thì </w:t>
+        <w:t xml:space="preserve"> — đặt được tài khoản của anh; hợp đồng 12.11.4); không thì </w:t>
       </w:r>
       <w:r>
         <w:rPr>
@@ -3347,7 +3705,7 @@
         <w:t>EPL_ACC_CODE_TOKEN</w:t>
       </w:r>
       <w:r>
-        <w:t>.</w:t>
+        <w:t xml:space="preserve"> (đang dùng).</w:t>
       </w:r>
     </w:p>
     <w:p>
@@ -4430,7 +4788,7 @@
         <w:rPr>
           <w:b/>
         </w:rPr>
-        <w:t>Dữ liệu thử trên DB của API ở máy:</w:t>
+        <w:t>SO đã tạo trên DB của API ở máy:</w:t>
       </w:r>
       <w:r>
         <w:t xml:space="preserve"> </w:t>
@@ -4453,26 +4811,16 @@
         <w:t>TK-20261001-000163</w:t>
       </w:r>
       <w:r>
-        <w:t xml:space="preserve"> (T4-0442-09/EPL, ນາງ ວັນນາ, 1.676,90 USD). Đây là </w:t>
+        <w:t xml:space="preserve"> (T4-0442-09/EPL, ນາງ ວັນນາ, 1.676,90 USD). Hai SO tạo ngày 01/10 trước giờ cắt sổ, </w:t>
       </w:r>
       <w:r>
         <w:rPr>
           <w:b/>
         </w:rPr>
-        <w:t>SO thử, nhờ anh huỷ</w:t>
-      </w:r>
-      <w:r>
-        <w:t xml:space="preserve">. Huỷ xong, anh cho bên em biết cách gửi lại hai DO đó: khoá </w:t>
-      </w:r>
-      <w:r>
-        <w:rPr>
-          <w:rFonts w:ascii="Consolas" w:hAnsi="Consolas"/>
-          <w:sz w:val="19"/>
-        </w:rPr>
-        <w:t>logistics:EPLLAO-&lt;Trip.id&gt;</w:t>
-      </w:r>
-      <w:r>
-        <w:t xml:space="preserve"> của chúng vẫn còn bên anh.</w:t>
+        <w:t>giữ nguyên</w:t>
+      </w:r>
+      <w:r>
+        <w:t>, là công nợ thật của hai DO đó.</w:t>
       </w:r>
     </w:p>
     <w:p>
@@ -5215,26 +5563,92 @@
         <w:t>Header.BaseAmount</w:t>
       </w:r>
       <w:r>
-        <w:t xml:space="preserve"> = tổng các dòng; từ </w:t>
+        <w:t xml:space="preserve"> = tổng các dòng; hệ anh </w:t>
+      </w:r>
+      <w:r>
+        <w:rPr>
+          <w:b/>
+        </w:rPr>
+        <w:t>tự tính lại quy đổi từng dòng</w:t>
+      </w:r>
+      <w:r>
+        <w:t xml:space="preserve"> (</w:t>
       </w:r>
       <w:r>
         <w:rPr>
           <w:rFonts w:ascii="Consolas" w:hAnsi="Consolas"/>
           <w:sz w:val="19"/>
         </w:rPr>
+        <w:t>ae0e7f6</w:t>
+      </w:r>
+      <w:r>
+        <w:t xml:space="preserve">: </w:t>
+      </w:r>
+      <w:r>
+        <w:rPr>
+          <w:rFonts w:ascii="Consolas" w:hAnsi="Consolas"/>
+          <w:sz w:val="19"/>
+        </w:rPr>
+        <w:t>Amount × tỷ giá dòng</w:t>
+      </w:r>
+      <w:r>
+        <w:t xml:space="preserve">, thiếu thì tỷ giá header) và </w:t>
+      </w:r>
+      <w:r>
+        <w:rPr>
+          <w:b/>
+        </w:rPr>
+        <w:t>tổng header</w:t>
+      </w:r>
+      <w:r>
+        <w:t xml:space="preserve"> (</w:t>
+      </w:r>
+      <w:r>
+        <w:rPr>
+          <w:rFonts w:ascii="Consolas" w:hAnsi="Consolas"/>
+          <w:sz w:val="19"/>
+        </w:rPr>
         <w:t>ce95b3c</w:t>
       </w:r>
       <w:r>
-        <w:t xml:space="preserve"> hệ anh </w:t>
+        <w:t>), 5 số lẻ, làm tròn nửa xa số 0. Phiếu trả chủ xe ngoại tệ bên em gửi tỷ giá riêng từng dòng để Kíp khoá từng phiếu xe không bị dịch.</w:t>
+      </w:r>
+    </w:p>
+    <w:p>
+      <w:pPr>
+        <w:pStyle w:val="ListBullet"/>
+      </w:pPr>
+      <w:r>
+        <w:t xml:space="preserve">Phiếu bên em tạo mà bị </w:t>
       </w:r>
       <w:r>
         <w:rPr>
           <w:b/>
         </w:rPr>
-        <w:t>tự tính lại tổng header từ `Entries`</w:t>
-      </w:r>
-      <w:r>
-        <w:t xml:space="preserve"> (5 số lẻ, làm tròn nửa xa số 0).</w:t>
+        <w:t>xoá tay</w:t>
+      </w:r>
+      <w:r>
+        <w:t xml:space="preserve"> bên anh (</w:t>
+      </w:r>
+      <w:r>
+        <w:rPr>
+          <w:rFonts w:ascii="Consolas" w:hAnsi="Consolas"/>
+          <w:sz w:val="19"/>
+        </w:rPr>
+        <w:t>Master</w:t>
+      </w:r>
+      <w:r>
+        <w:t xml:space="preserve"> null) → bên em đánh </w:t>
+      </w:r>
+      <w:r>
+        <w:rPr>
+          <w:rFonts w:ascii="Consolas" w:hAnsi="Consolas"/>
+          <w:sz w:val="19"/>
+        </w:rPr>
+        <w:t>PHIEU_CHI_MAT</w:t>
+      </w:r>
+      <w:r>
+        <w:t>; người lập gửi lại thì lập phiếu mới, không gọi xoá nữa.</w:t>
       </w:r>
     </w:p>
     <w:tbl>
@@ -5545,7 +5959,13 @@
           <w:p>
             <w:r/>
             <w:r>
-              <w:t>mỗi phiếu xe một dòng Nợ 4022 / Có 1011 · 1012 · 1021 · 1022</w:t>
+              <w:t xml:space="preserve">mỗi phiếu xe một dòng Nợ 4022 / Có 1011 · 1012 · 1021 · 1022, số trả </w:t>
+            </w:r>
+            <w:r>
+              <w:rPr>
+                <w:b/>
+              </w:rPr>
+              <w:t>đã trừ hàng chủ xe mua ở quầy</w:t>
             </w:r>
           </w:p>
         </w:tc>
@@ -5556,7 +5976,17 @@
           <w:p>
             <w:r/>
             <w:r>
-              <w:t>các phiếu xe "đã trả chủ xe"</w:t>
+              <w:t xml:space="preserve">các phiếu xe "đã trả chủ xe"; phiếu bán ở kho tạm chốt </w:t>
+            </w:r>
+            <w:r>
+              <w:rPr>
+                <w:rFonts w:ascii="Consolas" w:hAnsi="Consolas"/>
+                <w:sz w:val="19"/>
+              </w:rPr>
+              <w:t>TUNE:&lt;số phiếu chi&gt;</w:t>
+            </w:r>
+            <w:r>
+              <w:t>, ghi bút toán chờ 4022/707</w:t>
             </w:r>
           </w:p>
         </w:tc>
@@ -5619,7 +6049,17 @@
           <w:p>
             <w:r/>
             <w:r>
-              <w:t>xe nhà Nợ 614 (V) · 625 (VI) / Có 1011; xe thuê Nợ 4022 / Có 1011</w:t>
+              <w:t xml:space="preserve">theo tờ </w:t>
+            </w:r>
+            <w:r>
+              <w:rPr>
+                <w:rFonts w:ascii="Consolas" w:hAnsi="Consolas"/>
+                <w:sz w:val="19"/>
+              </w:rPr>
+              <w:t>PC_SC</w:t>
+            </w:r>
+            <w:r>
+              <w:t>: xe nhà Nợ 614 (V) · 625 (VI) / Có 1011; xe thuê Nợ 4022 / Có 1011</w:t>
             </w:r>
           </w:p>
         </w:tc>
@@ -5630,13 +6070,7 @@
           <w:p>
             <w:r/>
             <w:r>
-              <w:t xml:space="preserve">mục "đã chi" — </w:t>
-            </w:r>
-            <w:r>
-              <w:rPr>
-                <w:b/>
-              </w:rPr>
-              <w:t>đang làm</w:t>
+              <w:t>mục "đã chi"; Quỹ trên trang điều xe không chi nữa</w:t>
             </w:r>
           </w:p>
         </w:tc>
@@ -5717,13 +6151,7 @@
           <w:p>
             <w:r/>
             <w:r>
-              <w:t xml:space="preserve">bản chốt "xong", 1601 của tài xế về 0 cho kỳ — </w:t>
-            </w:r>
-            <w:r>
-              <w:rPr>
-                <w:b/>
-              </w:rPr>
-              <w:t>đang làm</w:t>
+              <w:t>bản chốt "xong", 1601 của tài xế về 0 cho kỳ; quyết toán 625/1601 là bút toán chờ</w:t>
             </w:r>
           </w:p>
         </w:tc>
@@ -5804,13 +6232,7 @@
           <w:p>
             <w:r/>
             <w:r>
-              <w:t xml:space="preserve">giảm nợ nhà cung cấp — </w:t>
-            </w:r>
-            <w:r>
-              <w:rPr>
-                <w:b/>
-              </w:rPr>
-              <w:t>đang làm</w:t>
+              <w:t>giảm nợ nhà cung cấp (màn Nhà cung cấp → "Trả qua kế toán")</w:t>
             </w:r>
           </w:p>
         </w:tc>
@@ -5859,19 +6281,83 @@
         <w:jc w:val="both"/>
       </w:pPr>
       <w:r>
-        <w:t>Chi tiết: hợp đồng mục 12.10 (A4), 12.11.3 (A7).</w:t>
+        <w:rPr>
+          <w:b/>
+        </w:rPr>
+        <w:t>Trừ hàng quầy (A7):</w:t>
+      </w:r>
+      <w:r>
+        <w:t xml:space="preserve"> phiếu bán cho chủ xe nằm ở kho tạm. Lập đề nghị trả → bên em gọi kho tạm </w:t>
+      </w:r>
+      <w:r>
+        <w:rPr>
+          <w:rFonts w:ascii="Consolas" w:hAnsi="Consolas"/>
+          <w:sz w:val="19"/>
+        </w:rPr>
+        <w:t>POST /api/lien-thong/ban-hang/tru</w:t>
+      </w:r>
+      <w:r>
+        <w:t xml:space="preserve"> giữ chỗ (</w:t>
+      </w:r>
+      <w:r>
+        <w:rPr>
+          <w:rFonts w:ascii="Consolas" w:hAnsi="Consolas"/>
+          <w:sz w:val="19"/>
+        </w:rPr>
+        <w:t>TUNE-CHO:&lt;số đề nghị&gt;</w:t>
+      </w:r>
+      <w:r>
+        <w:t>); thủ quỹ bên anh đã chi → chốt (</w:t>
+      </w:r>
+      <w:r>
+        <w:rPr>
+          <w:rFonts w:ascii="Consolas" w:hAnsi="Consolas"/>
+          <w:sz w:val="19"/>
+        </w:rPr>
+        <w:t>TUNE:&lt;số phiếu chi&gt;</w:t>
+      </w:r>
+      <w:r>
+        <w:t xml:space="preserve">) và ghi bút toán chờ Nợ 4022 / Có 707; bỏ đề nghị → </w:t>
+      </w:r>
+      <w:r>
+        <w:rPr>
+          <w:rFonts w:ascii="Consolas" w:hAnsi="Consolas"/>
+          <w:sz w:val="19"/>
+        </w:rPr>
+        <w:t>POST …/bo-tru</w:t>
+      </w:r>
+      <w:r>
+        <w:t xml:space="preserve"> thả phiếu bán. Danh sách chờ trừ: </w:t>
+      </w:r>
+      <w:r>
+        <w:rPr>
+          <w:rFonts w:ascii="Consolas" w:hAnsi="Consolas"/>
+          <w:sz w:val="19"/>
+        </w:rPr>
+        <w:t>GET /api/lien-thong/ban-hang/cho-tru?owner_id=</w:t>
+      </w:r>
+      <w:r>
+        <w:t>. Kho tạm tắt thì không lập được đề nghị trả (503).</w:t>
       </w:r>
     </w:p>
     <w:p>
       <w:pPr>
-        <w:pStyle w:val="Heading2"/>
-      </w:pPr>
-      <w:r>
-        <w:t>1.5. A5 — công nợ khách, đã thu của từng SO</w:t>
+        <w:jc w:val="both"/>
+      </w:pPr>
+      <w:r>
+        <w:t>Chi tiết: hợp đồng mục 12.10 (A4), 12.11.3 (A7).</w:t>
       </w:r>
     </w:p>
     <w:p>
       <w:pPr>
+        <w:pStyle w:val="Heading2"/>
+      </w:pPr>
+      <w:r>
+        <w:t>1.5. A5 — công nợ khách, đã thu của từng SO</w:t>
+      </w:r>
+    </w:p>
+    <w:p>
+      <w:pPr>
         <w:pStyle w:val="ListBullet"/>
       </w:pPr>
       <w:r>
@@ -5971,13 +6457,7 @@
         <w:pStyle w:val="ListBullet"/>
       </w:pPr>
       <w:r>
-        <w:rPr>
-          <w:b/>
-        </w:rPr>
-        <w:t>Cần anh</w:t>
-      </w:r>
-      <w:r>
-        <w:t xml:space="preserve"> một mẫu thân trả về thật (khối </w:t>
+        <w:t xml:space="preserve">Khối </w:t>
       </w:r>
       <w:r>
         <w:rPr>
@@ -5997,7 +6477,17 @@
         <w:t>Collections</w:t>
       </w:r>
       <w:r>
-        <w:t xml:space="preserve"> là dynamic).</w:t>
+        <w:t xml:space="preserve"> của </w:t>
+      </w:r>
+      <w:r>
+        <w:rPr>
+          <w:rFonts w:ascii="Consolas" w:hAnsi="Consolas"/>
+          <w:sz w:val="19"/>
+        </w:rPr>
+        <w:t>customer-detail</w:t>
+      </w:r>
+      <w:r>
+        <w:t xml:space="preserve"> là dynamic: bên EPL đối chiếu với thân trả về thật (đang làm).</w:t>
       </w:r>
     </w:p>
     <w:p>
@@ -6005,7 +6495,7 @@
         <w:pStyle w:val="Heading2"/>
       </w:pPr>
       <w:r>
-        <w:t>1.6. Bút toán chờ gửi — khoản không qua tiền (đang làm)</w:t>
+        <w:t>1.6. Bút toán chờ gửi — khoản không qua tiền</w:t>
       </w:r>
     </w:p>
     <w:p>
@@ -6248,6 +6738,45 @@
           </w:p>
         </w:tc>
       </w:tr>
+      <w:tr>
+        <w:tc>
+          <w:tcPr>
+            <w:tcW w:type="dxa" w:w="2880"/>
+          </w:tcPr>
+          <w:p>
+            <w:r/>
+            <w:r>
+              <w:rPr>
+                <w:rFonts w:ascii="Consolas" w:hAnsi="Consolas"/>
+                <w:sz w:val="19"/>
+              </w:rPr>
+              <w:t>ban_chu_xe</w:t>
+            </w:r>
+          </w:p>
+        </w:tc>
+        <w:tc>
+          <w:tcPr>
+            <w:tcW w:type="dxa" w:w="2880"/>
+          </w:tcPr>
+          <w:p>
+            <w:r/>
+            <w:r>
+              <w:t>thủ quỹ bên anh đã chi phiếu trả chủ xe có trừ hàng quầy</w:t>
+            </w:r>
+          </w:p>
+        </w:tc>
+        <w:tc>
+          <w:tcPr>
+            <w:tcW w:type="dxa" w:w="2880"/>
+          </w:tcPr>
+          <w:p>
+            <w:r/>
+            <w:r>
+              <w:t>Nợ 4022 / Có 707, theo giá bán; một phiếu bán một bút toán</w:t>
+            </w:r>
+          </w:p>
+        </w:tc>
+      </w:tr>
     </w:tbl>
     <w:p/>
     <w:p>
@@ -6313,7 +6842,7 @@
         <w:t>huy</w:t>
       </w:r>
       <w:r>
-        <w:t>. Mở khoá phiếu → bản chưa gửi bị huỷ; bản đã gửi đánh "cần đảo", chờ bút toán đảo.</w:t>
+        <w:t>. Mở khoá / xoá phiếu, bỏ chốt tất toán, thả phiếu bán → bản chưa gửi bị huỷ hoặc rút; bản đã gửi đánh "cần đảo", chờ bút toán đảo.</w:t>
       </w:r>
     </w:p>
     <w:p>
@@ -6321,27 +6850,73 @@
         <w:pStyle w:val="ListBullet"/>
       </w:pPr>
       <w:r>
-        <w:t xml:space="preserve">Có đường bên anh thì bên em gửi theo đề nghị </w:t>
+        <w:t xml:space="preserve">Xem: màn </w:t>
+      </w:r>
+      <w:r>
+        <w:rPr>
+          <w:b/>
+        </w:rPr>
+        <w:t>"Bút toán chờ gửi"</w:t>
+      </w:r>
+      <w:r>
+        <w:t xml:space="preserve"> (</w:t>
       </w:r>
       <w:r>
         <w:rPr>
           <w:rFonts w:ascii="Consolas" w:hAnsi="Consolas"/>
           <w:sz w:val="19"/>
         </w:rPr>
-        <w:t>POST /api/v1/integrations/logistics/journal-entries</w:t>
-      </w:r>
-      <w:r>
-        <w:t xml:space="preserve"> (+ </w:t>
+        <w:t>GET /api/but-toan-cho</w:t>
+      </w:r>
+      <w:r>
+        <w:t>, vai KT Thu/Chi VC, KT Chi phí VC, Sếp; lọc trạng thái / nguồn / kỳ, chi tiết Nợ / Có, chứng từ gốc, xuất Excel). Chỉ xem.</w:t>
+      </w:r>
+    </w:p>
+    <w:p>
+      <w:pPr>
+        <w:pStyle w:val="ListBullet"/>
+      </w:pPr>
+      <w:r>
+        <w:t xml:space="preserve">Đường nhận bên anh </w:t>
       </w:r>
       <w:r>
         <w:rPr>
           <w:rFonts w:ascii="Consolas" w:hAnsi="Consolas"/>
           <w:sz w:val="19"/>
         </w:rPr>
+        <w:t>POST /api/v1/integrations/logistics/journal-entries</w:t>
+      </w:r>
+      <w:r>
+        <w:t xml:space="preserve"> (+ </w:t>
+      </w:r>
+      <w:r>
+        <w:rPr>
+          <w:rFonts w:ascii="Consolas" w:hAnsi="Consolas"/>
+          <w:sz w:val="19"/>
+        </w:rPr>
         <w:t>/reverse</w:t>
       </w:r>
       <w:r>
-        <w:t>), hợp đồng 12.12.4.</w:t>
+        <w:t xml:space="preserve">, hợp đồng 12.12.4): </w:t>
+      </w:r>
+      <w:r>
+        <w:rPr>
+          <w:b/>
+        </w:rPr>
+        <w:t>bên EPL làm (đang làm)</w:t>
+      </w:r>
+      <w:r>
+        <w:t xml:space="preserve">; có đường thì gửi các bản </w:t>
+      </w:r>
+      <w:r>
+        <w:rPr>
+          <w:rFonts w:ascii="Consolas" w:hAnsi="Consolas"/>
+          <w:sz w:val="19"/>
+        </w:rPr>
+        <w:t>cho_gui</w:t>
+      </w:r>
+      <w:r>
+        <w:t>.</w:t>
       </w:r>
     </w:p>
     <w:p>
@@ -7733,7 +8308,55 @@
         <w:t>kho</w:t>
       </w:r>
       <w:r>
-        <w:t xml:space="preserve"> của nhóm này còn giữ cho KT tạm (kho tạm), tới khi nối hệ anh Toàn. Hệ anh không dùng.</w:t>
+        <w:t xml:space="preserve"> của nhóm này còn giữ cho KT tạm (kho tạm), tới khi nối hệ anh Toàn, gồm </w:t>
+      </w:r>
+      <w:r>
+        <w:rPr>
+          <w:rFonts w:ascii="Consolas" w:hAnsi="Consolas"/>
+          <w:sz w:val="19"/>
+        </w:rPr>
+        <w:t>nguoi-mua</w:t>
+      </w:r>
+      <w:r>
+        <w:t>. Hệ anh không dùng.</w:t>
+      </w:r>
+    </w:p>
+    <w:p>
+      <w:pPr>
+        <w:pStyle w:val="ListBullet"/>
+      </w:pPr>
+      <w:r>
+        <w:t xml:space="preserve">Chiều ngược lại, LAO gọi kho tạm ba đường trừ hàng quầy </w:t>
+      </w:r>
+      <w:r>
+        <w:rPr>
+          <w:rFonts w:ascii="Consolas" w:hAnsi="Consolas"/>
+          <w:sz w:val="19"/>
+        </w:rPr>
+        <w:t>/api/lien-thong/ban-hang/cho-tru</w:t>
+      </w:r>
+      <w:r>
+        <w:t xml:space="preserve">, </w:t>
+      </w:r>
+      <w:r>
+        <w:rPr>
+          <w:rFonts w:ascii="Consolas" w:hAnsi="Consolas"/>
+          <w:sz w:val="19"/>
+        </w:rPr>
+        <w:t>/tru</w:t>
+      </w:r>
+      <w:r>
+        <w:t xml:space="preserve">, </w:t>
+      </w:r>
+      <w:r>
+        <w:rPr>
+          <w:rFonts w:ascii="Consolas" w:hAnsi="Consolas"/>
+          <w:sz w:val="19"/>
+        </w:rPr>
+        <w:t>/bo-tru</w:t>
+      </w:r>
+      <w:r>
+        <w:t xml:space="preserve"> (mục 1.4).</w:t>
       </w:r>
     </w:p>
     <w:p>
@@ -8381,9 +9004,6 @@
               </w:rPr>
               <w:t>A8</w:t>
             </w:r>
-            <w:r>
-              <w:t xml:space="preserve"> — đang làm</w:t>
-            </w:r>
           </w:p>
         </w:tc>
       </w:tr>
@@ -8718,9 +9338,6 @@
               </w:rPr>
               <w:t>A9</w:t>
             </w:r>
-            <w:r>
-              <w:t xml:space="preserve"> — đang làm</w:t>
-            </w:r>
           </w:p>
         </w:tc>
       </w:tr>
@@ -8785,9 +9402,6 @@
               </w:rPr>
               <w:t>A10</w:t>
             </w:r>
-            <w:r>
-              <w:t xml:space="preserve"> — đang làm</w:t>
-            </w:r>
           </w:p>
         </w:tc>
       </w:tr>
@@ -8895,228 +9509,563 @@
         <w:rPr>
           <w:color w:val="145C4A"/>
         </w:rPr>
-        <w:t>5. Hệ anh cho LAO: còn chờ</w:t>
+        <w:t>5. Việc còn lại</w:t>
       </w:r>
     </w:p>
-    <w:p>
-      <w:pPr>
-        <w:jc w:val="both"/>
-      </w:pPr>
-      <w:r>
-        <w:t>Xếp theo thứ tự cần trước:</w:t>
-      </w:r>
-    </w:p>
-    <w:p>
-      <w:pPr>
-        <w:pStyle w:val="ListNumber"/>
-      </w:pPr>
-      <w:r>
-        <w:rPr>
-          <w:b/>
-        </w:rPr>
-        <w:t>API bút toán</w:t>
-      </w:r>
-      <w:r>
-        <w:t xml:space="preserve"> (không qua tiền) cho mọi bút toán chờ (mục 1.6). Đề nghị ở hợp đồng 12.12.4; hoặc anh gửi định nghĩa </w:t>
-      </w:r>
-      <w:r>
-        <w:rPr>
-          <w:rFonts w:ascii="Consolas" w:hAnsi="Consolas"/>
-          <w:sz w:val="19"/>
-        </w:rPr>
-        <w:t>sp_PostTing_GeneralLedger</w:t>
-      </w:r>
-      <w:r>
-        <w:t xml:space="preserve"> và loại chứng từ cho bút toán khác để bên em viết.</w:t>
-      </w:r>
-    </w:p>
-    <w:p>
-      <w:pPr>
-        <w:pStyle w:val="ListNumber"/>
-      </w:pPr>
-      <w:r>
-        <w:rPr>
-          <w:b/>
-        </w:rPr>
-        <w:t>Huỷ hai SO thử</w:t>
-      </w:r>
-      <w:r>
-        <w:t xml:space="preserve"> </w:t>
-      </w:r>
-      <w:r>
-        <w:rPr>
-          <w:rFonts w:ascii="Consolas" w:hAnsi="Consolas"/>
-          <w:sz w:val="19"/>
-        </w:rPr>
-        <w:t>TK-20261001-000162</w:t>
-      </w:r>
-      <w:r>
-        <w:t xml:space="preserve">, </w:t>
-      </w:r>
-      <w:r>
-        <w:rPr>
-          <w:rFonts w:ascii="Consolas" w:hAnsi="Consolas"/>
-          <w:sz w:val="19"/>
-        </w:rPr>
-        <w:t>…163</w:t>
-      </w:r>
-      <w:r>
-        <w:t>, và cho biết cách gửi lại hai DO đó.</w:t>
-      </w:r>
-    </w:p>
-    <w:p>
-      <w:pPr>
-        <w:pStyle w:val="ListNumber"/>
-      </w:pPr>
-      <w:r>
-        <w:rPr>
-          <w:b/>
-        </w:rPr>
-        <w:t>Tài khoản tích hợp</w:t>
-      </w:r>
-      <w:r>
-        <w:t xml:space="preserve"> thay token cá nhân sắp hết hạn: tệp tạo đã sẵn (hợp đồng 12.12.3); anh thêm </w:t>
-      </w:r>
-      <w:r>
-        <w:rPr>
-          <w:rFonts w:ascii="Consolas" w:hAnsi="Consolas"/>
-          <w:sz w:val="19"/>
-        </w:rPr>
-        <w:t>UserId</w:t>
-      </w:r>
-      <w:r>
-        <w:t xml:space="preserve"> vào </w:t>
-      </w:r>
-      <w:r>
-        <w:rPr>
-          <w:rFonts w:ascii="Consolas" w:hAnsi="Consolas"/>
-          <w:sz w:val="19"/>
-        </w:rPr>
-        <w:t>LogisticsSalesPush:AllowedUserIds</w:t>
-      </w:r>
-      <w:r>
-        <w:t xml:space="preserve"> của host.</w:t>
-      </w:r>
-    </w:p>
-    <w:p>
-      <w:pPr>
-        <w:pStyle w:val="ListNumber"/>
-      </w:pPr>
-      <w:r>
-        <w:rPr>
-          <w:b/>
-        </w:rPr>
-        <w:t>Cờ phân loại</w:t>
-      </w:r>
-      <w:r>
-        <w:t xml:space="preserve"> ở </w:t>
-      </w:r>
-      <w:r>
-        <w:rPr>
-          <w:rFonts w:ascii="Consolas" w:hAnsi="Consolas"/>
-          <w:sz w:val="19"/>
-        </w:rPr>
-        <w:t>document-types</w:t>
-      </w:r>
-      <w:r>
-        <w:t xml:space="preserve"> (công nợ / khác / "Chi trước"), để WEB và API bỏ mã DOTY ghi cứng. Phiếu "Chi trước" (59) bên em tạo hiện không có trong ô chọn của WEB.</w:t>
-      </w:r>
-    </w:p>
-    <w:p>
-      <w:pPr>
-        <w:pStyle w:val="ListNumber"/>
-      </w:pPr>
-      <w:r>
-        <w:rPr>
-          <w:b/>
-        </w:rPr>
-        <w:t>Đơn vị EPL Lào</w:t>
-      </w:r>
-      <w:r>
-        <w:t xml:space="preserve"> (quốc gia 11, tiền LAK). Hiện SO và phiếu vào chi nhánh cố định 1368 "Demo EPL". Thà Bốc và Viêng Chăn là một hay hai đơn vị?</w:t>
-      </w:r>
-    </w:p>
-    <w:p>
-      <w:pPr>
-        <w:pStyle w:val="ListNumber"/>
-      </w:pPr>
-      <w:r>
-        <w:rPr>
-          <w:b/>
-        </w:rPr>
-        <w:t>Tiền USD</w:t>
-      </w:r>
-      <w:r>
-        <w:t xml:space="preserve"> (bật mã 2), </w:t>
-      </w:r>
-      <w:r>
-        <w:rPr>
-          <w:b/>
-        </w:rPr>
-        <w:t>THB, CNY</w:t>
-      </w:r>
-      <w:r>
-        <w:t xml:space="preserve"> trong danh mục tiền của CM, và SO nhận THB / CNY (hợp đồng câu hỏi 10.3).</w:t>
-      </w:r>
-    </w:p>
-    <w:p>
-      <w:pPr>
-        <w:pStyle w:val="ListNumber"/>
-      </w:pPr>
-      <w:r>
-        <w:rPr>
-          <w:b/>
-        </w:rPr>
-        <w:t>Mẫu `customer-detail` thật</w:t>
-      </w:r>
-      <w:r>
-        <w:t xml:space="preserve"> cho màn công nợ (A5).</w:t>
-      </w:r>
-    </w:p>
-    <w:p>
-      <w:pPr>
-        <w:pStyle w:val="ListNumber"/>
-      </w:pPr>
-      <w:r>
-        <w:rPr>
-          <w:b/>
-        </w:rPr>
-        <w:t>Cấu hình host</w:t>
-      </w:r>
-      <w:r>
-        <w:t xml:space="preserve"> khi triển khai: </w:t>
-      </w:r>
-      <w:r>
-        <w:rPr>
-          <w:rFonts w:ascii="Consolas" w:hAnsi="Consolas"/>
-          <w:sz w:val="19"/>
-        </w:rPr>
-        <w:t>LogisticsSource:BaseUrl</w:t>
-      </w:r>
-      <w:r>
-        <w:t xml:space="preserve"> (bắt buộc), </w:t>
-      </w:r>
-      <w:r>
-        <w:rPr>
-          <w:rFonts w:ascii="Consolas" w:hAnsi="Consolas"/>
-          <w:sz w:val="19"/>
-        </w:rPr>
-        <w:t>ApiKey</w:t>
-      </w:r>
-      <w:r>
-        <w:t xml:space="preserve">, </w:t>
-      </w:r>
-      <w:r>
-        <w:rPr>
-          <w:rFonts w:ascii="Consolas" w:hAnsi="Consolas"/>
-          <w:sz w:val="19"/>
-        </w:rPr>
-        <w:t>LogisticsSalesPush:*</w:t>
-      </w:r>
-      <w:r>
-        <w:t xml:space="preserve"> (TONG_HOP mục 4).</w:t>
-      </w:r>
-    </w:p>
+    <w:tbl>
+      <w:tblPr>
+        <w:tblStyle w:val="LightGrid-Accent1"/>
+        <w:tblW w:type="auto" w:w="0"/>
+        <w:tblLook w:firstColumn="1" w:firstRow="1" w:lastColumn="0" w:lastRow="0" w:noHBand="0" w:noVBand="1" w:val="04A0"/>
+      </w:tblPr>
+      <w:tblGrid>
+        <w:gridCol w:w="2880"/>
+        <w:gridCol w:w="2880"/>
+        <w:gridCol w:w="2880"/>
+      </w:tblGrid>
+      <w:tr>
+        <w:tc>
+          <w:tcPr>
+            <w:tcW w:type="dxa" w:w="2880"/>
+          </w:tcPr>
+          <w:p>
+            <w:r>
+              <w:rPr>
+                <w:b/>
+              </w:rPr>
+            </w:r>
+            <w:r>
+              <w:rPr>
+                <w:b/>
+              </w:rPr>
+              <w:t>#</w:t>
+            </w:r>
+          </w:p>
+        </w:tc>
+        <w:tc>
+          <w:tcPr>
+            <w:tcW w:type="dxa" w:w="2880"/>
+          </w:tcPr>
+          <w:p>
+            <w:r>
+              <w:rPr>
+                <w:b/>
+              </w:rPr>
+            </w:r>
+            <w:r>
+              <w:rPr>
+                <w:b/>
+              </w:rPr>
+              <w:t>Việc</w:t>
+            </w:r>
+          </w:p>
+        </w:tc>
+        <w:tc>
+          <w:tcPr>
+            <w:tcW w:type="dxa" w:w="2880"/>
+          </w:tcPr>
+          <w:p>
+            <w:r>
+              <w:rPr>
+                <w:b/>
+              </w:rPr>
+            </w:r>
+            <w:r>
+              <w:rPr>
+                <w:b/>
+              </w:rPr>
+              <w:t>Người làm</w:t>
+            </w:r>
+          </w:p>
+        </w:tc>
+      </w:tr>
+      <w:tr>
+        <w:tc>
+          <w:tcPr>
+            <w:tcW w:type="dxa" w:w="2880"/>
+          </w:tcPr>
+          <w:p>
+            <w:r/>
+            <w:r>
+              <w:t>1</w:t>
+            </w:r>
+          </w:p>
+        </w:tc>
+        <w:tc>
+          <w:tcPr>
+            <w:tcW w:type="dxa" w:w="2880"/>
+          </w:tcPr>
+          <w:p>
+            <w:r/>
+            <w:r>
+              <w:rPr>
+                <w:b/>
+              </w:rPr>
+              <w:t>API bút toán tổng hợp</w:t>
+            </w:r>
+            <w:r>
+              <w:t xml:space="preserve"> nhận bút toán chờ (mục 1.6, hợp đồng 12.12.4); cần đọc định nghĩa </w:t>
+            </w:r>
+            <w:r>
+              <w:rPr>
+                <w:rFonts w:ascii="Consolas" w:hAnsi="Consolas"/>
+                <w:sz w:val="19"/>
+              </w:rPr>
+              <w:t>sp_PostTing_GeneralLedger</w:t>
+            </w:r>
+            <w:r>
+              <w:t xml:space="preserve"> và loại chứng từ cho bút toán khác</w:t>
+            </w:r>
+          </w:p>
+        </w:tc>
+        <w:tc>
+          <w:tcPr>
+            <w:tcW w:type="dxa" w:w="2880"/>
+          </w:tcPr>
+          <w:p>
+            <w:r/>
+            <w:r>
+              <w:t>bên EPL làm (đang làm)</w:t>
+            </w:r>
+          </w:p>
+        </w:tc>
+      </w:tr>
+      <w:tr>
+        <w:tc>
+          <w:tcPr>
+            <w:tcW w:type="dxa" w:w="2880"/>
+          </w:tcPr>
+          <w:p>
+            <w:r/>
+            <w:r>
+              <w:t>2</w:t>
+            </w:r>
+          </w:p>
+        </w:tc>
+        <w:tc>
+          <w:tcPr>
+            <w:tcW w:type="dxa" w:w="2880"/>
+          </w:tcPr>
+          <w:p>
+            <w:r/>
+            <w:r>
+              <w:rPr>
+                <w:b/>
+              </w:rPr>
+              <w:t>Cờ phân loại</w:t>
+            </w:r>
+            <w:r>
+              <w:t xml:space="preserve"> ở </w:t>
+            </w:r>
+            <w:r>
+              <w:rPr>
+                <w:rFonts w:ascii="Consolas" w:hAnsi="Consolas"/>
+                <w:sz w:val="19"/>
+              </w:rPr>
+              <w:t>document-types</w:t>
+            </w:r>
+            <w:r>
+              <w:t xml:space="preserve"> (công nợ / khác / "Chi trước"), để WEB và API bỏ mã DOTY ghi cứng; phiếu 59 "Chi trước" trên WEB hiện chỉ xem</w:t>
+            </w:r>
+          </w:p>
+        </w:tc>
+        <w:tc>
+          <w:tcPr>
+            <w:tcW w:type="dxa" w:w="2880"/>
+          </w:tcPr>
+          <w:p>
+            <w:r/>
+            <w:r>
+              <w:t>bên EPL làm (đang làm)</w:t>
+            </w:r>
+          </w:p>
+        </w:tc>
+      </w:tr>
+      <w:tr>
+        <w:tc>
+          <w:tcPr>
+            <w:tcW w:type="dxa" w:w="2880"/>
+          </w:tcPr>
+          <w:p>
+            <w:r/>
+            <w:r>
+              <w:t>3</w:t>
+            </w:r>
+          </w:p>
+        </w:tc>
+        <w:tc>
+          <w:tcPr>
+            <w:tcW w:type="dxa" w:w="2880"/>
+          </w:tcPr>
+          <w:p>
+            <w:r/>
+            <w:r>
+              <w:t xml:space="preserve">SO nhận cước </w:t>
+            </w:r>
+            <w:r>
+              <w:rPr>
+                <w:b/>
+              </w:rPr>
+              <w:t>THB, CNY</w:t>
+            </w:r>
+            <w:r>
+              <w:t xml:space="preserve"> (hợp đồng câu hỏi 10.3)</w:t>
+            </w:r>
+          </w:p>
+        </w:tc>
+        <w:tc>
+          <w:tcPr>
+            <w:tcW w:type="dxa" w:w="2880"/>
+          </w:tcPr>
+          <w:p>
+            <w:r/>
+            <w:r>
+              <w:t>bên EPL làm (đang làm)</w:t>
+            </w:r>
+          </w:p>
+        </w:tc>
+      </w:tr>
+      <w:tr>
+        <w:tc>
+          <w:tcPr>
+            <w:tcW w:type="dxa" w:w="2880"/>
+          </w:tcPr>
+          <w:p>
+            <w:r/>
+            <w:r>
+              <w:t>4</w:t>
+            </w:r>
+          </w:p>
+        </w:tc>
+        <w:tc>
+          <w:tcPr>
+            <w:tcW w:type="dxa" w:w="2880"/>
+          </w:tcPr>
+          <w:p>
+            <w:r/>
+            <w:r>
+              <w:rPr>
+                <w:b/>
+              </w:rPr>
+              <w:t>Triển khai</w:t>
+            </w:r>
+            <w:r>
+              <w:t xml:space="preserve"> hai nhánh lên host, cấu hình </w:t>
+            </w:r>
+            <w:r>
+              <w:rPr>
+                <w:rFonts w:ascii="Consolas" w:hAnsi="Consolas"/>
+                <w:sz w:val="19"/>
+              </w:rPr>
+              <w:t>LogisticsSource:BaseUrl</w:t>
+            </w:r>
+            <w:r>
+              <w:t xml:space="preserve"> (bắt buộc), </w:t>
+            </w:r>
+            <w:r>
+              <w:rPr>
+                <w:rFonts w:ascii="Consolas" w:hAnsi="Consolas"/>
+                <w:sz w:val="19"/>
+              </w:rPr>
+              <w:t>ApiKey</w:t>
+            </w:r>
+            <w:r>
+              <w:t xml:space="preserve">, </w:t>
+            </w:r>
+            <w:r>
+              <w:rPr>
+                <w:rFonts w:ascii="Consolas" w:hAnsi="Consolas"/>
+                <w:sz w:val="19"/>
+              </w:rPr>
+              <w:t>LogisticsSalesPush:*</w:t>
+            </w:r>
+            <w:r>
+              <w:t xml:space="preserve"> (TONG_HOP mục 4); kho tạm có </w:t>
+            </w:r>
+            <w:r>
+              <w:rPr>
+                <w:rFonts w:ascii="Consolas" w:hAnsi="Consolas"/>
+                <w:sz w:val="19"/>
+              </w:rPr>
+              <w:t>1d8d91c</w:t>
+            </w:r>
+          </w:p>
+        </w:tc>
+        <w:tc>
+          <w:tcPr>
+            <w:tcW w:type="dxa" w:w="2880"/>
+          </w:tcPr>
+          <w:p>
+            <w:r/>
+            <w:r>
+              <w:rPr>
+                <w:b/>
+              </w:rPr>
+              <w:t>cần quyền host</w:t>
+            </w:r>
+          </w:p>
+        </w:tc>
+      </w:tr>
+      <w:tr>
+        <w:tc>
+          <w:tcPr>
+            <w:tcW w:type="dxa" w:w="2880"/>
+          </w:tcPr>
+          <w:p>
+            <w:r/>
+            <w:r>
+              <w:t>5</w:t>
+            </w:r>
+          </w:p>
+        </w:tc>
+        <w:tc>
+          <w:tcPr>
+            <w:tcW w:type="dxa" w:w="2880"/>
+          </w:tcPr>
+          <w:p>
+            <w:r/>
+            <w:r>
+              <w:rPr>
+                <w:b/>
+              </w:rPr>
+              <w:t>Token hết hạn khoảng 10/10</w:t>
+            </w:r>
+            <w:r>
+              <w:t xml:space="preserve">: thay token mới trong </w:t>
+            </w:r>
+            <w:r>
+              <w:rPr>
+                <w:rFonts w:ascii="Consolas" w:hAnsi="Consolas"/>
+                <w:sz w:val="19"/>
+              </w:rPr>
+              <w:t>.env</w:t>
+            </w:r>
+            <w:r>
+              <w:t xml:space="preserve">, hoặc đặt </w:t>
+            </w:r>
+            <w:r>
+              <w:rPr>
+                <w:rFonts w:ascii="Consolas" w:hAnsi="Consolas"/>
+                <w:sz w:val="19"/>
+              </w:rPr>
+              <w:t>QLSX_USERNAME</w:t>
+            </w:r>
+            <w:r>
+              <w:t xml:space="preserve"> / </w:t>
+            </w:r>
+            <w:r>
+              <w:rPr>
+                <w:rFonts w:ascii="Consolas" w:hAnsi="Consolas"/>
+                <w:sz w:val="19"/>
+              </w:rPr>
+              <w:t>QLSX_PASSWORD</w:t>
+            </w:r>
+            <w:r>
+              <w:t xml:space="preserve"> của anh để tự đăng nhập lại (hợp đồng 12.11.4). Tài khoản tích hợp </w:t>
+            </w:r>
+            <w:r>
+              <w:rPr>
+                <w:b/>
+              </w:rPr>
+              <w:t>tạm gác</w:t>
+            </w:r>
+            <w:r>
+              <w:t xml:space="preserve"> — tuỳ chọn (hợp đồng 12.12.3; nhân viên ảo </w:t>
+            </w:r>
+            <w:r>
+              <w:rPr>
+                <w:rFonts w:ascii="Consolas" w:hAnsi="Consolas"/>
+                <w:sz w:val="19"/>
+              </w:rPr>
+              <w:t>EPL-TICHHOP</w:t>
+            </w:r>
+            <w:r>
+              <w:t xml:space="preserve"> ObjId 1622 trên DB demo, chưa có tài khoản dùng được)</w:t>
+            </w:r>
+          </w:p>
+        </w:tc>
+        <w:tc>
+          <w:tcPr>
+            <w:tcW w:type="dxa" w:w="2880"/>
+          </w:tcPr>
+          <w:p>
+            <w:r/>
+            <w:r>
+              <w:rPr>
+                <w:b/>
+              </w:rPr>
+              <w:t>cần quyền host</w:t>
+            </w:r>
+            <w:r>
+              <w:t xml:space="preserve"> (token / mật khẩu của anh)</w:t>
+            </w:r>
+          </w:p>
+        </w:tc>
+      </w:tr>
+      <w:tr>
+        <w:tc>
+          <w:tcPr>
+            <w:tcW w:type="dxa" w:w="2880"/>
+          </w:tcPr>
+          <w:p>
+            <w:r/>
+            <w:r>
+              <w:t>6</w:t>
+            </w:r>
+          </w:p>
+        </w:tc>
+        <w:tc>
+          <w:tcPr>
+            <w:tcW w:type="dxa" w:w="2880"/>
+          </w:tcPr>
+          <w:p>
+            <w:r/>
+            <w:r>
+              <w:rPr>
+                <w:b/>
+              </w:rPr>
+              <w:t>Dữ liệu DB host</w:t>
+            </w:r>
+            <w:r>
+              <w:t xml:space="preserve">: mở 1371 / 4021 / 4022 nếu thiếu; bật LAK / USD (mã 2); lỗi </w:t>
+            </w:r>
+            <w:r>
+              <w:rPr>
+                <w:rFonts w:ascii="Consolas" w:hAnsi="Consolas"/>
+                <w:sz w:val="19"/>
+              </w:rPr>
+              <w:t>default-money-account</w:t>
+            </w:r>
+            <w:r>
+              <w:t xml:space="preserve"> trên host; đơn vị EPL Lào (quốc gia 11, tiền LAK — Thà Bốc và Viêng Chăn một hay hai đơn vị?)</w:t>
+            </w:r>
+          </w:p>
+        </w:tc>
+        <w:tc>
+          <w:tcPr>
+            <w:tcW w:type="dxa" w:w="2880"/>
+          </w:tcPr>
+          <w:p>
+            <w:r/>
+            <w:r>
+              <w:rPr>
+                <w:b/>
+              </w:rPr>
+              <w:t>cần quyền host</w:t>
+            </w:r>
+          </w:p>
+        </w:tc>
+      </w:tr>
+      <w:tr>
+        <w:tc>
+          <w:tcPr>
+            <w:tcW w:type="dxa" w:w="2880"/>
+          </w:tcPr>
+          <w:p>
+            <w:r/>
+            <w:r>
+              <w:t>7</w:t>
+            </w:r>
+          </w:p>
+        </w:tc>
+        <w:tc>
+          <w:tcPr>
+            <w:tcW w:type="dxa" w:w="2880"/>
+          </w:tcPr>
+          <w:p>
+            <w:r/>
+            <w:r>
+              <w:rPr>
+                <w:b/>
+              </w:rPr>
+              <w:t>Nhật ký kiểm toán cũ</w:t>
+            </w:r>
+            <w:r>
+              <w:t xml:space="preserve"> có thể còn mật khẩu dạng chữ thường (trước </w:t>
+            </w:r>
+            <w:r>
+              <w:rPr>
+                <w:rFonts w:ascii="Consolas" w:hAnsi="Consolas"/>
+                <w:sz w:val="19"/>
+              </w:rPr>
+              <w:t>ed5aa0e</w:t>
+            </w:r>
+            <w:r>
+              <w:t>): xoá / che, cân nhắc đổi mật khẩu</w:t>
+            </w:r>
+          </w:p>
+        </w:tc>
+        <w:tc>
+          <w:tcPr>
+            <w:tcW w:type="dxa" w:w="2880"/>
+          </w:tcPr>
+          <w:p>
+            <w:r/>
+            <w:r>
+              <w:rPr>
+                <w:b/>
+              </w:rPr>
+              <w:t>cần quyền host</w:t>
+            </w:r>
+          </w:p>
+        </w:tc>
+      </w:tr>
+      <w:tr>
+        <w:tc>
+          <w:tcPr>
+            <w:tcW w:type="dxa" w:w="2880"/>
+          </w:tcPr>
+          <w:p>
+            <w:r/>
+            <w:r>
+              <w:t>8</w:t>
+            </w:r>
+          </w:p>
+        </w:tc>
+        <w:tc>
+          <w:tcPr>
+            <w:tcW w:type="dxa" w:w="2880"/>
+          </w:tcPr>
+          <w:p>
+            <w:r/>
+            <w:r>
+              <w:t>Chạy lại vòng nối kế toán với bản cuối hai bên (</w:t>
+            </w:r>
+            <w:r>
+              <w:rPr>
+                <w:rFonts w:ascii="Consolas" w:hAnsi="Consolas"/>
+                <w:sz w:val="19"/>
+              </w:rPr>
+              <w:t>938b007</w:t>
+            </w:r>
+            <w:r>
+              <w:t xml:space="preserve"> đã dọn lớp tạm; mã còn đổi nhỏ — </w:t>
+            </w:r>
+            <w:r>
+              <w:rPr>
+                <w:b/>
+              </w:rPr>
+              <w:t>đang chốt</w:t>
+            </w:r>
+            <w:r>
+              <w:t>)</w:t>
+            </w:r>
+          </w:p>
+        </w:tc>
+        <w:tc>
+          <w:tcPr>
+            <w:tcW w:type="dxa" w:w="2880"/>
+          </w:tcPr>
+          <w:p>
+            <w:r/>
+            <w:r>
+              <w:t>bên EPL làm (đang làm)</w:t>
+            </w:r>
+          </w:p>
+        </w:tc>
+      </w:tr>
+    </w:tbl>
+    <w:p/>
     <w:p>
       <w:pPr>
         <w:jc w:val="both"/>
@@ -9195,7 +10144,10 @@
               <w:rPr>
                 <w:b/>
               </w:rPr>
-              <w:t>Anh Tune</w:t>
+              <w:t>Bên EPL</w:t>
+            </w:r>
+            <w:r>
+              <w:t xml:space="preserve"> (đang làm)</w:t>
             </w:r>
           </w:p>
         </w:tc>
@@ -9206,7 +10158,7 @@
           <w:p>
             <w:r/>
             <w:r>
-              <w:t>mục 5, từ việc 1; triển khai hai nhánh rồi đổi link theo hợp đồng 12.12.2</w:t>
+              <w:t>mục 5 việc 1, 2, 3, 8; thêm nút tạo khoá bàn giao ở màn Tài khoản; màn tạo tài khoản ở hồ sơ nhân viên bên WEB (dùng sau nếu cần)</w:t>
             </w:r>
           </w:p>
         </w:tc>
@@ -9222,7 +10174,7 @@
               <w:rPr>
                 <w:b/>
               </w:rPr>
-              <w:t>Bên em</w:t>
+              <w:t>Cần quyền host</w:t>
             </w:r>
           </w:p>
         </w:tc>
@@ -9233,17 +10185,7 @@
           <w:p>
             <w:r/>
             <w:r>
-              <w:t xml:space="preserve">làm xong A8, A9, A10 và bút toán chờ; chạy lại vòng nối kế toán với </w:t>
-            </w:r>
-            <w:r>
-              <w:rPr>
-                <w:rFonts w:ascii="Consolas" w:hAnsi="Consolas"/>
-                <w:sz w:val="19"/>
-              </w:rPr>
-              <w:t>ce95b3c</w:t>
-            </w:r>
-            <w:r>
-              <w:t>; thêm nút tạo khoá bàn giao ở màn Tài khoản</w:t>
+              <w:t>mục 5 việc 4 – 7; triển khai xong thì đổi link theo hợp đồng 12.12.2</w:t>
             </w:r>
           </w:p>
         </w:tc>
@@ -9270,7 +10212,7 @@
           <w:p>
             <w:r/>
             <w:r>
-              <w:t>chạy tệp tạo tài khoản tích hợp; host trang điều xe Lào ra Internet khi làm xong hết, rồi gửi anh Tune địa chỉ + khoá bàn giao</w:t>
+              <w:t>host trang điều xe Lào ra Internet khi làm xong hết, rồi chuyển địa chỉ + khoá bàn giao vào cấu hình host</w:t>
             </w:r>
           </w:p>
         </w:tc>
@@ -9619,7 +10561,27 @@
         <w:t>kiem/thu_xe_thue_ke_toan.py</w:t>
       </w:r>
       <w:r>
-        <w:t>: A4, A7 qua API chạy ở máy;</w:t>
+        <w:t xml:space="preserve">, </w:t>
+      </w:r>
+      <w:r>
+        <w:rPr>
+          <w:rFonts w:ascii="Consolas" w:hAnsi="Consolas"/>
+          <w:sz w:val="19"/>
+        </w:rPr>
+        <w:t>kiem/thu_chu_xe.py</w:t>
+      </w:r>
+      <w:r>
+        <w:t xml:space="preserve">, </w:t>
+      </w:r>
+      <w:r>
+        <w:rPr>
+          <w:rFonts w:ascii="Consolas" w:hAnsi="Consolas"/>
+          <w:sz w:val="19"/>
+        </w:rPr>
+        <w:t>kiem/thu_tru_hang_quay.py</w:t>
+      </w:r>
+      <w:r>
+        <w:t>: A4, A7 (gồm trừ hàng quầy) qua API chạy ở máy;</w:t>
       </w:r>
     </w:p>
     <w:p>
@@ -9631,29 +10593,63 @@
           <w:rFonts w:ascii="Consolas" w:hAnsi="Consolas"/>
           <w:sz w:val="19"/>
         </w:rPr>
+        <w:t>kiem/thu_chi_muc_tune.py</w:t>
+      </w:r>
+      <w:r>
+        <w:t xml:space="preserve">: A8; </w:t>
+      </w:r>
+      <w:r>
+        <w:rPr>
+          <w:rFonts w:ascii="Consolas" w:hAnsi="Consolas"/>
+          <w:sz w:val="19"/>
+        </w:rPr>
         <w:t>kiem/thu_tat_toan_tune.py</w:t>
       </w:r>
       <w:r>
-        <w:t>: A9, A10 — đang làm.</w:t>
+        <w:t xml:space="preserve">: A9, A10; </w:t>
+      </w:r>
+      <w:r>
+        <w:rPr>
+          <w:rFonts w:ascii="Consolas" w:hAnsi="Consolas"/>
+          <w:sz w:val="19"/>
+        </w:rPr>
+        <w:t>kiem/thu_but_toan_cho.py</w:t>
+      </w:r>
+      <w:r>
+        <w:t>: bút toán chờ (A11);</w:t>
       </w:r>
     </w:p>
     <w:p>
       <w:pPr>
-        <w:jc w:val="both"/>
-      </w:pPr>
-      <w:r>
-        <w:t>---</w:t>
+        <w:pStyle w:val="ListBullet"/>
+      </w:pPr>
+      <w:r>
+        <w:rPr>
+          <w:rFonts w:ascii="Consolas" w:hAnsi="Consolas"/>
+          <w:sz w:val="19"/>
+        </w:rPr>
+        <w:t>kiem/thu_giao_dien.js</w:t>
+      </w:r>
+      <w:r>
+        <w:t>: 22 màn, gồm màn Tất toán tài xế, Nhà cung cấp, Bút toán chờ gửi;</w:t>
       </w:r>
     </w:p>
     <w:p>
       <w:pPr>
-        <w:pStyle w:val="Heading1"/>
-      </w:pPr>
-      <w:r>
-        <w:rPr>
-          <w:color w:val="145C4A"/>
-        </w:rPr>
-        <w:t>8. Đối chiếu source của anh (`feat/HonTunedaHai@ce95b3c`, `feat/hontunedhai_Laos@7e14421c`)</w:t>
+        <w:pStyle w:val="ListBullet"/>
+      </w:pPr>
+      <w:r>
+        <w:t xml:space="preserve">kho tạm </w:t>
+      </w:r>
+      <w:r>
+        <w:rPr>
+          <w:rFonts w:ascii="Consolas" w:hAnsi="Consolas"/>
+          <w:sz w:val="19"/>
+        </w:rPr>
+        <w:t>EPL_KETOAN/kiem/thu_tru_hang_chu_xe.py</w:t>
+      </w:r>
+      <w:r>
+        <w:t xml:space="preserve"> (máy thử 8031): ba đường trừ hàng quầy.</w:t>
       </w:r>
     </w:p>
     <w:p>
@@ -9661,19 +10657,66 @@
         <w:jc w:val="both"/>
       </w:pPr>
       <w:r>
-        <w:t>Chủ dự án cho bên em sửa thẳng source của anh từ 01/10 (anh review). Các commit và việc còn lại ghi ở mục 16 tài liệu hiện trạng của anh và ở TONG_HOP mục 2.</w:t>
+        <w:t xml:space="preserve">Các bài trên đạt trên máy thử 8011 với </w:t>
+      </w:r>
+      <w:r>
+        <w:rPr>
+          <w:rFonts w:ascii="Consolas" w:hAnsi="Consolas"/>
+          <w:sz w:val="19"/>
+        </w:rPr>
+        <w:t>f85078b</w:t>
+      </w:r>
+      <w:r>
+        <w:t xml:space="preserve">, </w:t>
+      </w:r>
+      <w:r>
+        <w:rPr>
+          <w:rFonts w:ascii="Consolas" w:hAnsi="Consolas"/>
+          <w:sz w:val="19"/>
+        </w:rPr>
+        <w:t>ca7b630</w:t>
+      </w:r>
+      <w:r>
+        <w:t>.</w:t>
       </w:r>
     </w:p>
     <w:p>
       <w:pPr>
-        <w:pStyle w:val="Heading2"/>
-      </w:pPr>
-      <w:r>
-        <w:t>8.1. Tạo SO (A2) — khớp</w:t>
+        <w:jc w:val="both"/>
+      </w:pPr>
+      <w:r>
+        <w:t>---</w:t>
       </w:r>
     </w:p>
     <w:p>
       <w:pPr>
+        <w:pStyle w:val="Heading1"/>
+      </w:pPr>
+      <w:r>
+        <w:rPr>
+          <w:color w:val="145C4A"/>
+        </w:rPr>
+        <w:t>8. Đối chiếu source của anh (`feat/HonTunedaHai@ae0e7f6`, `feat/hontunedhai_Laos@77bcb0a1`)</w:t>
+      </w:r>
+    </w:p>
+    <w:p>
+      <w:pPr>
+        <w:jc w:val="both"/>
+      </w:pPr>
+      <w:r>
+        <w:t>Chủ dự án cho bên em sửa thẳng source của anh từ 01/10 (anh review). Các commit và việc còn lại ghi ở mục 16 tài liệu hiện trạng của anh và ở TONG_HOP mục 2.</w:t>
+      </w:r>
+    </w:p>
+    <w:p>
+      <w:pPr>
+        <w:pStyle w:val="Heading2"/>
+      </w:pPr>
+      <w:r>
+        <w:t>8.1. Tạo SO (A2) — khớp</w:t>
+      </w:r>
+    </w:p>
+    <w:p>
+      <w:pPr>
         <w:pStyle w:val="ListBullet"/>
       </w:pPr>
       <w:r>
@@ -10013,40 +11056,40 @@
         <w:rPr>
           <w:b/>
         </w:rPr>
-        <w:t>Tổng header</w:t>
-      </w:r>
-      <w:r>
-        <w:t xml:space="preserve"> do </w:t>
+        <w:t>Quy đổi từng dòng</w:t>
+      </w:r>
+      <w:r>
+        <w:t xml:space="preserve"> (</w:t>
       </w:r>
       <w:r>
         <w:rPr>
           <w:rFonts w:ascii="Consolas" w:hAnsi="Consolas"/>
           <w:sz w:val="19"/>
         </w:rPr>
-        <w:t>CashVoucherHeaderTotals</w:t>
-      </w:r>
-      <w:r>
-        <w:t xml:space="preserve"> tính ở create-session, save-session, save-and-commit: Σ </w:t>
+        <w:t>ae0e7f6</w:t>
+      </w:r>
+      <w:r>
+        <w:t xml:space="preserve">, </w:t>
       </w:r>
       <w:r>
         <w:rPr>
           <w:rFonts w:ascii="Consolas" w:hAnsi="Consolas"/>
           <w:sz w:val="19"/>
         </w:rPr>
-        <w:t>Entries</w:t>
-      </w:r>
-      <w:r>
-        <w:t xml:space="preserve"> (5 số lẻ, nửa xa số 0); số client gửi bị thay. Phiếu có dòng IV/IC hay công nợ thiếu số tiền thì giữ số header client gửi (đường tương thích). Mọi phiếu bên em chỉ có </w:t>
+        <w:t>ApplyLineBaseAmounts</w:t>
+      </w:r>
+      <w:r>
+        <w:t xml:space="preserve">): </w:t>
       </w:r>
       <w:r>
         <w:rPr>
           <w:rFonts w:ascii="Consolas" w:hAnsi="Consolas"/>
           <w:sz w:val="19"/>
         </w:rPr>
-        <w:t>Entries</w:t>
-      </w:r>
-      <w:r>
-        <w:t>, nên luôn được tính lại.</w:t>
+        <w:t>BaseAmount = Round(Amount × (tỷ giá dòng ?? tỷ giá header), 5, AwayFromZero)</w:t>
+      </w:r>
+      <w:r>
+        <w:t>; giữ số client khi thiếu nguyên tệ, tỷ giá ≤ 0, dòng IV/IC.</w:t>
       </w:r>
     </w:p>
     <w:p>
@@ -10055,23 +11098,42 @@
       </w:pPr>
       <w:r>
         <w:rPr>
+          <w:b/>
+        </w:rPr>
+        <w:t>Tổng header</w:t>
+      </w:r>
+      <w:r>
+        <w:t xml:space="preserve"> do </w:t>
+      </w:r>
+      <w:r>
+        <w:rPr>
           <w:rFonts w:ascii="Consolas" w:hAnsi="Consolas"/>
           <w:sz w:val="19"/>
         </w:rPr>
-        <w:t>ObjectService</w:t>
-      </w:r>
-      <w:r>
-        <w:t xml:space="preserve">: tạo đối tượng không gửi </w:t>
+        <w:t>CashVoucherHeaderTotals</w:t>
+      </w:r>
+      <w:r>
+        <w:t xml:space="preserve"> tính ở create-session, save-session, save-and-commit: Σ </w:t>
       </w:r>
       <w:r>
         <w:rPr>
           <w:rFonts w:ascii="Consolas" w:hAnsi="Consolas"/>
           <w:sz w:val="19"/>
         </w:rPr>
-        <w:t>IsOrganization</w:t>
-      </w:r>
-      <w:r>
-        <w:t xml:space="preserve"> thì là cá nhân. Bên em vẫn luôn gửi ô này.</w:t>
+        <w:t>Entries</w:t>
+      </w:r>
+      <w:r>
+        <w:t xml:space="preserve"> (5 số lẻ, nửa xa số 0); số client gửi bị thay. Phiếu có dòng IV/IC hay công nợ thiếu số tiền thì giữ số header client gửi (đường tương thích). Mọi phiếu bên em chỉ có </w:t>
+      </w:r>
+      <w:r>
+        <w:rPr>
+          <w:rFonts w:ascii="Consolas" w:hAnsi="Consolas"/>
+          <w:sz w:val="19"/>
+        </w:rPr>
+        <w:t>Entries</w:t>
+      </w:r>
+      <w:r>
+        <w:t>, nên luôn được tính lại.</w:t>
       </w:r>
     </w:p>
     <w:p>
@@ -10079,47 +11141,116 @@
         <w:pStyle w:val="ListBullet"/>
       </w:pPr>
       <w:r>
-        <w:t>WEB (</w:t>
+        <w:rPr>
+          <w:b/>
+        </w:rPr>
+        <w:t>Nhật ký kiểm toán</w:t>
+      </w:r>
+      <w:r>
+        <w:t xml:space="preserve"> (</w:t>
       </w:r>
       <w:r>
         <w:rPr>
           <w:rFonts w:ascii="Consolas" w:hAnsi="Consolas"/>
           <w:sz w:val="19"/>
         </w:rPr>
-        <w:t>06a14189</w:t>
-      </w:r>
-      <w:r>
-        <w:t xml:space="preserve">, </w:t>
-      </w:r>
+        <w:t>ed5aa0e</w:t>
+      </w:r>
+      <w:r>
+        <w:t>): payload che mật khẩu / token / khoá; dòng audit cũ có thể còn mật khẩu (mục 5 việc 7).</w:t>
+      </w:r>
+    </w:p>
+    <w:p>
+      <w:pPr>
+        <w:pStyle w:val="ListBullet"/>
+      </w:pPr>
       <w:r>
         <w:rPr>
           <w:rFonts w:ascii="Consolas" w:hAnsi="Consolas"/>
           <w:sz w:val="19"/>
         </w:rPr>
-        <w:t>7e14421c</w:t>
-      </w:r>
-      <w:r>
-        <w:t xml:space="preserve">): </w:t>
+        <w:t>ObjectService</w:t>
+      </w:r>
+      <w:r>
+        <w:t xml:space="preserve">: tạo đối tượng không gửi </w:t>
       </w:r>
       <w:r>
         <w:rPr>
           <w:rFonts w:ascii="Consolas" w:hAnsi="Consolas"/>
           <w:sz w:val="19"/>
         </w:rPr>
-        <w:t>isCash</w:t>
-      </w:r>
-      <w:r>
-        <w:t xml:space="preserve"> theo hình thức thanh toán; tài khoản tiền mặc định đọc </w:t>
+        <w:t>IsOrganization</w:t>
+      </w:r>
+      <w:r>
+        <w:t xml:space="preserve"> thì là cá nhân. Bên em vẫn luôn gửi ô này.</w:t>
+      </w:r>
+    </w:p>
+    <w:p>
+      <w:pPr>
+        <w:pStyle w:val="ListBullet"/>
+      </w:pPr>
+      <w:r>
+        <w:t>WEB (</w:t>
       </w:r>
       <w:r>
         <w:rPr>
           <w:rFonts w:ascii="Consolas" w:hAnsi="Consolas"/>
           <w:sz w:val="19"/>
         </w:rPr>
+        <w:t>06a14189</w:t>
+      </w:r>
+      <w:r>
+        <w:t xml:space="preserve">, </w:t>
+      </w:r>
+      <w:r>
+        <w:rPr>
+          <w:rFonts w:ascii="Consolas" w:hAnsi="Consolas"/>
+          <w:sz w:val="19"/>
+        </w:rPr>
+        <w:t>7e14421c</w:t>
+      </w:r>
+      <w:r>
+        <w:t xml:space="preserve">, </w:t>
+      </w:r>
+      <w:r>
+        <w:rPr>
+          <w:rFonts w:ascii="Consolas" w:hAnsi="Consolas"/>
+          <w:sz w:val="19"/>
+        </w:rPr>
+        <w:t>77bcb0a1</w:t>
+      </w:r>
+      <w:r>
+        <w:t xml:space="preserve">): </w:t>
+      </w:r>
+      <w:r>
+        <w:rPr>
+          <w:rFonts w:ascii="Consolas" w:hAnsi="Consolas"/>
+          <w:sz w:val="19"/>
+        </w:rPr>
+        <w:t>isCash</w:t>
+      </w:r>
+      <w:r>
+        <w:t xml:space="preserve"> theo hình thức thanh toán, không rõ thì chặn lưu; tài khoản tiền mặc định đọc </w:t>
+      </w:r>
+      <w:r>
+        <w:rPr>
+          <w:rFonts w:ascii="Consolas" w:hAnsi="Consolas"/>
+          <w:sz w:val="19"/>
+        </w:rPr>
         <w:t>AccountCode</w:t>
       </w:r>
       <w:r>
-        <w:t>; đổi hình thức / nội tệ / loại tiền khi đã có dòng thì vế tiền dòng đổi theo; phân loại công nợ / khác theo DOTY 58/60, 15/17 ghi cứng — loại 59 "Chi trước" không có trong ô chọn.</w:t>
+        <w:t xml:space="preserve">; đổi hình thức / nội tệ / loại tiền thì chỉ dòng mang cờ </w:t>
+      </w:r>
+      <w:r>
+        <w:rPr>
+          <w:rFonts w:ascii="Consolas" w:hAnsi="Consolas"/>
+          <w:sz w:val="19"/>
+        </w:rPr>
+        <w:t>moneyAccountIsDefault</w:t>
+      </w:r>
+      <w:r>
+        <w:t xml:space="preserve"> đổi vế tiền; loại phiếu không đổi ngầm — 58/60, 15/17 sửa được, loại khác (57, 59 "Chi trước", 68, 14, 16) chỉ xem; modal Vụ việc thoát ký tự cả DEAL / QUOTE.</w:t>
       </w:r>
     </w:p>
     <w:p>

</xml_diff>

<commit_message>
Tài liệu nối API anh Tune: thu tiền khách đi TKN → CMR 17, cách đọc lại "đã thu", chứng từ thử chuyến THU-KBAZ, xếp lỗi bút toán theo 3d4ba03
Co-Authored-By: Claude Opus 5.5 (1M context) <noreply@anthropic.com>
</commit_message>
<xml_diff>
--- a/DOCS/word/NOI_API_ANH_TUNE.docx
+++ b/DOCS/word/NOI_API_ANH_TUNE.docx
@@ -42,7 +42,7 @@
           <w:rFonts w:ascii="Consolas" w:hAnsi="Consolas"/>
           <w:sz w:val="19"/>
         </w:rPr>
-        <w:t>EPL_LAO_REAL@875a0cf</w:t>
+        <w:t>EPL_LAO_REAL@05fbc98</w:t>
       </w:r>
       <w:r>
         <w:t xml:space="preserve"> (gửi bút toán </w:t>
@@ -75,7 +75,65 @@
         <w:t>b9227aa</w:t>
       </w:r>
       <w:r>
-        <w:t xml:space="preserve"> — mục 1.7);</w:t>
+        <w:t xml:space="preserve"> ở </w:t>
+      </w:r>
+      <w:r>
+        <w:rPr>
+          <w:rFonts w:ascii="Consolas" w:hAnsi="Consolas"/>
+          <w:sz w:val="19"/>
+        </w:rPr>
+        <w:t>875a0cf</w:t>
+      </w:r>
+      <w:r>
+        <w:t xml:space="preserve">, xếp lỗi theo mã thật ở </w:t>
+      </w:r>
+      <w:r>
+        <w:rPr>
+          <w:rFonts w:ascii="Consolas" w:hAnsi="Consolas"/>
+          <w:sz w:val="19"/>
+        </w:rPr>
+        <w:t>3d4ba03</w:t>
+      </w:r>
+      <w:r>
+        <w:t xml:space="preserve"> — mục 1.7; đọc lại "đã thu" </w:t>
+      </w:r>
+      <w:r>
+        <w:rPr>
+          <w:rFonts w:ascii="Consolas" w:hAnsi="Consolas"/>
+          <w:sz w:val="19"/>
+        </w:rPr>
+        <w:t>chi_tune._da_tra</w:t>
+      </w:r>
+      <w:r>
+        <w:t xml:space="preserve"> ở </w:t>
+      </w:r>
+      <w:r>
+        <w:rPr>
+          <w:rFonts w:ascii="Consolas" w:hAnsi="Consolas"/>
+          <w:sz w:val="19"/>
+        </w:rPr>
+        <w:t>22dd4c8</w:t>
+      </w:r>
+      <w:r>
+        <w:t xml:space="preserve"> — mục 1.5);</w:t>
+      </w:r>
+    </w:p>
+    <w:p>
+      <w:pPr>
+        <w:pStyle w:val="ListBullet"/>
+      </w:pPr>
+      <w:r>
+        <w:t xml:space="preserve">kịch bản thử A→Z hai hệ </w:t>
+      </w:r>
+      <w:r>
+        <w:rPr>
+          <w:rFonts w:ascii="Consolas" w:hAnsi="Consolas"/>
+          <w:sz w:val="19"/>
+        </w:rPr>
+        <w:t>KICH_BAN_A_Z_EPL_TUNE</w:t>
+      </w:r>
+      <w:r>
+        <w:t xml:space="preserve"> (KB-AZ, đã đi thật một chuyến THU-KBAZ ngày 01/10);</w:t>
       </w:r>
     </w:p>
     <w:p>
@@ -1054,6 +1112,18 @@
               </w:rPr>
               <w:t>OrderCode</w:t>
             </w:r>
+            <w:r>
+              <w:t xml:space="preserve">. Tiền thu thật làm ở màn </w:t>
+            </w:r>
+            <w:r>
+              <w:rPr>
+                <w:b/>
+              </w:rPr>
+              <w:t>Chi tiết công nợ khách hàng</w:t>
+            </w:r>
+            <w:r>
+              <w:t xml:space="preserve"> của anh (phiếu thu nợ TKN → phiếu thu CMR 17)</w:t>
+            </w:r>
           </w:p>
         </w:tc>
         <w:tc>
@@ -1069,7 +1139,7 @@
               <w:t>chạy</w:t>
             </w:r>
             <w:r>
-              <w:t xml:space="preserve"> (mục 1.5)</w:t>
+              <w:t xml:space="preserve"> (mục 1.5; KB-AZ đã thu thật hai SO)</w:t>
             </w:r>
           </w:p>
         </w:tc>
@@ -2922,20 +2992,105 @@
                 <w:rFonts w:ascii="Consolas" w:hAnsi="Consolas"/>
                 <w:sz w:val="19"/>
               </w:rPr>
+              <w:t>PT</w:t>
+            </w:r>
+            <w:r>
+              <w:t xml:space="preserve"> thu tiền khách</w:t>
+            </w:r>
+          </w:p>
+        </w:tc>
+        <w:tc>
+          <w:tcPr>
+            <w:tcW w:type="dxa" w:w="2160"/>
+          </w:tcPr>
+          <w:p>
+            <w:r/>
+            <w:r>
+              <w:t>kế toán bên anh thu nợ SO</w:t>
+            </w:r>
+          </w:p>
+        </w:tc>
+        <w:tc>
+          <w:tcPr>
+            <w:tcW w:type="dxa" w:w="2160"/>
+          </w:tcPr>
+          <w:p>
+            <w:r/>
+            <w:r>
+              <w:rPr>
+                <w:b/>
+              </w:rPr>
+              <w:t>việc của hệ anh</w:t>
+            </w:r>
+            <w:r>
+              <w:t xml:space="preserve">: </w:t>
+            </w:r>
+            <w:r>
+              <w:rPr>
+                <w:b/>
+              </w:rPr>
+              <w:t>Chi tiết công nợ khách hàng → Tạo phiếu thu → Xác nhận thu nợ</w:t>
+            </w:r>
+            <w:r>
+              <w:t xml:space="preserve"> → phiếu thu nợ </w:t>
+            </w:r>
+            <w:r>
+              <w:rPr>
+                <w:b/>
+              </w:rPr>
+              <w:t>TKN</w:t>
+            </w:r>
+            <w:r>
+              <w:t xml:space="preserve"> → hệ anh tự sinh phiếu thu </w:t>
+            </w:r>
+            <w:r>
+              <w:rPr>
+                <w:b/>
+              </w:rPr>
+              <w:t>CMR 17 "Thu khác"</w:t>
+            </w:r>
+            <w:r>
+              <w:t xml:space="preserve"> Nợ 1021 / Có 1211 (mục 1.5). </w:t>
+            </w:r>
+            <w:r>
+              <w:rPr>
+                <w:b/>
+              </w:rPr>
+              <w:t>Không</w:t>
+            </w:r>
+            <w:r>
+              <w:t xml:space="preserve"> thu bằng phiếu "Thu công nợ" CMR 15. LAO đọc "đã thu" qua A5</w:t>
+            </w:r>
+          </w:p>
+        </w:tc>
+        <w:tc>
+          <w:tcPr>
+            <w:tcW w:type="dxa" w:w="2160"/>
+          </w:tcPr>
+          <w:p>
+            <w:r/>
+            <w:r>
+              <w:t>chạy (KB-AZ)</w:t>
+            </w:r>
+          </w:p>
+        </w:tc>
+      </w:tr>
+      <w:tr>
+        <w:tc>
+          <w:tcPr>
+            <w:tcW w:type="dxa" w:w="2160"/>
+          </w:tcPr>
+          <w:p>
+            <w:r/>
+            <w:r>
+              <w:rPr>
+                <w:rFonts w:ascii="Consolas" w:hAnsi="Consolas"/>
+                <w:sz w:val="19"/>
+              </w:rPr>
               <w:t>HD</w:t>
             </w:r>
             <w:r>
-              <w:t xml:space="preserve"> hoá đơn · </w:t>
-            </w:r>
-            <w:r>
-              <w:rPr>
-                <w:rFonts w:ascii="Consolas" w:hAnsi="Consolas"/>
-                <w:sz w:val="19"/>
-              </w:rPr>
-              <w:t>PT</w:t>
-            </w:r>
-            <w:r>
-              <w:t xml:space="preserve"> thu tiền khách</w:t>
+              <w:t xml:space="preserve"> hoá đơn</w:t>
             </w:r>
           </w:p>
         </w:tc>
@@ -6638,6 +6793,23 @@
       </w:r>
       <w:r>
         <w:t>). Chỉ Sếp mở, sau khi đã báo anh.</w:t>
+      </w:r>
+    </w:p>
+    <w:p>
+      <w:pPr>
+        <w:pStyle w:val="ListBullet"/>
+      </w:pPr>
+      <w:r>
+        <w:t xml:space="preserve">Kế toán bên anh thu tiền khách ở màn </w:t>
+      </w:r>
+      <w:r>
+        <w:rPr>
+          <w:b/>
+        </w:rPr>
+        <w:t>Chi tiết công nợ khách hàng</w:t>
+      </w:r>
+      <w:r>
+        <w:t xml:space="preserve"> (phiếu thu nợ TKN → phiếu thu CMR 17, mục 1.5).</w:t>
       </w:r>
     </w:p>
     <w:p>
@@ -8897,7 +9069,514 @@
         <w:pStyle w:val="Heading2"/>
       </w:pPr>
       <w:r>
-        <w:t>1.5. A5 — công nợ khách, đã thu của từng SO</w:t>
+        <w:t>1.5. Thu tiền khách bên anh và A5 — đọc lại "đã thu" của từng SO</w:t>
+      </w:r>
+    </w:p>
+    <w:p>
+      <w:pPr>
+        <w:jc w:val="both"/>
+      </w:pPr>
+      <w:r>
+        <w:rPr>
+          <w:b/>
+        </w:rPr>
+        <w:t>Thu tiền khách — việc của hệ anh</w:t>
+      </w:r>
+      <w:r>
+        <w:t xml:space="preserve"> (KB-AZ bước 21 đã đi thật; kiểm trong source):</w:t>
+      </w:r>
+    </w:p>
+    <w:p>
+      <w:pPr>
+        <w:pStyle w:val="ListNumber"/>
+      </w:pPr>
+      <w:r>
+        <w:t xml:space="preserve">QLSX WEB → </w:t>
+      </w:r>
+      <w:r>
+        <w:rPr>
+          <w:b/>
+        </w:rPr>
+        <w:t>Danh sách công nợ</w:t>
+      </w:r>
+      <w:r>
+        <w:t xml:space="preserve"> → chi nhánh 1368 → mở khách → màn </w:t>
+      </w:r>
+      <w:r>
+        <w:rPr>
+          <w:b/>
+        </w:rPr>
+        <w:t>Chi tiết công nợ khách hàng</w:t>
+      </w:r>
+      <w:r>
+        <w:t xml:space="preserve"> (</w:t>
+      </w:r>
+      <w:r>
+        <w:rPr>
+          <w:rFonts w:ascii="Consolas" w:hAnsi="Consolas"/>
+          <w:sz w:val="19"/>
+        </w:rPr>
+        <w:t>/DebtCollection/CustomerDetail?objAutoId=&lt;ObjId&gt;&amp;orgId=1368</w:t>
+      </w:r>
+      <w:r>
+        <w:t>).</w:t>
+      </w:r>
+    </w:p>
+    <w:p>
+      <w:pPr>
+        <w:pStyle w:val="ListNumber"/>
+      </w:pPr>
+      <w:r>
+        <w:t xml:space="preserve">Bảng </w:t>
+      </w:r>
+      <w:r>
+        <w:rPr>
+          <w:b/>
+        </w:rPr>
+        <w:t>Chi tiết hóa đơn theo tuổi nợ</w:t>
+      </w:r>
+      <w:r>
+        <w:t xml:space="preserve">: tick các dòng </w:t>
+      </w:r>
+      <w:r>
+        <w:rPr>
+          <w:rFonts w:ascii="Consolas" w:hAnsi="Consolas"/>
+          <w:sz w:val="19"/>
+        </w:rPr>
+        <w:t>TK-…</w:t>
+      </w:r>
+      <w:r>
+        <w:t xml:space="preserve"> cần thu (cùng loại tiền) → </w:t>
+      </w:r>
+      <w:r>
+        <w:rPr>
+          <w:b/>
+        </w:rPr>
+        <w:t>Tạo phiếu thu</w:t>
+      </w:r>
+      <w:r>
+        <w:t>.</w:t>
+      </w:r>
+    </w:p>
+    <w:p>
+      <w:pPr>
+        <w:pStyle w:val="ListNumber"/>
+      </w:pPr>
+      <w:r>
+        <w:t xml:space="preserve">Hộp </w:t>
+      </w:r>
+      <w:r>
+        <w:rPr>
+          <w:b/>
+        </w:rPr>
+        <w:t>Tạo phiếu thu</w:t>
+      </w:r>
+      <w:r>
+        <w:t xml:space="preserve">: Quốc gia kế toán Lào, Tài khoản tiền thu, Phương thức thanh toán, Ghi chú; bảng Phân bổ tiền thu theo hóa đơn → </w:t>
+      </w:r>
+      <w:r>
+        <w:rPr>
+          <w:b/>
+        </w:rPr>
+        <w:t>Xác nhận thu nợ</w:t>
+      </w:r>
+      <w:r>
+        <w:t>.</w:t>
+      </w:r>
+    </w:p>
+    <w:p>
+      <w:pPr>
+        <w:pStyle w:val="ListNumber"/>
+      </w:pPr>
+      <w:r>
+        <w:rPr>
+          <w:b/>
+        </w:rPr>
+        <w:t>Danh sách phiếu thu</w:t>
+      </w:r>
+      <w:r>
+        <w:t xml:space="preserve"> (loại </w:t>
+      </w:r>
+      <w:r>
+        <w:rPr>
+          <w:b/>
+        </w:rPr>
+        <w:t>Thu khác</w:t>
+      </w:r>
+      <w:r>
+        <w:t xml:space="preserve">) → </w:t>
+      </w:r>
+      <w:r>
+        <w:rPr>
+          <w:b/>
+        </w:rPr>
+        <w:t>Ghi sổ</w:t>
+      </w:r>
+      <w:r>
+        <w:t xml:space="preserve"> phiếu vừa sinh.</w:t>
+      </w:r>
+    </w:p>
+    <w:p>
+      <w:pPr>
+        <w:jc w:val="both"/>
+      </w:pPr>
+      <w:r>
+        <w:t xml:space="preserve">Máy làm: WEB </w:t>
+      </w:r>
+      <w:r>
+        <w:rPr>
+          <w:rFonts w:ascii="Consolas" w:hAnsi="Consolas"/>
+          <w:sz w:val="19"/>
+        </w:rPr>
+        <w:t>debtCollectionCustomerDetail.js</w:t>
+      </w:r>
+      <w:r>
+        <w:t xml:space="preserve"> gửi </w:t>
+      </w:r>
+      <w:r>
+        <w:rPr>
+          <w:rFonts w:ascii="Consolas" w:hAnsi="Consolas"/>
+          <w:sz w:val="19"/>
+        </w:rPr>
+        <w:t>documentType: "TKN"</w:t>
+      </w:r>
+      <w:r>
+        <w:t xml:space="preserve"> → BFF → API </w:t>
+      </w:r>
+      <w:r>
+        <w:rPr>
+          <w:rFonts w:ascii="Consolas" w:hAnsi="Consolas"/>
+          <w:sz w:val="19"/>
+        </w:rPr>
+        <w:t>POST /api/v1/sales/debt/collection-upsert</w:t>
+      </w:r>
+      <w:r>
+        <w:t xml:space="preserve"> (</w:t>
+      </w:r>
+      <w:r>
+        <w:rPr>
+          <w:rFonts w:ascii="Consolas" w:hAnsi="Consolas"/>
+          <w:sz w:val="19"/>
+        </w:rPr>
+        <w:t>SalesService.DebtCollection</w:t>
+      </w:r>
+      <w:r>
+        <w:t xml:space="preserve">, chỉ nhận TKN tạo mới) → thủ tục </w:t>
+      </w:r>
+      <w:r>
+        <w:rPr>
+          <w:rFonts w:ascii="Consolas" w:hAnsi="Consolas"/>
+          <w:sz w:val="19"/>
+        </w:rPr>
+        <w:t>sp_RES_CreateDebtCollection_COUNTRY</w:t>
+      </w:r>
+      <w:r>
+        <w:t xml:space="preserve"> (script </w:t>
+      </w:r>
+      <w:r>
+        <w:rPr>
+          <w:rFonts w:ascii="Consolas" w:hAnsi="Consolas"/>
+          <w:sz w:val="19"/>
+        </w:rPr>
+        <w:t>20260910_sales_debt_collection_country.sql</w:t>
+      </w:r>
+      <w:r>
+        <w:t xml:space="preserve"> của anh, bên em không sửa). Mỗi SO một lần thu:</w:t>
+      </w:r>
+    </w:p>
+    <w:tbl>
+      <w:tblPr>
+        <w:tblStyle w:val="LightGrid-Accent1"/>
+        <w:tblW w:type="auto" w:w="0"/>
+        <w:tblLook w:firstColumn="1" w:firstRow="1" w:lastColumn="0" w:lastRow="0" w:noHBand="0" w:noVBand="1" w:val="04A0"/>
+      </w:tblPr>
+      <w:tblGrid>
+        <w:gridCol w:w="4320"/>
+        <w:gridCol w:w="4320"/>
+      </w:tblGrid>
+      <w:tr>
+        <w:tc>
+          <w:tcPr>
+            <w:tcW w:type="dxa" w:w="4320"/>
+          </w:tcPr>
+          <w:p>
+            <w:r>
+              <w:rPr>
+                <w:b/>
+              </w:rPr>
+            </w:r>
+            <w:r>
+              <w:rPr>
+                <w:b/>
+              </w:rPr>
+              <w:t>Bảng bên anh</w:t>
+            </w:r>
+          </w:p>
+        </w:tc>
+        <w:tc>
+          <w:tcPr>
+            <w:tcW w:type="dxa" w:w="4320"/>
+          </w:tcPr>
+          <w:p>
+            <w:r>
+              <w:rPr>
+                <w:b/>
+              </w:rPr>
+            </w:r>
+            <w:r>
+              <w:rPr>
+                <w:b/>
+              </w:rPr>
+              <w:t>Ghi gì</w:t>
+            </w:r>
+          </w:p>
+        </w:tc>
+      </w:tr>
+      <w:tr>
+        <w:tc>
+          <w:tcPr>
+            <w:tcW w:type="dxa" w:w="4320"/>
+          </w:tcPr>
+          <w:p>
+            <w:r/>
+            <w:r>
+              <w:rPr>
+                <w:rFonts w:ascii="Consolas" w:hAnsi="Consolas"/>
+                <w:sz w:val="19"/>
+              </w:rPr>
+              <w:t>RESDOCUMENT</w:t>
+            </w:r>
+            <w:r>
+              <w:t xml:space="preserve"> · </w:t>
+            </w:r>
+            <w:r>
+              <w:rPr>
+                <w:rFonts w:ascii="Consolas" w:hAnsi="Consolas"/>
+                <w:sz w:val="19"/>
+              </w:rPr>
+              <w:t>RESDOCUMENT_TICKET</w:t>
+            </w:r>
+          </w:p>
+        </w:tc>
+        <w:tc>
+          <w:tcPr>
+            <w:tcW w:type="dxa" w:w="4320"/>
+          </w:tcPr>
+          <w:p>
+            <w:r/>
+            <w:r>
+              <w:t xml:space="preserve">phiếu thu nợ </w:t>
+            </w:r>
+            <w:r>
+              <w:rPr>
+                <w:b/>
+              </w:rPr>
+              <w:t>TKN</w:t>
+            </w:r>
+            <w:r>
+              <w:t xml:space="preserve"> (số dạng </w:t>
+            </w:r>
+            <w:r>
+              <w:rPr>
+                <w:rFonts w:ascii="Consolas" w:hAnsi="Consolas"/>
+                <w:sz w:val="19"/>
+              </w:rPr>
+              <w:t>4-TKN-1368-2-261001-0001</w:t>
+            </w:r>
+            <w:r>
+              <w:t>) gắn phiếu bán của SO</w:t>
+            </w:r>
+          </w:p>
+        </w:tc>
+      </w:tr>
+      <w:tr>
+        <w:tc>
+          <w:tcPr>
+            <w:tcW w:type="dxa" w:w="4320"/>
+          </w:tcPr>
+          <w:p>
+            <w:r/>
+            <w:r>
+              <w:rPr>
+                <w:rFonts w:ascii="Consolas" w:hAnsi="Consolas"/>
+                <w:sz w:val="19"/>
+              </w:rPr>
+              <w:t>RESCUSTOMERSDEBT</w:t>
+            </w:r>
+          </w:p>
+        </w:tc>
+        <w:tc>
+          <w:tcPr>
+            <w:tcW w:type="dxa" w:w="4320"/>
+          </w:tcPr>
+          <w:p>
+            <w:r/>
+            <w:r>
+              <w:rPr>
+                <w:rFonts w:ascii="Consolas" w:hAnsi="Consolas"/>
+                <w:sz w:val="19"/>
+              </w:rPr>
+              <w:t>RCTD_DEBTMONEY</w:t>
+            </w:r>
+            <w:r>
+              <w:t xml:space="preserve"> trừ số thu; về 0 thì </w:t>
+            </w:r>
+            <w:r>
+              <w:rPr>
+                <w:rFonts w:ascii="Consolas" w:hAnsi="Consolas"/>
+                <w:sz w:val="19"/>
+              </w:rPr>
+              <w:t>RCTD_ISPAID = 1</w:t>
+            </w:r>
+            <w:r>
+              <w:t xml:space="preserve">. </w:t>
+            </w:r>
+            <w:r>
+              <w:rPr>
+                <w:b/>
+              </w:rPr>
+              <w:t>`RESTICKET.RETK_MONEYPAID` không đổi (vẫn 0)</w:t>
+            </w:r>
+          </w:p>
+        </w:tc>
+      </w:tr>
+      <w:tr>
+        <w:tc>
+          <w:tcPr>
+            <w:tcW w:type="dxa" w:w="4320"/>
+          </w:tcPr>
+          <w:p>
+            <w:r/>
+            <w:r>
+              <w:rPr>
+                <w:rFonts w:ascii="Consolas" w:hAnsi="Consolas"/>
+                <w:sz w:val="19"/>
+              </w:rPr>
+              <w:t>PUBDOCUMENT</w:t>
+            </w:r>
+            <w:r>
+              <w:t xml:space="preserve"> · </w:t>
+            </w:r>
+            <w:r>
+              <w:rPr>
+                <w:rFonts w:ascii="Consolas" w:hAnsi="Consolas"/>
+                <w:sz w:val="19"/>
+              </w:rPr>
+              <w:t>CMRECEIPT</w:t>
+            </w:r>
+            <w:r>
+              <w:t xml:space="preserve"> · </w:t>
+            </w:r>
+            <w:r>
+              <w:rPr>
+                <w:rFonts w:ascii="Consolas" w:hAnsi="Consolas"/>
+                <w:sz w:val="19"/>
+              </w:rPr>
+              <w:t>PUBENTRY</w:t>
+            </w:r>
+          </w:p>
+        </w:tc>
+        <w:tc>
+          <w:tcPr>
+            <w:tcW w:type="dxa" w:w="4320"/>
+          </w:tcPr>
+          <w:p>
+            <w:r/>
+            <w:r>
+              <w:t xml:space="preserve">phiếu thu CM </w:t>
+            </w:r>
+            <w:r>
+              <w:rPr>
+                <w:b/>
+              </w:rPr>
+              <w:t>DOTY 17 "Thu khác"</w:t>
+            </w:r>
+            <w:r>
+              <w:t xml:space="preserve"> (số dạng </w:t>
+            </w:r>
+            <w:r>
+              <w:rPr>
+                <w:rFonts w:ascii="Consolas" w:hAnsi="Consolas"/>
+                <w:sz w:val="19"/>
+              </w:rPr>
+              <w:t>4-1368-TK-261001-00009</w:t>
+            </w:r>
+            <w:r>
+              <w:t xml:space="preserve">), chưa ghi sổ, tham chiếu = số TKN; một dòng </w:t>
+            </w:r>
+            <w:r>
+              <w:rPr>
+                <w:b/>
+              </w:rPr>
+              <w:t>Nợ tiền / Có 1211</w:t>
+            </w:r>
+            <w:r>
+              <w:t xml:space="preserve"> — vế Nợ theo tài khoản tiền chọn (</w:t>
+            </w:r>
+            <w:r>
+              <w:rPr>
+                <w:rFonts w:ascii="Consolas" w:hAnsi="Consolas"/>
+                <w:sz w:val="19"/>
+              </w:rPr>
+              <w:t>CMACCOUNTCONFIGCOUNTRY</w:t>
+            </w:r>
+            <w:r>
+              <w:t xml:space="preserve">, Ngân hàng nội tệ = </w:t>
+            </w:r>
+            <w:r>
+              <w:rPr>
+                <w:b/>
+              </w:rPr>
+              <w:t>1021</w:t>
+            </w:r>
+            <w:r>
+              <w:t xml:space="preserve">), vế Có theo vai </w:t>
+            </w:r>
+            <w:r>
+              <w:rPr>
+                <w:rFonts w:ascii="Consolas" w:hAnsi="Consolas"/>
+                <w:sz w:val="19"/>
+              </w:rPr>
+              <w:t>CUSTOMER_GOODS</w:t>
+            </w:r>
+            <w:r>
+              <w:t xml:space="preserve"> = </w:t>
+            </w:r>
+            <w:r>
+              <w:rPr>
+                <w:b/>
+              </w:rPr>
+              <w:t>1211</w:t>
+            </w:r>
+          </w:p>
+        </w:tc>
+      </w:tr>
+    </w:tbl>
+    <w:p/>
+    <w:p>
+      <w:pPr>
+        <w:pStyle w:val="ListBullet"/>
+      </w:pPr>
+      <w:r>
+        <w:t xml:space="preserve">Công nợ SO nằm ở phân hệ </w:t>
+      </w:r>
+      <w:r>
+        <w:rPr>
+          <w:b/>
+        </w:rPr>
+        <w:t>Bán hàng</w:t>
+      </w:r>
+      <w:r>
+        <w:t xml:space="preserve">, nên </w:t>
+      </w:r>
+      <w:r>
+        <w:rPr>
+          <w:b/>
+        </w:rPr>
+        <w:t>không thu bằng phiếu thu "Thu công nợ" (CMR 15)</w:t>
+      </w:r>
+      <w:r>
+        <w:t xml:space="preserve"> ở màn Phiếu thu: tìm chứng từ công nợ của khách ở đó trả 0 dòng (KB-AZ đã thử).</w:t>
       </w:r>
     </w:p>
     <w:p>
@@ -8906,33 +9585,109 @@
       </w:pPr>
       <w:r>
         <w:rPr>
+          <w:b/>
+        </w:rPr>
+        <w:t>Lỗi bên anh, đang sửa (bên EPL):</w:t>
+      </w:r>
+    </w:p>
+    <w:p>
+      <w:pPr>
+        <w:pStyle w:val="ListBullet2"/>
+      </w:pPr>
+      <w:r>
+        <w:t xml:space="preserve">hộp Tạo phiếu thu gửi </w:t>
+      </w:r>
+      <w:r>
+        <w:rPr>
+          <w:b/>
+        </w:rPr>
+        <w:t>tỷ giá cứng 1</w:t>
+      </w:r>
+      <w:r>
+        <w:t xml:space="preserve"> (</w:t>
+      </w:r>
+      <w:r>
+        <w:rPr>
           <w:rFonts w:ascii="Consolas" w:hAnsi="Consolas"/>
           <w:sz w:val="19"/>
         </w:rPr>
-        <w:t>POST /api/v1/sales/debt/customer-detail</w:t>
-      </w:r>
-      <w:r>
-        <w:t xml:space="preserve"> với </w:t>
+        <w:t>buildCollectionPayload</w:t>
+      </w:r>
+      <w:r>
+        <w:t xml:space="preserve">: </w:t>
       </w:r>
       <w:r>
         <w:rPr>
           <w:rFonts w:ascii="Consolas" w:hAnsi="Consolas"/>
           <w:sz w:val="19"/>
         </w:rPr>
-        <w:t>{CustomerObjectId, OrgId}</w:t>
-      </w:r>
-      <w:r>
-        <w:t xml:space="preserve">, trả </w:t>
+        <w:t>rate: 1</w:t>
+      </w:r>
+      <w:r>
+        <w:t xml:space="preserve">, </w:t>
       </w:r>
       <w:r>
         <w:rPr>
           <w:rFonts w:ascii="Consolas" w:hAnsi="Consolas"/>
           <w:sz w:val="19"/>
         </w:rPr>
-        <w:t>Customer, Summary, Aging, Debts, Collections, Orders</w:t>
-      </w:r>
-      <w:r>
-        <w:t>.</w:t>
+        <w:t>amount = amountCur</w:t>
+      </w:r>
+      <w:r>
+        <w:t xml:space="preserve">) và ô tài khoản tiền chỉ có nội tệ → SO </w:t>
+      </w:r>
+      <w:r>
+        <w:rPr>
+          <w:b/>
+        </w:rPr>
+        <w:t>USD</w:t>
+      </w:r>
+      <w:r>
+        <w:t xml:space="preserve"> ghi thành Kíp: phiếu thu 495 USD có quy đổi 495, vế tiền 1021 (ngân hàng Kíp);</w:t>
+      </w:r>
+    </w:p>
+    <w:p>
+      <w:pPr>
+        <w:pStyle w:val="ListBullet2"/>
+      </w:pPr>
+      <w:r>
+        <w:rPr>
+          <w:b/>
+        </w:rPr>
+        <w:t>mọi SO cùng mã phiếu bán</w:t>
+      </w:r>
+      <w:r>
+        <w:t xml:space="preserve"> </w:t>
+      </w:r>
+      <w:r>
+        <w:rPr>
+          <w:rFonts w:ascii="Consolas" w:hAnsi="Consolas"/>
+          <w:sz w:val="19"/>
+        </w:rPr>
+        <w:t>RETK_CODE = "Demo EPL-2-261001000"</w:t>
+      </w:r>
+      <w:r>
+        <w:t xml:space="preserve"> (SO 162, 164, 165) → diễn giải phiếu thu </w:t>
+      </w:r>
+      <w:r>
+        <w:rPr>
+          <w:i/>
+        </w:rPr>
+        <w:t>"Thu khách nợ từ phiếu Demo EPL-2-261001000"</w:t>
+      </w:r>
+      <w:r>
+        <w:t xml:space="preserve"> giống hệt nhau, khó phân biệt.</w:t>
+      </w:r>
+    </w:p>
+    <w:p>
+      <w:pPr>
+        <w:jc w:val="both"/>
+      </w:pPr>
+      <w:r>
+        <w:rPr>
+          <w:b/>
+        </w:rPr>
+        <w:t>A5 — LAO đọc lại "đã thu":</w:t>
       </w:r>
     </w:p>
     <w:p>
@@ -8940,25 +9695,54 @@
         <w:pStyle w:val="ListBullet"/>
       </w:pPr>
       <w:r>
-        <w:t xml:space="preserve">Màn Khách hàng → tab Công nợ có khối </w:t>
-      </w:r>
-      <w:r>
-        <w:rPr>
-          <w:b/>
-        </w:rPr>
-        <w:t>"Công nợ bên hệ kế toán"</w:t>
-      </w:r>
-      <w:r>
-        <w:t xml:space="preserve">: tổng nợ, đã thu, quá hạn, tuổi nợ, từng SO còn nợ. </w:t>
-      </w:r>
-      <w:r>
-        <w:rPr>
-          <w:b/>
-        </w:rPr>
-        <w:t>Chỉ xem</w:t>
-      </w:r>
-      <w:r>
-        <w:t>: thu tiền, hoá đơn làm ở hệ anh.</w:t>
+        <w:rPr>
+          <w:rFonts w:ascii="Consolas" w:hAnsi="Consolas"/>
+          <w:sz w:val="19"/>
+        </w:rPr>
+        <w:t>POST /api/v1/sales/debt/customer-detail</w:t>
+      </w:r>
+      <w:r>
+        <w:t xml:space="preserve"> với </w:t>
+      </w:r>
+      <w:r>
+        <w:rPr>
+          <w:rFonts w:ascii="Consolas" w:hAnsi="Consolas"/>
+          <w:sz w:val="19"/>
+        </w:rPr>
+        <w:t>{CustomerObjectId, OrgId}</w:t>
+      </w:r>
+      <w:r>
+        <w:t xml:space="preserve">, trả </w:t>
+      </w:r>
+      <w:r>
+        <w:rPr>
+          <w:rFonts w:ascii="Consolas" w:hAnsi="Consolas"/>
+          <w:sz w:val="19"/>
+        </w:rPr>
+        <w:t>Customer, Summary, Aging, Debts, Collections, Orders</w:t>
+      </w:r>
+      <w:r>
+        <w:t xml:space="preserve"> (</w:t>
+      </w:r>
+      <w:r>
+        <w:rPr>
+          <w:rFonts w:ascii="Consolas" w:hAnsi="Consolas"/>
+          <w:sz w:val="19"/>
+        </w:rPr>
+        <w:t>services/chi_tune.py</w:t>
+      </w:r>
+      <w:r>
+        <w:t xml:space="preserve"> </w:t>
+      </w:r>
+      <w:r>
+        <w:rPr>
+          <w:rFonts w:ascii="Consolas" w:hAnsi="Consolas"/>
+          <w:sz w:val="19"/>
+        </w:rPr>
+        <w:t>cong_no_khach</w:t>
+      </w:r>
+      <w:r>
+        <w:t>).</w:t>
       </w:r>
     </w:p>
     <w:p>
@@ -8966,17 +9750,92 @@
         <w:pStyle w:val="ListBullet"/>
       </w:pPr>
       <w:r>
-        <w:t xml:space="preserve">Phiếu đề nghị thu đọc lại số đã thu theo </w:t>
+        <w:rPr>
+          <w:b/>
+        </w:rPr>
+        <w:t>Đã thu của một SO</w:t>
+      </w:r>
+      <w:r>
+        <w:t xml:space="preserve"> = </w:t>
       </w:r>
       <w:r>
         <w:rPr>
           <w:rFonts w:ascii="Consolas" w:hAnsi="Consolas"/>
           <w:sz w:val="19"/>
         </w:rPr>
-        <w:t>OrderCode</w:t>
-      </w:r>
-      <w:r>
-        <w:t xml:space="preserve"> của SO: còn nợ ≤ nửa xu → "đã thu"; đã trả &gt; 0 → "thu một phần". Một khách đọc tối đa một lần mỗi 60 giây.</w:t>
+        <w:t>services/chi_tune.py</w:t>
+      </w:r>
+      <w:r>
+        <w:t xml:space="preserve"> </w:t>
+      </w:r>
+      <w:r>
+        <w:rPr>
+          <w:rFonts w:ascii="Consolas" w:hAnsi="Consolas"/>
+          <w:sz w:val="19"/>
+        </w:rPr>
+        <w:t>_da_tra</w:t>
+      </w:r>
+      <w:r>
+        <w:t xml:space="preserve">: </w:t>
+      </w:r>
+      <w:r>
+        <w:rPr>
+          <w:rFonts w:ascii="Consolas" w:hAnsi="Consolas"/>
+          <w:sz w:val="19"/>
+        </w:rPr>
+        <w:t>max(RETK_MONEYPAID, RETK_PAYMENTAMOUNT − RCTD_DEBTMONEY)</w:t>
+      </w:r>
+      <w:r>
+        <w:t xml:space="preserve">, tức </w:t>
+      </w:r>
+      <w:r>
+        <w:rPr>
+          <w:b/>
+        </w:rPr>
+        <w:t>tiền − còn nợ</w:t>
+      </w:r>
+      <w:r>
+        <w:t xml:space="preserve">. Lý do: thu sau bằng TKN thì bên anh để </w:t>
+      </w:r>
+      <w:r>
+        <w:rPr>
+          <w:rFonts w:ascii="Consolas" w:hAnsi="Consolas"/>
+          <w:sz w:val="19"/>
+        </w:rPr>
+        <w:t>RETK_MONEYPAID = 0</w:t>
+      </w:r>
+      <w:r>
+        <w:t xml:space="preserve"> (chỉ là tiền trả lúc chốt phiếu bán), chỉ </w:t>
+      </w:r>
+      <w:r>
+        <w:rPr>
+          <w:rFonts w:ascii="Consolas" w:hAnsi="Consolas"/>
+          <w:sz w:val="19"/>
+        </w:rPr>
+        <w:t>RCTD_DEBTMONEY</w:t>
+      </w:r>
+      <w:r>
+        <w:t xml:space="preserve"> về 0; đọc thẳng </w:t>
+      </w:r>
+      <w:r>
+        <w:rPr>
+          <w:rFonts w:ascii="Consolas" w:hAnsi="Consolas"/>
+          <w:sz w:val="19"/>
+        </w:rPr>
+        <w:t>RETK_MONEYPAID</w:t>
+      </w:r>
+      <w:r>
+        <w:t xml:space="preserve"> thì ra "Đã thu 0 · Còn lại 0", lệch </w:t>
+      </w:r>
+      <w:r>
+        <w:rPr>
+          <w:rFonts w:ascii="Consolas" w:hAnsi="Consolas"/>
+          <w:sz w:val="19"/>
+        </w:rPr>
+        <w:t>Summary.TotalCollected</w:t>
+      </w:r>
+      <w:r>
+        <w:t>. Thiếu số thì giữ số bên anh gửi.</w:t>
       </w:r>
     </w:p>
     <w:p>
@@ -8984,16 +9843,101 @@
         <w:pStyle w:val="ListBullet"/>
       </w:pPr>
       <w:r>
-        <w:t xml:space="preserve">Công nợ khách </w:t>
-      </w:r>
-      <w:r>
         <w:rPr>
           <w:b/>
         </w:rPr>
-        <w:t>chỉ còn ở hệ anh</w:t>
-      </w:r>
-      <w:r>
-        <w:t>. Số hoá đơn / đã thu trên KT tạm là số thử.</w:t>
+        <w:t>Trạng thái DO</w:t>
+      </w:r>
+      <w:r>
+        <w:t xml:space="preserve"> = </w:t>
+      </w:r>
+      <w:r>
+        <w:rPr>
+          <w:rFonts w:ascii="Consolas" w:hAnsi="Consolas"/>
+          <w:sz w:val="19"/>
+        </w:rPr>
+        <w:t>services/de_nghi_thu.py</w:t>
+      </w:r>
+      <w:r>
+        <w:t xml:space="preserve"> </w:t>
+      </w:r>
+      <w:r>
+        <w:rPr>
+          <w:rFonts w:ascii="Consolas" w:hAnsi="Consolas"/>
+          <w:sz w:val="19"/>
+        </w:rPr>
+        <w:t>ap_thu</w:t>
+      </w:r>
+      <w:r>
+        <w:t xml:space="preserve">: lấy dòng nợ cùng </w:t>
+      </w:r>
+      <w:r>
+        <w:rPr>
+          <w:rFonts w:ascii="Consolas" w:hAnsi="Consolas"/>
+          <w:sz w:val="19"/>
+        </w:rPr>
+        <w:t>OrderCode</w:t>
+      </w:r>
+      <w:r>
+        <w:t xml:space="preserve"> với SO → </w:t>
+      </w:r>
+      <w:r>
+        <w:rPr>
+          <w:rFonts w:ascii="Consolas" w:hAnsi="Consolas"/>
+          <w:sz w:val="19"/>
+        </w:rPr>
+        <w:t>thu_tong</w:t>
+      </w:r>
+      <w:r>
+        <w:t xml:space="preserve">, </w:t>
+      </w:r>
+      <w:r>
+        <w:rPr>
+          <w:rFonts w:ascii="Consolas" w:hAnsi="Consolas"/>
+          <w:sz w:val="19"/>
+        </w:rPr>
+        <w:t>thu_da_thu</w:t>
+      </w:r>
+      <w:r>
+        <w:t xml:space="preserve">, </w:t>
+      </w:r>
+      <w:r>
+        <w:rPr>
+          <w:rFonts w:ascii="Consolas" w:hAnsi="Consolas"/>
+          <w:sz w:val="19"/>
+        </w:rPr>
+        <w:t>thu_con_no</w:t>
+      </w:r>
+      <w:r>
+        <w:t xml:space="preserve">; còn nợ ≤ nửa xu → </w:t>
+      </w:r>
+      <w:r>
+        <w:rPr>
+          <w:b/>
+        </w:rPr>
+        <w:t>"đã thu"</w:t>
+      </w:r>
+      <w:r>
+        <w:t xml:space="preserve">; đã thu &gt; nửa xu → </w:t>
+      </w:r>
+      <w:r>
+        <w:rPr>
+          <w:b/>
+        </w:rPr>
+        <w:t>"thu một phần"</w:t>
+      </w:r>
+      <w:r>
+        <w:t xml:space="preserve">; còn lại "chưa thu". SO không còn trong danh sách nợ mà còn trong </w:t>
+      </w:r>
+      <w:r>
+        <w:rPr>
+          <w:rFonts w:ascii="Consolas" w:hAnsi="Consolas"/>
+          <w:sz w:val="19"/>
+        </w:rPr>
+        <w:t>Orders</w:t>
+      </w:r>
+      <w:r>
+        <w:t xml:space="preserve"> của khách → "đã thu" đủ. Không thấy ở cả hai → giữ "đã tạo SO".</w:t>
       </w:r>
     </w:p>
     <w:p>
@@ -9001,37 +9945,95 @@
         <w:pStyle w:val="ListBullet"/>
       </w:pPr>
       <w:r>
-        <w:t xml:space="preserve">Khối </w:t>
+        <w:t xml:space="preserve">Đọc lúc bấm </w:t>
+      </w:r>
+      <w:r>
+        <w:rPr>
+          <w:b/>
+        </w:rPr>
+        <w:t>Cập nhật</w:t>
+      </w:r>
+      <w:r>
+        <w:t xml:space="preserve"> ở </w:t>
+      </w:r>
+      <w:r>
+        <w:rPr>
+          <w:b/>
+        </w:rPr>
+        <w:t>Phiếu đề nghị thu</w:t>
+      </w:r>
+      <w:r>
+        <w:t xml:space="preserve"> (</w:t>
       </w:r>
       <w:r>
         <w:rPr>
           <w:rFonts w:ascii="Consolas" w:hAnsi="Consolas"/>
           <w:sz w:val="19"/>
         </w:rPr>
-        <w:t>Debts</w:t>
-      </w:r>
-      <w:r>
-        <w:t xml:space="preserve">, </w:t>
-      </w:r>
-      <w:r>
-        <w:rPr>
-          <w:rFonts w:ascii="Consolas" w:hAnsi="Consolas"/>
-          <w:sz w:val="19"/>
-        </w:rPr>
-        <w:t>Collections</w:t>
-      </w:r>
-      <w:r>
-        <w:t xml:space="preserve"> của </w:t>
-      </w:r>
-      <w:r>
-        <w:rPr>
-          <w:rFonts w:ascii="Consolas" w:hAnsi="Consolas"/>
-          <w:sz w:val="19"/>
-        </w:rPr>
-        <w:t>customer-detail</w:t>
-      </w:r>
-      <w:r>
-        <w:t xml:space="preserve"> là dynamic: bên EPL đối chiếu với thân trả về thật (đang làm).</w:t>
+        <w:t>doc_thu_tune</w:t>
+      </w:r>
+      <w:r>
+        <w:t>, theo từng khách, một khách tối đa một lần mỗi 60 giây).</w:t>
+      </w:r>
+    </w:p>
+    <w:p>
+      <w:pPr>
+        <w:pStyle w:val="ListBullet"/>
+      </w:pPr>
+      <w:r>
+        <w:t xml:space="preserve">Màn Khách hàng → tab Công nợ có khối </w:t>
+      </w:r>
+      <w:r>
+        <w:rPr>
+          <w:b/>
+        </w:rPr>
+        <w:t>"Công nợ bên hệ kế toán"</w:t>
+      </w:r>
+      <w:r>
+        <w:t xml:space="preserve">: tổng nợ, đã thu, quá hạn, tuổi nợ, từng SO còn nợ. </w:t>
+      </w:r>
+      <w:r>
+        <w:rPr>
+          <w:b/>
+        </w:rPr>
+        <w:t>Chỉ xem</w:t>
+      </w:r>
+      <w:r>
+        <w:t>.</w:t>
+      </w:r>
+    </w:p>
+    <w:p>
+      <w:pPr>
+        <w:pStyle w:val="ListBullet"/>
+      </w:pPr>
+      <w:r>
+        <w:t xml:space="preserve">Công nợ khách </w:t>
+      </w:r>
+      <w:r>
+        <w:rPr>
+          <w:b/>
+        </w:rPr>
+        <w:t>chỉ còn ở hệ anh</w:t>
+      </w:r>
+      <w:r>
+        <w:t>. Số hoá đơn / đã thu trên KT tạm là số thử.</w:t>
+      </w:r>
+    </w:p>
+    <w:p>
+      <w:pPr>
+        <w:pStyle w:val="ListBullet"/>
+      </w:pPr>
+      <w:r>
+        <w:t xml:space="preserve">KB-AZ: hai SO 164, 165 thu đủ qua TKN → bên em hai DO </w:t>
+      </w:r>
+      <w:r>
+        <w:rPr>
+          <w:b/>
+        </w:rPr>
+        <w:t>Đã thu đủ</w:t>
+      </w:r>
+      <w:r>
+        <w:t>, khối công nợ đã thu 1.248,35 USD (mục 9.5).</w:t>
       </w:r>
     </w:p>
     <w:p>
@@ -12887,7 +13889,66 @@
         <w:t>Message</w:t>
       </w:r>
       <w:r>
-        <w:t xml:space="preserve"> hiện lên màn.</w:t>
+        <w:t xml:space="preserve"> hiện lên màn. Xếp lỗi theo </w:t>
+      </w:r>
+      <w:r>
+        <w:rPr>
+          <w:b/>
+        </w:rPr>
+        <w:t>mã thật</w:t>
+      </w:r>
+      <w:r>
+        <w:t xml:space="preserve"> (</w:t>
+      </w:r>
+      <w:r>
+        <w:rPr>
+          <w:rFonts w:ascii="Consolas" w:hAnsi="Consolas"/>
+          <w:sz w:val="19"/>
+        </w:rPr>
+        <w:t>3d4ba03</w:t>
+      </w:r>
+      <w:r>
+        <w:t xml:space="preserve">): </w:t>
+      </w:r>
+      <w:r>
+        <w:rPr>
+          <w:rFonts w:ascii="Consolas" w:hAnsi="Consolas"/>
+          <w:sz w:val="19"/>
+        </w:rPr>
+        <w:t>ErrorDetail.ErrorCode</w:t>
+      </w:r>
+      <w:r>
+        <w:t xml:space="preserve"> trước, rồi </w:t>
+      </w:r>
+      <w:r>
+        <w:rPr>
+          <w:rFonts w:ascii="Consolas" w:hAnsi="Consolas"/>
+          <w:sz w:val="19"/>
+        </w:rPr>
+        <w:t>Code</w:t>
+      </w:r>
+      <w:r>
+        <w:t xml:space="preserve"> trong thân (lỗi về HTTP 200 kèm </w:t>
+      </w:r>
+      <w:r>
+        <w:rPr>
+          <w:rFonts w:ascii="Consolas" w:hAnsi="Consolas"/>
+          <w:sz w:val="19"/>
+        </w:rPr>
+        <w:t>Success:false</w:t>
+      </w:r>
+      <w:r>
+        <w:t xml:space="preserve">), rồi mã HTTP; chỉ đoán theo chữ của câu lỗi khi không có </w:t>
+      </w:r>
+      <w:r>
+        <w:rPr>
+          <w:rFonts w:ascii="Consolas" w:hAnsi="Consolas"/>
+          <w:sz w:val="19"/>
+        </w:rPr>
+        <w:t>ErrorCode</w:t>
+      </w:r>
+      <w:r>
+        <w:t>.</w:t>
       </w:r>
     </w:p>
     <w:tbl>
@@ -12933,7 +13994,7 @@
               <w:rPr>
                 <w:b/>
               </w:rPr>
-              <w:t>LAO làm</w:t>
+              <w:t>LAO làm (mã lỗi bên em)</w:t>
             </w:r>
           </w:p>
         </w:tc>
@@ -13052,7 +14113,7 @@
               <w:t>cho_gui</w:t>
             </w:r>
             <w:r>
-              <w:t xml:space="preserve">, mã lỗi </w:t>
+              <w:t xml:space="preserve">, </w:t>
             </w:r>
             <w:r>
               <w:rPr>
@@ -13276,7 +14337,7 @@
           <w:p>
             <w:r/>
             <w:r>
-              <w:t xml:space="preserve">403 </w:t>
+              <w:t xml:space="preserve">403 · </w:t>
             </w:r>
             <w:r>
               <w:rPr>
@@ -13294,7 +14355,14 @@
           <w:p>
             <w:r/>
             <w:r>
-              <w:t xml:space="preserve">giữ lỗi: thêm </w:t>
+              <w:rPr>
+                <w:rFonts w:ascii="Consolas" w:hAnsi="Consolas"/>
+                <w:sz w:val="19"/>
+              </w:rPr>
+              <w:t>KHONG_DUOC_PHEP</w:t>
+            </w:r>
+            <w:r>
+              <w:t xml:space="preserve">: thêm </w:t>
             </w:r>
             <w:r>
               <w:rPr>
@@ -13312,6 +14380,9 @@
                 <w:sz w:val="19"/>
               </w:rPr>
               <w:t>AllowedUserIds</w:t>
+            </w:r>
+            <w:r>
+              <w:t>; Gửi hết dừng</w:t>
             </w:r>
           </w:p>
         </w:tc>
@@ -13324,17 +14395,17 @@
           <w:p>
             <w:r/>
             <w:r>
-              <w:t xml:space="preserve">mất mạng · hết giờ · 5xx (gồm 503 </w:t>
-            </w:r>
-            <w:r>
-              <w:rPr>
-                <w:rFonts w:ascii="Consolas" w:hAnsi="Consolas"/>
-                <w:sz w:val="19"/>
-              </w:rPr>
-              <w:t>_DISABLED</w:t>
-            </w:r>
-            <w:r>
-              <w:t xml:space="preserve">, </w:t>
+              <w:t xml:space="preserve">503 </w:t>
+            </w:r>
+            <w:r>
+              <w:rPr>
+                <w:rFonts w:ascii="Consolas" w:hAnsi="Consolas"/>
+                <w:sz w:val="19"/>
+              </w:rPr>
+              <w:t>LOGISTICS_JOURNAL_DISABLED</w:t>
+            </w:r>
+            <w:r>
+              <w:t xml:space="preserve"> · </w:t>
             </w:r>
             <w:r>
               <w:rPr>
@@ -13344,7 +14415,7 @@
               <w:t>_CONFIG_REQUIRED</w:t>
             </w:r>
             <w:r>
-              <w:t xml:space="preserve">, </w:t>
+              <w:t xml:space="preserve"> · </w:t>
             </w:r>
             <w:r>
               <w:rPr>
@@ -13354,24 +14425,13 @@
               <w:t>_SCRIPT_REQUIRED</w:t>
             </w:r>
             <w:r>
-              <w:t xml:space="preserve">, </w:t>
-            </w:r>
-            <w:r>
-              <w:rPr>
-                <w:rFonts w:ascii="Consolas" w:hAnsi="Consolas"/>
-                <w:sz w:val="19"/>
-              </w:rPr>
-              <w:t>52510</w:t>
-            </w:r>
-            <w:r>
-              <w:t xml:space="preserve"> đang xử lý, </w:t>
-            </w:r>
-            <w:r>
-              <w:rPr>
-                <w:rFonts w:ascii="Consolas" w:hAnsi="Consolas"/>
-                <w:sz w:val="19"/>
-              </w:rPr>
-              <w:t>_DATABASE_ERROR</w:t>
+              <w:t xml:space="preserve"> (bên anh chưa bật / chưa áp script — </w:t>
+            </w:r>
+            <w:r>
+              <w:rPr>
+                <w:b/>
+              </w:rPr>
+              <w:t>đang gặp lúc này</w:t>
             </w:r>
             <w:r>
               <w:t>)</w:t>
@@ -13385,35 +14445,24 @@
           <w:p>
             <w:r/>
             <w:r>
-              <w:t xml:space="preserve">kết quả </w:t>
-            </w:r>
-            <w:r>
-              <w:rPr>
-                <w:b/>
-              </w:rPr>
-              <w:t>chưa rõ</w:t>
-            </w:r>
-            <w:r>
-              <w:t xml:space="preserve">: lần sau </w:t>
-            </w:r>
-            <w:r>
-              <w:rPr>
-                <w:b/>
-              </w:rPr>
-              <w:t>hỏi lại</w:t>
-            </w:r>
-            <w:r>
-              <w:t xml:space="preserve"> </w:t>
-            </w:r>
-            <w:r>
-              <w:rPr>
-                <w:rFonts w:ascii="Consolas" w:hAnsi="Consolas"/>
-                <w:sz w:val="19"/>
-              </w:rPr>
-              <w:t>GET …/{SourceRef}</w:t>
-            </w:r>
-            <w:r>
-              <w:t xml:space="preserve"> trước; bên anh có rồi thì nhận số đó, chưa có thì gửi lại cùng SourceRef</w:t>
+              <w:rPr>
+                <w:rFonts w:ascii="Consolas" w:hAnsi="Consolas"/>
+                <w:sz w:val="19"/>
+              </w:rPr>
+              <w:t>BEN_DO_CHUA_BAT</w:t>
+            </w:r>
+            <w:r>
+              <w:t xml:space="preserve">: bản giữ </w:t>
+            </w:r>
+            <w:r>
+              <w:rPr>
+                <w:rFonts w:ascii="Consolas" w:hAnsi="Consolas"/>
+                <w:sz w:val="19"/>
+              </w:rPr>
+              <w:t>cho_gui</w:t>
+            </w:r>
+            <w:r>
+              <w:t>, Gửi hết dừng ngay; bật xong bấm Gửi hết</w:t>
             </w:r>
           </w:p>
         </w:tc>
@@ -13426,7 +14475,47 @@
           <w:p>
             <w:r/>
             <w:r>
-              <w:t>404 ở POST</w:t>
+              <w:t>mất mạng · hết giờ · 5xx khác (</w:t>
+            </w:r>
+            <w:r>
+              <w:rPr>
+                <w:rFonts w:ascii="Consolas" w:hAnsi="Consolas"/>
+                <w:sz w:val="19"/>
+              </w:rPr>
+              <w:t>52510</w:t>
+            </w:r>
+            <w:r>
+              <w:t xml:space="preserve"> đang xử lý, </w:t>
+            </w:r>
+            <w:r>
+              <w:rPr>
+                <w:rFonts w:ascii="Consolas" w:hAnsi="Consolas"/>
+                <w:sz w:val="19"/>
+              </w:rPr>
+              <w:t>_DATABASE_ERROR</w:t>
+            </w:r>
+            <w:r>
+              <w:t xml:space="preserve">), hoặc HTTP 200 kèm </w:t>
+            </w:r>
+            <w:r>
+              <w:rPr>
+                <w:rFonts w:ascii="Consolas" w:hAnsi="Consolas"/>
+                <w:sz w:val="19"/>
+              </w:rPr>
+              <w:t>Success:false</w:t>
+            </w:r>
+            <w:r>
+              <w:t xml:space="preserve">, </w:t>
+            </w:r>
+            <w:r>
+              <w:rPr>
+                <w:rFonts w:ascii="Consolas" w:hAnsi="Consolas"/>
+                <w:sz w:val="19"/>
+              </w:rPr>
+              <w:t>Code</w:t>
+            </w:r>
+            <w:r>
+              <w:t xml:space="preserve"> 500</w:t>
             </w:r>
           </w:p>
         </w:tc>
@@ -13437,14 +14526,55 @@
           <w:p>
             <w:r/>
             <w:r>
-              <w:rPr>
-                <w:rFonts w:ascii="Consolas" w:hAnsi="Consolas"/>
-                <w:sz w:val="19"/>
-              </w:rPr>
-              <w:t>KHONG_CO_DUONG</w:t>
-            </w:r>
-            <w:r>
-              <w:t>: API chưa có bản mới; Gửi hết dừng</w:t>
+              <w:t xml:space="preserve">kết quả </w:t>
+            </w:r>
+            <w:r>
+              <w:rPr>
+                <w:b/>
+              </w:rPr>
+              <w:t>chưa rõ</w:t>
+            </w:r>
+            <w:r>
+              <w:t xml:space="preserve"> (</w:t>
+            </w:r>
+            <w:r>
+              <w:rPr>
+                <w:rFonts w:ascii="Consolas" w:hAnsi="Consolas"/>
+                <w:sz w:val="19"/>
+              </w:rPr>
+              <w:t>KHONG_GOI_DUOC</w:t>
+            </w:r>
+            <w:r>
+              <w:t xml:space="preserve"> / </w:t>
+            </w:r>
+            <w:r>
+              <w:rPr>
+                <w:rFonts w:ascii="Consolas" w:hAnsi="Consolas"/>
+                <w:sz w:val="19"/>
+              </w:rPr>
+              <w:t>HTTP_5XX</w:t>
+            </w:r>
+            <w:r>
+              <w:t xml:space="preserve">): lần sau </w:t>
+            </w:r>
+            <w:r>
+              <w:rPr>
+                <w:b/>
+              </w:rPr>
+              <w:t>hỏi lại</w:t>
+            </w:r>
+            <w:r>
+              <w:t xml:space="preserve"> </w:t>
+            </w:r>
+            <w:r>
+              <w:rPr>
+                <w:rFonts w:ascii="Consolas" w:hAnsi="Consolas"/>
+                <w:sz w:val="19"/>
+              </w:rPr>
+              <w:t>GET …/{SourceRef}</w:t>
+            </w:r>
+            <w:r>
+              <w:t xml:space="preserve"> trước; bên anh có rồi thì nhận số đó, chưa có thì gửi lại cùng SourceRef</w:t>
             </w:r>
           </w:p>
         </w:tc>
@@ -13457,6 +14587,77 @@
           <w:p>
             <w:r/>
             <w:r>
+              <w:t>404 ở POST</w:t>
+            </w:r>
+          </w:p>
+        </w:tc>
+        <w:tc>
+          <w:tcPr>
+            <w:tcW w:type="dxa" w:w="4320"/>
+          </w:tcPr>
+          <w:p>
+            <w:r/>
+            <w:r>
+              <w:rPr>
+                <w:rFonts w:ascii="Consolas" w:hAnsi="Consolas"/>
+                <w:sz w:val="19"/>
+              </w:rPr>
+              <w:t>KHONG_CO_DUONG</w:t>
+            </w:r>
+            <w:r>
+              <w:t>: API chưa có bản mới; Gửi hết dừng</w:t>
+            </w:r>
+          </w:p>
+        </w:tc>
+      </w:tr>
+      <w:tr>
+        <w:tc>
+          <w:tcPr>
+            <w:tcW w:type="dxa" w:w="4320"/>
+          </w:tcPr>
+          <w:p>
+            <w:r/>
+            <w:r>
+              <w:t xml:space="preserve">GET 404 kèm </w:t>
+            </w:r>
+            <w:r>
+              <w:rPr>
+                <w:rFonts w:ascii="Consolas" w:hAnsi="Consolas"/>
+                <w:sz w:val="19"/>
+              </w:rPr>
+              <w:t>ErrorCode = JOURNAL_ENTRY_NOT_FOUND</w:t>
+            </w:r>
+          </w:p>
+        </w:tc>
+        <w:tc>
+          <w:tcPr>
+            <w:tcW w:type="dxa" w:w="4320"/>
+          </w:tcPr>
+          <w:p>
+            <w:r/>
+            <w:r>
+              <w:t xml:space="preserve">bên anh </w:t>
+            </w:r>
+            <w:r>
+              <w:rPr>
+                <w:b/>
+              </w:rPr>
+              <w:t>chưa có</w:t>
+            </w:r>
+            <w:r>
+              <w:t xml:space="preserve"> chứng từ → gửi. GET 404 không kèm mã đó = chưa có đường, không coi là "không có"</w:t>
+            </w:r>
+          </w:p>
+        </w:tc>
+      </w:tr>
+      <w:tr>
+        <w:tc>
+          <w:tcPr>
+            <w:tcW w:type="dxa" w:w="4320"/>
+          </w:tcPr>
+          <w:p>
+            <w:r/>
+            <w:r>
               <w:t xml:space="preserve">HTTP 200 kèm </w:t>
             </w:r>
             <w:r>
@@ -13467,7 +14668,17 @@
               <w:t>Success:false</w:t>
             </w:r>
             <w:r>
-              <w:t xml:space="preserve"> (JSON sai kiểu bị bộ lọc chung bắt)</w:t>
+              <w:t xml:space="preserve">, </w:t>
+            </w:r>
+            <w:r>
+              <w:rPr>
+                <w:rFonts w:ascii="Consolas" w:hAnsi="Consolas"/>
+                <w:sz w:val="19"/>
+              </w:rPr>
+              <w:t>Code</w:t>
+            </w:r>
+            <w:r>
+              <w:t xml:space="preserve"> 400 (JSON sai kiểu bị bộ lọc chung bắt)</w:t>
             </w:r>
           </w:p>
         </w:tc>
@@ -13478,7 +14689,7 @@
           <w:p>
             <w:r/>
             <w:r>
-              <w:t>coi là lỗi</w:t>
+              <w:t>coi là lỗi dữ liệu</w:t>
             </w:r>
           </w:p>
         </w:tc>
@@ -13724,6 +14935,49 @@
           <w:p>
             <w:r/>
             <w:r>
+              <w:t>404</w:t>
+            </w:r>
+          </w:p>
+        </w:tc>
+        <w:tc>
+          <w:tcPr>
+            <w:tcW w:type="dxa" w:w="4320"/>
+          </w:tcPr>
+          <w:p>
+            <w:r/>
+            <w:r>
+              <w:t xml:space="preserve">bên anh không trả 404 khi gỡ → 404 = </w:t>
+            </w:r>
+            <w:r>
+              <w:rPr>
+                <w:b/>
+              </w:rPr>
+              <w:t>chưa có đường</w:t>
+            </w:r>
+            <w:r>
+              <w:t xml:space="preserve">, giữ </w:t>
+            </w:r>
+            <w:r>
+              <w:rPr>
+                <w:rFonts w:ascii="Consolas" w:hAnsi="Consolas"/>
+                <w:sz w:val="19"/>
+              </w:rPr>
+              <w:t>can_dao</w:t>
+            </w:r>
+            <w:r>
+              <w:t xml:space="preserve"> (không coi là đã gỡ)</w:t>
+            </w:r>
+          </w:p>
+        </w:tc>
+      </w:tr>
+      <w:tr>
+        <w:tc>
+          <w:tcPr>
+            <w:tcW w:type="dxa" w:w="4320"/>
+          </w:tcPr>
+          <w:p>
+            <w:r/>
+            <w:r>
               <w:t>lỗi mạng / 5xx</w:t>
             </w:r>
           </w:p>
@@ -13853,7 +15107,7 @@
         <w:t>52512</w:t>
       </w:r>
       <w:r>
-        <w:t>, gỡ lần hai, mất phản hồi). Lần chạy thật đầu tiên sau khi áp script: đối chiếu sổ cái, kỳ, số chứng từ.</w:t>
+        <w:t>, gỡ lần hai, mất phản hồi, xếp lỗi theo mã thật — 36/36). Lần chạy thật đầu tiên sau khi áp script: đối chiếu sổ cái, kỳ, số chứng từ.</w:t>
       </w:r>
     </w:p>
     <w:p>
@@ -16588,7 +17842,7 @@
           <w:p>
             <w:r/>
             <w:r>
-              <w:t>8–10</w:t>
+              <w:t>8</w:t>
             </w:r>
           </w:p>
         </w:tc>
@@ -16599,7 +17853,7 @@
           <w:p>
             <w:r/>
             <w:r>
-              <w:t>Hoá đơn, thu tiền khách, cấn trừ</w:t>
+              <w:t>Thu tiền khách</w:t>
             </w:r>
           </w:p>
         </w:tc>
@@ -16610,8 +17864,56 @@
           <w:p>
             <w:r/>
             <w:r>
+              <w:rPr>
+                <w:b/>
+              </w:rPr>
               <w:t>kế toán bên anh</w:t>
             </w:r>
+            <w:r>
+              <w:t xml:space="preserve"> · </w:t>
+            </w:r>
+            <w:r>
+              <w:rPr>
+                <w:b/>
+              </w:rPr>
+              <w:t>Chi tiết công nợ khách hàng</w:t>
+            </w:r>
+            <w:r>
+              <w:t xml:space="preserve"> → </w:t>
+            </w:r>
+            <w:r>
+              <w:rPr>
+                <w:b/>
+              </w:rPr>
+              <w:t>Tạo phiếu thu</w:t>
+            </w:r>
+            <w:r>
+              <w:t xml:space="preserve"> → </w:t>
+            </w:r>
+            <w:r>
+              <w:rPr>
+                <w:b/>
+              </w:rPr>
+              <w:t>Xác nhận thu nợ</w:t>
+            </w:r>
+            <w:r>
+              <w:t xml:space="preserve">, rồi ghi sổ phiếu thu; bên em KT Thu/Chi bấm </w:t>
+            </w:r>
+            <w:r>
+              <w:rPr>
+                <w:b/>
+              </w:rPr>
+              <w:t>Cập nhật</w:t>
+            </w:r>
+            <w:r>
+              <w:t xml:space="preserve"> ở </w:t>
+            </w:r>
+            <w:r>
+              <w:rPr>
+                <w:b/>
+              </w:rPr>
+              <w:t>Phiếu đề nghị thu</w:t>
+            </w:r>
           </w:p>
         </w:tc>
         <w:tc>
@@ -16625,18 +17927,112 @@
                 <w:rFonts w:ascii="Consolas" w:hAnsi="Consolas"/>
                 <w:sz w:val="19"/>
               </w:rPr>
+              <w:t>PT</w:t>
+            </w:r>
+          </w:p>
+        </w:tc>
+        <w:tc>
+          <w:tcPr>
+            <w:tcW w:type="dxa" w:w="1440"/>
+          </w:tcPr>
+          <w:p>
+            <w:r/>
+            <w:r>
+              <w:rPr>
+                <w:rFonts w:ascii="Consolas" w:hAnsi="Consolas"/>
+                <w:sz w:val="19"/>
+              </w:rPr>
+              <w:t>sales/debt/collection-upsert</w:t>
+            </w:r>
+            <w:r>
+              <w:t xml:space="preserve"> (TKN, WEB của anh gọi) · LAO đọc </w:t>
+            </w:r>
+            <w:r>
+              <w:rPr>
+                <w:b/>
+              </w:rPr>
+              <w:t>A5</w:t>
+            </w:r>
+          </w:p>
+        </w:tc>
+        <w:tc>
+          <w:tcPr>
+            <w:tcW w:type="dxa" w:w="1440"/>
+          </w:tcPr>
+          <w:p>
+            <w:r/>
+            <w:r>
+              <w:t>phiếu thu nợ TKN + công nợ giảm (</w:t>
+            </w:r>
+            <w:r>
+              <w:rPr>
+                <w:rFonts w:ascii="Consolas" w:hAnsi="Consolas"/>
+                <w:sz w:val="19"/>
+              </w:rPr>
+              <w:t>RESCUSTOMERSDEBT</w:t>
+            </w:r>
+            <w:r>
+              <w:t xml:space="preserve">) + phiếu thu </w:t>
+            </w:r>
+            <w:r>
+              <w:rPr>
+                <w:b/>
+              </w:rPr>
+              <w:t>CMR 17 "Thu khác"</w:t>
+            </w:r>
+            <w:r>
+              <w:t xml:space="preserve"> Nợ 1021 / Có 1211; LAO: DO "đã thu đủ" / "thu một phần"</w:t>
+            </w:r>
+          </w:p>
+        </w:tc>
+      </w:tr>
+      <w:tr>
+        <w:tc>
+          <w:tcPr>
+            <w:tcW w:type="dxa" w:w="1440"/>
+          </w:tcPr>
+          <w:p>
+            <w:r/>
+            <w:r>
+              <w:t>9–10</w:t>
+            </w:r>
+          </w:p>
+        </w:tc>
+        <w:tc>
+          <w:tcPr>
+            <w:tcW w:type="dxa" w:w="1440"/>
+          </w:tcPr>
+          <w:p>
+            <w:r/>
+            <w:r>
+              <w:t>Hoá đơn, cấn trừ</w:t>
+            </w:r>
+          </w:p>
+        </w:tc>
+        <w:tc>
+          <w:tcPr>
+            <w:tcW w:type="dxa" w:w="1440"/>
+          </w:tcPr>
+          <w:p>
+            <w:r/>
+            <w:r>
+              <w:t>kế toán bên anh</w:t>
+            </w:r>
+          </w:p>
+        </w:tc>
+        <w:tc>
+          <w:tcPr>
+            <w:tcW w:type="dxa" w:w="1440"/>
+          </w:tcPr>
+          <w:p>
+            <w:r/>
+            <w:r>
+              <w:rPr>
+                <w:rFonts w:ascii="Consolas" w:hAnsi="Consolas"/>
+                <w:sz w:val="19"/>
+              </w:rPr>
               <w:t>HD</w:t>
             </w:r>
-            <w:r>
-              <w:t xml:space="preserve">, </w:t>
-            </w:r>
-            <w:r>
-              <w:rPr>
-                <w:rFonts w:ascii="Consolas" w:hAnsi="Consolas"/>
-                <w:sz w:val="19"/>
-              </w:rPr>
-              <w:t>PT</w:t>
-            </w:r>
           </w:p>
         </w:tc>
         <w:tc>
@@ -16646,13 +18042,7 @@
           <w:p>
             <w:r/>
             <w:r>
-              <w:t xml:space="preserve">việc của hệ anh, từ SO; LAO đọc </w:t>
-            </w:r>
-            <w:r>
-              <w:rPr>
-                <w:b/>
-              </w:rPr>
-              <w:t>A5</w:t>
+              <w:t>việc của hệ anh, từ SO</w:t>
             </w:r>
           </w:p>
         </w:tc>
@@ -17696,13 +19086,76 @@
                 <w:rFonts w:ascii="Consolas" w:hAnsi="Consolas"/>
                 <w:sz w:val="19"/>
               </w:rPr>
-              <w:t>875a0cf</w:t>
+              <w:t>191ab29</w:t>
+            </w:r>
+            <w:r>
+              <w:t>); KB-AZ đã đi thật một chuyến THU-KBAZ (mục 9)</w:t>
+            </w:r>
+          </w:p>
+        </w:tc>
+        <w:tc>
+          <w:tcPr>
+            <w:tcW w:type="dxa" w:w="2880"/>
+          </w:tcPr>
+          <w:p>
+            <w:r/>
+            <w:r>
+              <w:t>bên EPL làm (đang làm)</w:t>
+            </w:r>
+          </w:p>
+        </w:tc>
+      </w:tr>
+      <w:tr>
+        <w:tc>
+          <w:tcPr>
+            <w:tcW w:type="dxa" w:w="2880"/>
+          </w:tcPr>
+          <w:p>
+            <w:r/>
+            <w:r>
+              <w:t>9</w:t>
+            </w:r>
+          </w:p>
+        </w:tc>
+        <w:tc>
+          <w:tcPr>
+            <w:tcW w:type="dxa" w:w="2880"/>
+          </w:tcPr>
+          <w:p>
+            <w:r/>
+            <w:r>
+              <w:rPr>
+                <w:b/>
+              </w:rPr>
+              <w:t>Hộp Tạo phiếu thu (WEB của anh) gửi tỷ giá cứng 1</w:t>
+            </w:r>
+            <w:r>
+              <w:t>, ô tài khoản tiền chỉ có nội tệ → SO USD ghi thành Kíp (mục 1.5)</w:t>
+            </w:r>
+          </w:p>
+        </w:tc>
+        <w:tc>
+          <w:tcPr>
+            <w:tcW w:type="dxa" w:w="2880"/>
+          </w:tcPr>
+          <w:p>
+            <w:r/>
+            <w:r>
+              <w:t>bên EPL làm (</w:t>
+            </w:r>
+            <w:r>
+              <w:rPr>
+                <w:b/>
+              </w:rPr>
+              <w:t>đang sửa</w:t>
             </w:r>
             <w:r>
               <w:t>)</w:t>
             </w:r>
           </w:p>
         </w:tc>
+      </w:tr>
+      <w:tr>
         <w:tc>
           <w:tcPr>
             <w:tcW w:type="dxa" w:w="2880"/>
@@ -17710,7 +19163,54 @@
           <w:p>
             <w:r/>
             <w:r>
-              <w:t>bên EPL làm (đang làm)</w:t>
+              <w:t>10</w:t>
+            </w:r>
+          </w:p>
+        </w:tc>
+        <w:tc>
+          <w:tcPr>
+            <w:tcW w:type="dxa" w:w="2880"/>
+          </w:tcPr>
+          <w:p>
+            <w:r/>
+            <w:r>
+              <w:rPr>
+                <w:b/>
+              </w:rPr>
+              <w:t>Mọi SO cùng mã phiếu bán</w:t>
+            </w:r>
+            <w:r>
+              <w:t xml:space="preserve"> </w:t>
+            </w:r>
+            <w:r>
+              <w:rPr>
+                <w:rFonts w:ascii="Consolas" w:hAnsi="Consolas"/>
+                <w:sz w:val="19"/>
+              </w:rPr>
+              <w:t>Demo EPL-2-261001000</w:t>
+            </w:r>
+            <w:r>
+              <w:t xml:space="preserve"> → diễn giải phiếu thu nợ giống nhau (mục 1.5)</w:t>
+            </w:r>
+          </w:p>
+        </w:tc>
+        <w:tc>
+          <w:tcPr>
+            <w:tcW w:type="dxa" w:w="2880"/>
+          </w:tcPr>
+          <w:p>
+            <w:r/>
+            <w:r>
+              <w:t>bên EPL làm (</w:t>
+            </w:r>
+            <w:r>
+              <w:rPr>
+                <w:b/>
+              </w:rPr>
+              <w:t>đang sửa</w:t>
+            </w:r>
+            <w:r>
+              <w:t>)</w:t>
             </w:r>
           </w:p>
         </w:tc>
@@ -17836,7 +19336,7 @@
           <w:p>
             <w:r/>
             <w:r>
-              <w:t>mục 5 việc 1 (sau khi có script), 2, 3, 8; thêm nút tạo khoá bàn giao ở màn Tài khoản</w:t>
+              <w:t>mục 5 việc 1 (sau khi có script), 2, 3, 8, 9, 10; thêm nút tạo khoá bàn giao ở màn Tài khoản</w:t>
             </w:r>
           </w:p>
         </w:tc>
@@ -18082,6 +19582,183 @@
       </w:r>
       <w:r>
         <w:t>.</w:t>
+      </w:r>
+    </w:p>
+    <w:p>
+      <w:pPr>
+        <w:jc w:val="both"/>
+      </w:pPr>
+      <w:r>
+        <w:rPr>
+          <w:b/>
+        </w:rPr>
+        <w:t>Thu tiền khách và đọc lại "đã thu":</w:t>
+      </w:r>
+    </w:p>
+    <w:p>
+      <w:pPr>
+        <w:pStyle w:val="ListNumber"/>
+      </w:pPr>
+      <w:r>
+        <w:t xml:space="preserve">Bên anh (QLSX WEB): </w:t>
+      </w:r>
+      <w:r>
+        <w:rPr>
+          <w:b/>
+        </w:rPr>
+        <w:t>Danh sách công nợ</w:t>
+      </w:r>
+      <w:r>
+        <w:t xml:space="preserve"> → khách → </w:t>
+      </w:r>
+      <w:r>
+        <w:rPr>
+          <w:b/>
+        </w:rPr>
+        <w:t>Chi tiết công nợ khách hàng</w:t>
+      </w:r>
+      <w:r>
+        <w:t xml:space="preserve"> → tick dòng </w:t>
+      </w:r>
+      <w:r>
+        <w:rPr>
+          <w:rFonts w:ascii="Consolas" w:hAnsi="Consolas"/>
+          <w:sz w:val="19"/>
+        </w:rPr>
+        <w:t>TK-…</w:t>
+      </w:r>
+      <w:r>
+        <w:t xml:space="preserve"> → </w:t>
+      </w:r>
+      <w:r>
+        <w:rPr>
+          <w:b/>
+        </w:rPr>
+        <w:t>Tạo phiếu thu</w:t>
+      </w:r>
+      <w:r>
+        <w:t xml:space="preserve"> → </w:t>
+      </w:r>
+      <w:r>
+        <w:rPr>
+          <w:b/>
+        </w:rPr>
+        <w:t>Xác nhận thu nợ</w:t>
+      </w:r>
+      <w:r>
+        <w:t xml:space="preserve"> → </w:t>
+      </w:r>
+      <w:r>
+        <w:rPr>
+          <w:b/>
+        </w:rPr>
+        <w:t>Danh sách phiếu thu</w:t>
+      </w:r>
+      <w:r>
+        <w:t xml:space="preserve"> loại </w:t>
+      </w:r>
+      <w:r>
+        <w:rPr>
+          <w:b/>
+        </w:rPr>
+        <w:t>Thu khác</w:t>
+      </w:r>
+      <w:r>
+        <w:t xml:space="preserve"> → </w:t>
+      </w:r>
+      <w:r>
+        <w:rPr>
+          <w:b/>
+        </w:rPr>
+        <w:t>Ghi sổ</w:t>
+      </w:r>
+      <w:r>
+        <w:t>.</w:t>
+      </w:r>
+    </w:p>
+    <w:p>
+      <w:pPr>
+        <w:pStyle w:val="ListNumber"/>
+      </w:pPr>
+      <w:r>
+        <w:t xml:space="preserve">Bên em: </w:t>
+      </w:r>
+      <w:r>
+        <w:rPr>
+          <w:b/>
+        </w:rPr>
+        <w:t>ketoan</w:t>
+      </w:r>
+      <w:r>
+        <w:t xml:space="preserve"> → </w:t>
+      </w:r>
+      <w:r>
+        <w:rPr>
+          <w:b/>
+        </w:rPr>
+        <w:t>Phiếu đề nghị thu</w:t>
+      </w:r>
+      <w:r>
+        <w:t xml:space="preserve"> → </w:t>
+      </w:r>
+      <w:r>
+        <w:rPr>
+          <w:b/>
+        </w:rPr>
+        <w:t>Cập nhật</w:t>
+      </w:r>
+      <w:r>
+        <w:t xml:space="preserve"> → DO chuyển </w:t>
+      </w:r>
+      <w:r>
+        <w:rPr>
+          <w:b/>
+        </w:rPr>
+        <w:t>Đã thu đủ</w:t>
+      </w:r>
+      <w:r>
+        <w:t xml:space="preserve"> (thu thiếu: </w:t>
+      </w:r>
+      <w:r>
+        <w:rPr>
+          <w:b/>
+        </w:rPr>
+        <w:t>Thu một phần</w:t>
+      </w:r>
+      <w:r>
+        <w:t>).</w:t>
+      </w:r>
+    </w:p>
+    <w:p>
+      <w:pPr>
+        <w:pStyle w:val="ListNumber"/>
+      </w:pPr>
+      <w:r>
+        <w:rPr>
+          <w:b/>
+        </w:rPr>
+        <w:t>Khách hàng</w:t>
+      </w:r>
+      <w:r>
+        <w:t xml:space="preserve"> → khách → tab </w:t>
+      </w:r>
+      <w:r>
+        <w:rPr>
+          <w:b/>
+        </w:rPr>
+        <w:t>Công nợ</w:t>
+      </w:r>
+      <w:r>
+        <w:t xml:space="preserve"> → khối </w:t>
+      </w:r>
+      <w:r>
+        <w:rPr>
+          <w:b/>
+        </w:rPr>
+        <w:t>Công nợ bên hệ kế toán</w:t>
+      </w:r>
+      <w:r>
+        <w:t>: đã thu đúng tổng các lần thu.</w:t>
       </w:r>
     </w:p>
     <w:p>
@@ -23673,6 +25350,94 @@
             <w:r/>
             <w:r>
               <w:t>npm tự đổi</w:t>
+            </w:r>
+          </w:p>
+        </w:tc>
+      </w:tr>
+      <w:tr>
+        <w:tc>
+          <w:tcPr>
+            <w:tcW w:type="dxa" w:w="2880"/>
+          </w:tcPr>
+          <w:p>
+            <w:r/>
+            <w:r>
+              <w:t>WEB</w:t>
+            </w:r>
+          </w:p>
+        </w:tc>
+        <w:tc>
+          <w:tcPr>
+            <w:tcW w:type="dxa" w:w="2880"/>
+          </w:tcPr>
+          <w:p>
+            <w:r/>
+            <w:r>
+              <w:rPr>
+                <w:rFonts w:ascii="Consolas" w:hAnsi="Consolas"/>
+                <w:sz w:val="19"/>
+              </w:rPr>
+              <w:t>ACC/cm-payment-*.js</w:t>
+            </w:r>
+            <w:r>
+              <w:t xml:space="preserve">, </w:t>
+            </w:r>
+            <w:r>
+              <w:rPr>
+                <w:rFonts w:ascii="Consolas" w:hAnsi="Consolas"/>
+                <w:sz w:val="19"/>
+              </w:rPr>
+              <w:t>ACC/cm-receipt-*.js</w:t>
+            </w:r>
+            <w:r>
+              <w:t xml:space="preserve">, </w:t>
+            </w:r>
+            <w:r>
+              <w:rPr>
+                <w:rFonts w:ascii="Consolas" w:hAnsi="Consolas"/>
+                <w:sz w:val="19"/>
+              </w:rPr>
+              <w:t>ACC/cm-source-reference-modal.js</w:t>
+            </w:r>
+            <w:r>
+              <w:t xml:space="preserve">, </w:t>
+            </w:r>
+            <w:r>
+              <w:rPr>
+                <w:rFonts w:ascii="Consolas" w:hAnsi="Consolas"/>
+                <w:sz w:val="19"/>
+              </w:rPr>
+              <w:t>Localization/*.json</w:t>
+            </w:r>
+            <w:r>
+              <w:t xml:space="preserve">, </w:t>
+            </w:r>
+            <w:r>
+              <w:rPr>
+                <w:rFonts w:ascii="Consolas" w:hAnsi="Consolas"/>
+                <w:sz w:val="19"/>
+              </w:rPr>
+              <w:t>Views/Modules/Organization/Hr/Employees*</w:t>
+            </w:r>
+          </w:p>
+        </w:tc>
+        <w:tc>
+          <w:tcPr>
+            <w:tcW w:type="dxa" w:w="2880"/>
+          </w:tcPr>
+          <w:p>
+            <w:r/>
+            <w:r>
+              <w:t xml:space="preserve">bên EPL </w:t>
+            </w:r>
+            <w:r>
+              <w:rPr>
+                <w:b/>
+              </w:rPr>
+              <w:t>đang sửa</w:t>
+            </w:r>
+            <w:r>
+              <w:t>, chưa commit — ghi vào mục 8.2 khi commit</w:t>
             </w:r>
           </w:p>
         </w:tc>
@@ -25231,7 +26996,17 @@
           <w:p>
             <w:r/>
             <w:r>
-              <w:t>chủ xe của các phiếu xe thuê đã thử</w:t>
+              <w:t xml:space="preserve">chủ xe của các phiếu xe thuê đã thử; KB-AZ </w:t>
+            </w:r>
+            <w:r>
+              <w:rPr>
+                <w:rFonts w:ascii="Consolas" w:hAnsi="Consolas"/>
+                <w:sz w:val="19"/>
+              </w:rPr>
+              <w:t>EPLCX-0a073ea75bb3</w:t>
+            </w:r>
+            <w:r>
+              <w:t xml:space="preserve"> ທ້າວ ຄຳຫລ້າ</w:t>
             </w:r>
           </w:p>
         </w:tc>
@@ -25288,7 +27063,17 @@
           <w:p>
             <w:r/>
             <w:r>
-              <w:t>nhà cung cấp của bài trả nhà cung cấp</w:t>
+              <w:t xml:space="preserve">nhà cung cấp của bài trả nhà cung cấp; KB-AZ </w:t>
+            </w:r>
+            <w:r>
+              <w:rPr>
+                <w:rFonts w:ascii="Consolas" w:hAnsi="Consolas"/>
+                <w:sz w:val="19"/>
+              </w:rPr>
+              <w:t>EPLNCC-804c0e8ff1d8</w:t>
+            </w:r>
+            <w:r>
+              <w:t xml:space="preserve"> ຊີບປີງ ລາວ</w:t>
             </w:r>
           </w:p>
         </w:tc>
@@ -25349,6 +27134,19 @@
                 <w:b/>
               </w:rPr>
               <w:t>`EPLTX-THU01`</w:t>
+            </w:r>
+            <w:r>
+              <w:t xml:space="preserve">; KB-AZ </w:t>
+            </w:r>
+            <w:r>
+              <w:rPr>
+                <w:rFonts w:ascii="Consolas" w:hAnsi="Consolas"/>
+                <w:sz w:val="19"/>
+              </w:rPr>
+              <w:t>EPLTX-a6313dd63966</w:t>
+            </w:r>
+            <w:r>
+              <w:t xml:space="preserve"> ທ້າວ ບຸນມີ</w:t>
             </w:r>
           </w:p>
         </w:tc>
@@ -25757,6 +27555,214 @@
           </w:p>
         </w:tc>
       </w:tr>
+      <w:tr>
+        <w:tc>
+          <w:tcPr>
+            <w:tcW w:type="dxa" w:w="1728"/>
+          </w:tcPr>
+          <w:p>
+            <w:r/>
+            <w:r>
+              <w:rPr>
+                <w:rFonts w:ascii="Consolas" w:hAnsi="Consolas"/>
+                <w:sz w:val="19"/>
+              </w:rPr>
+              <w:t>TK-20261001-000164</w:t>
+            </w:r>
+          </w:p>
+        </w:tc>
+        <w:tc>
+          <w:tcPr>
+            <w:tcW w:type="dxa" w:w="1728"/>
+          </w:tcPr>
+          <w:p>
+            <w:r/>
+            <w:r>
+              <w:t xml:space="preserve">KB-AZ </w:t>
+            </w:r>
+            <w:r>
+              <w:rPr>
+                <w:rFonts w:ascii="Consolas" w:hAnsi="Consolas"/>
+                <w:sz w:val="19"/>
+              </w:rPr>
+              <w:t>THU-KBAZ-G1/EPL</w:t>
+            </w:r>
+            <w:r>
+              <w:t xml:space="preserve"> (gom, </w:t>
+            </w:r>
+            <w:r>
+              <w:rPr>
+                <w:rFonts w:ascii="Consolas" w:hAnsi="Consolas"/>
+                <w:sz w:val="19"/>
+              </w:rPr>
+              <w:t>EPLLAO-37367086d283</w:t>
+            </w:r>
+            <w:r>
+              <w:t>)</w:t>
+            </w:r>
+          </w:p>
+        </w:tc>
+        <w:tc>
+          <w:tcPr>
+            <w:tcW w:type="dxa" w:w="1728"/>
+          </w:tcPr>
+          <w:p>
+            <w:r/>
+            <w:r>
+              <w:t xml:space="preserve">ຄຳຕຸ້ຍ </w:t>
+            </w:r>
+            <w:r>
+              <w:rPr>
+                <w:rFonts w:ascii="Consolas" w:hAnsi="Consolas"/>
+                <w:sz w:val="19"/>
+              </w:rPr>
+              <w:t>EPLKH-0834a9e9606b</w:t>
+            </w:r>
+          </w:p>
+        </w:tc>
+        <w:tc>
+          <w:tcPr>
+            <w:tcW w:type="dxa" w:w="1728"/>
+          </w:tcPr>
+          <w:p>
+            <w:r/>
+            <w:r>
+              <w:t xml:space="preserve">495,00 USD · mặt hàng </w:t>
+            </w:r>
+            <w:r>
+              <w:rPr>
+                <w:rFonts w:ascii="Consolas" w:hAnsi="Consolas"/>
+                <w:sz w:val="19"/>
+              </w:rPr>
+              <w:t>EPLKH-0834a9e9606b_b9213bcb64b9</w:t>
+            </w:r>
+          </w:p>
+        </w:tc>
+        <w:tc>
+          <w:tcPr>
+            <w:tcW w:type="dxa" w:w="1728"/>
+          </w:tcPr>
+          <w:p>
+            <w:r/>
+            <w:r>
+              <w:t xml:space="preserve">như trên; </w:t>
+            </w:r>
+            <w:r>
+              <w:rPr>
+                <w:b/>
+              </w:rPr>
+              <w:t>đã thu đủ</w:t>
+            </w:r>
+            <w:r>
+              <w:t xml:space="preserve"> (mục 9.5)</w:t>
+            </w:r>
+          </w:p>
+        </w:tc>
+      </w:tr>
+      <w:tr>
+        <w:tc>
+          <w:tcPr>
+            <w:tcW w:type="dxa" w:w="1728"/>
+          </w:tcPr>
+          <w:p>
+            <w:r/>
+            <w:r>
+              <w:rPr>
+                <w:rFonts w:ascii="Consolas" w:hAnsi="Consolas"/>
+                <w:sz w:val="19"/>
+              </w:rPr>
+              <w:t>TK-20261001-000165</w:t>
+            </w:r>
+          </w:p>
+        </w:tc>
+        <w:tc>
+          <w:tcPr>
+            <w:tcW w:type="dxa" w:w="1728"/>
+          </w:tcPr>
+          <w:p>
+            <w:r/>
+            <w:r>
+              <w:t xml:space="preserve">KB-AZ </w:t>
+            </w:r>
+            <w:r>
+              <w:rPr>
+                <w:rFonts w:ascii="Consolas" w:hAnsi="Consolas"/>
+                <w:sz w:val="19"/>
+              </w:rPr>
+              <w:t>THU-KBAZ-T1/EPL</w:t>
+            </w:r>
+            <w:r>
+              <w:t xml:space="preserve"> (giao, </w:t>
+            </w:r>
+            <w:r>
+              <w:rPr>
+                <w:rFonts w:ascii="Consolas" w:hAnsi="Consolas"/>
+                <w:sz w:val="19"/>
+              </w:rPr>
+              <w:t>EPLLAO-ea99922a96ee</w:t>
+            </w:r>
+            <w:r>
+              <w:t>)</w:t>
+            </w:r>
+          </w:p>
+        </w:tc>
+        <w:tc>
+          <w:tcPr>
+            <w:tcW w:type="dxa" w:w="1728"/>
+          </w:tcPr>
+          <w:p>
+            <w:r/>
+            <w:r>
+              <w:t xml:space="preserve">ຄຳຕຸ້ຍ </w:t>
+            </w:r>
+            <w:r>
+              <w:rPr>
+                <w:rFonts w:ascii="Consolas" w:hAnsi="Consolas"/>
+                <w:sz w:val="19"/>
+              </w:rPr>
+              <w:t>EPLKH-0834a9e9606b</w:t>
+            </w:r>
+          </w:p>
+        </w:tc>
+        <w:tc>
+          <w:tcPr>
+            <w:tcW w:type="dxa" w:w="1728"/>
+          </w:tcPr>
+          <w:p>
+            <w:r/>
+            <w:r>
+              <w:t xml:space="preserve">753,35 USD · mặt hàng </w:t>
+            </w:r>
+            <w:r>
+              <w:rPr>
+                <w:rFonts w:ascii="Consolas" w:hAnsi="Consolas"/>
+                <w:sz w:val="19"/>
+              </w:rPr>
+              <w:t>EPLKH-0834a9e9606b_0b840ad2a162</w:t>
+            </w:r>
+          </w:p>
+        </w:tc>
+        <w:tc>
+          <w:tcPr>
+            <w:tcW w:type="dxa" w:w="1728"/>
+          </w:tcPr>
+          <w:p>
+            <w:r/>
+            <w:r>
+              <w:t xml:space="preserve">như trên; </w:t>
+            </w:r>
+            <w:r>
+              <w:rPr>
+                <w:b/>
+              </w:rPr>
+              <w:t>đã thu đủ</w:t>
+            </w:r>
+            <w:r>
+              <w:t xml:space="preserve"> (mục 9.5)</w:t>
+            </w:r>
+          </w:p>
+        </w:tc>
+      </w:tr>
     </w:tbl>
     <w:p/>
     <w:p>
@@ -25764,7 +27770,7 @@
         <w:jc w:val="both"/>
       </w:pPr>
       <w:r>
-        <w:t xml:space="preserve">Hai SO tạo ngày 01/10 trước giờ cắt sổ, </w:t>
+        <w:t xml:space="preserve">SO 162, 163 tạo ngày 01/10 trước giờ cắt sổ, </w:t>
       </w:r>
       <w:r>
         <w:rPr>
@@ -25773,7 +27779,17 @@
         <w:t>giữ nguyên</w:t>
       </w:r>
       <w:r>
-        <w:t>, là công nợ thật của hai DO đó.</w:t>
+        <w:t xml:space="preserve">, là công nợ thật của hai DO đó. SO 164, 165 là chuyến thử KB-AZ (HTTP 201, nợ ban đầu bằng cước), đã thu xong; giữ làm mẫu. Cả bốn SO cùng mã phiếu bán </w:t>
+      </w:r>
+      <w:r>
+        <w:rPr>
+          <w:rFonts w:ascii="Consolas" w:hAnsi="Consolas"/>
+          <w:sz w:val="19"/>
+        </w:rPr>
+        <w:t>Demo EPL-2-261001000</w:t>
+      </w:r>
+      <w:r>
+        <w:t xml:space="preserve"> (lỗi bên anh, mục 1.5).</w:t>
       </w:r>
     </w:p>
     <w:p>
@@ -26239,6 +28255,480 @@
           </w:p>
         </w:tc>
       </w:tr>
+      <w:tr>
+        <w:tc>
+          <w:tcPr>
+            <w:tcW w:type="dxa" w:w="2160"/>
+          </w:tcPr>
+          <w:p>
+            <w:r/>
+            <w:r>
+              <w:rPr>
+                <w:rFonts w:ascii="Consolas" w:hAnsi="Consolas"/>
+                <w:sz w:val="19"/>
+              </w:rPr>
+              <w:t>1368-CTR-261001-00072</w:t>
+            </w:r>
+            <w:r>
+              <w:t xml:space="preserve"> (DocumentId 81417)</w:t>
+            </w:r>
+          </w:p>
+        </w:tc>
+        <w:tc>
+          <w:tcPr>
+            <w:tcW w:type="dxa" w:w="2160"/>
+          </w:tcPr>
+          <w:p>
+            <w:r/>
+            <w:r>
+              <w:t>59 "Chi trước"</w:t>
+            </w:r>
+          </w:p>
+        </w:tc>
+        <w:tc>
+          <w:tcPr>
+            <w:tcW w:type="dxa" w:w="2160"/>
+          </w:tcPr>
+          <w:p>
+            <w:r/>
+            <w:r>
+              <w:t xml:space="preserve">KB-AZ tạm ứng xe nhà </w:t>
+            </w:r>
+            <w:r>
+              <w:rPr>
+                <w:rFonts w:ascii="Consolas" w:hAnsi="Consolas"/>
+                <w:sz w:val="19"/>
+              </w:rPr>
+              <w:t>PTU-THU-KBAZ-G1/EPL</w:t>
+            </w:r>
+            <w:r>
+              <w:t xml:space="preserve">, </w:t>
+            </w:r>
+            <w:r>
+              <w:rPr>
+                <w:rFonts w:ascii="Consolas" w:hAnsi="Consolas"/>
+                <w:sz w:val="19"/>
+              </w:rPr>
+              <w:t>EPLTX-a6313dd63966</w:t>
+            </w:r>
+            <w:r>
+              <w:t>, Nợ 1601 / Có 1011 · 250.000 LAK</w:t>
+            </w:r>
+          </w:p>
+        </w:tc>
+        <w:tc>
+          <w:tcPr>
+            <w:tcW w:type="dxa" w:w="2160"/>
+          </w:tcPr>
+          <w:p>
+            <w:r/>
+            <w:r>
+              <w:rPr>
+                <w:b/>
+              </w:rPr>
+              <w:t>còn lại</w:t>
+            </w:r>
+            <w:r>
+              <w:t>, đã ghi sổ chính (12)</w:t>
+            </w:r>
+          </w:p>
+        </w:tc>
+      </w:tr>
+      <w:tr>
+        <w:tc>
+          <w:tcPr>
+            <w:tcW w:type="dxa" w:w="2160"/>
+          </w:tcPr>
+          <w:p>
+            <w:r/>
+            <w:r>
+              <w:rPr>
+                <w:rFonts w:ascii="Consolas" w:hAnsi="Consolas"/>
+                <w:sz w:val="19"/>
+              </w:rPr>
+              <w:t>1368-CTR-261001-00073</w:t>
+            </w:r>
+            <w:r>
+              <w:t xml:space="preserve"> (81421)</w:t>
+            </w:r>
+          </w:p>
+        </w:tc>
+        <w:tc>
+          <w:tcPr>
+            <w:tcW w:type="dxa" w:w="2160"/>
+          </w:tcPr>
+          <w:p>
+            <w:r/>
+            <w:r>
+              <w:t>59 "Chi trước"</w:t>
+            </w:r>
+          </w:p>
+        </w:tc>
+        <w:tc>
+          <w:tcPr>
+            <w:tcW w:type="dxa" w:w="2160"/>
+          </w:tcPr>
+          <w:p>
+            <w:r/>
+            <w:r>
+              <w:t xml:space="preserve">KB-AZ tạm ứng xe thuê </w:t>
+            </w:r>
+            <w:r>
+              <w:rPr>
+                <w:rFonts w:ascii="Consolas" w:hAnsi="Consolas"/>
+                <w:sz w:val="19"/>
+              </w:rPr>
+              <w:t>PTU-THU-KBAZ-T1/EPL</w:t>
+            </w:r>
+            <w:r>
+              <w:t xml:space="preserve">, chủ xe </w:t>
+            </w:r>
+            <w:r>
+              <w:rPr>
+                <w:rFonts w:ascii="Consolas" w:hAnsi="Consolas"/>
+                <w:sz w:val="19"/>
+              </w:rPr>
+              <w:t>EPLCX-0a073ea75bb3</w:t>
+            </w:r>
+            <w:r>
+              <w:t>, Nợ 4022 / Có 1011 · 4.247.000 LAK</w:t>
+            </w:r>
+          </w:p>
+        </w:tc>
+        <w:tc>
+          <w:tcPr>
+            <w:tcW w:type="dxa" w:w="2160"/>
+          </w:tcPr>
+          <w:p>
+            <w:r/>
+            <w:r>
+              <w:rPr>
+                <w:b/>
+              </w:rPr>
+              <w:t>còn lại</w:t>
+            </w:r>
+            <w:r>
+              <w:t>, đã ghi sổ chính</w:t>
+            </w:r>
+          </w:p>
+        </w:tc>
+      </w:tr>
+      <w:tr>
+        <w:tc>
+          <w:tcPr>
+            <w:tcW w:type="dxa" w:w="2160"/>
+          </w:tcPr>
+          <w:p>
+            <w:r/>
+            <w:r>
+              <w:rPr>
+                <w:rFonts w:ascii="Consolas" w:hAnsi="Consolas"/>
+                <w:sz w:val="19"/>
+              </w:rPr>
+              <w:t>1368-CKH-261001-00067</w:t>
+            </w:r>
+            <w:r>
+              <w:t xml:space="preserve"> (81419)</w:t>
+            </w:r>
+          </w:p>
+        </w:tc>
+        <w:tc>
+          <w:tcPr>
+            <w:tcW w:type="dxa" w:w="2160"/>
+          </w:tcPr>
+          <w:p>
+            <w:r/>
+            <w:r>
+              <w:t>60 "Chi khác"</w:t>
+            </w:r>
+          </w:p>
+        </w:tc>
+        <w:tc>
+          <w:tcPr>
+            <w:tcW w:type="dxa" w:w="2160"/>
+          </w:tcPr>
+          <w:p>
+            <w:r/>
+            <w:r>
+              <w:t xml:space="preserve">KB-AZ chi mục V garage </w:t>
+            </w:r>
+            <w:r>
+              <w:rPr>
+                <w:rFonts w:ascii="Consolas" w:hAnsi="Consolas"/>
+                <w:sz w:val="19"/>
+              </w:rPr>
+              <w:t>PCSC-V-THU-KBAZ-G1/EPL-1</w:t>
+            </w:r>
+            <w:r>
+              <w:t xml:space="preserve">, </w:t>
+            </w:r>
+            <w:r>
+              <w:rPr>
+                <w:rFonts w:ascii="Consolas" w:hAnsi="Consolas"/>
+                <w:sz w:val="19"/>
+              </w:rPr>
+              <w:t>EPLTX-a6313dd63966</w:t>
+            </w:r>
+            <w:r>
+              <w:t>, Nợ 614 / Có 1011 · 250.000 LAK</w:t>
+            </w:r>
+          </w:p>
+        </w:tc>
+        <w:tc>
+          <w:tcPr>
+            <w:tcW w:type="dxa" w:w="2160"/>
+          </w:tcPr>
+          <w:p>
+            <w:r/>
+            <w:r>
+              <w:rPr>
+                <w:b/>
+              </w:rPr>
+              <w:t>còn lại</w:t>
+            </w:r>
+            <w:r>
+              <w:t>, đã ghi sổ chính</w:t>
+            </w:r>
+          </w:p>
+        </w:tc>
+      </w:tr>
+      <w:tr>
+        <w:tc>
+          <w:tcPr>
+            <w:tcW w:type="dxa" w:w="2160"/>
+          </w:tcPr>
+          <w:p>
+            <w:r/>
+            <w:r>
+              <w:rPr>
+                <w:rFonts w:ascii="Consolas" w:hAnsi="Consolas"/>
+                <w:sz w:val="19"/>
+              </w:rPr>
+              <w:t>1368-CKH-261001-00068</w:t>
+            </w:r>
+            <w:r>
+              <w:t xml:space="preserve"> (81427)</w:t>
+            </w:r>
+          </w:p>
+        </w:tc>
+        <w:tc>
+          <w:tcPr>
+            <w:tcW w:type="dxa" w:w="2160"/>
+          </w:tcPr>
+          <w:p>
+            <w:r/>
+            <w:r>
+              <w:t>60 "Chi khác"</w:t>
+            </w:r>
+          </w:p>
+        </w:tc>
+        <w:tc>
+          <w:tcPr>
+            <w:tcW w:type="dxa" w:w="2160"/>
+          </w:tcPr>
+          <w:p>
+            <w:r/>
+            <w:r>
+              <w:t xml:space="preserve">KB-AZ tất toán TT_CHI </w:t>
+            </w:r>
+            <w:r>
+              <w:rPr>
+                <w:rFonts w:ascii="Consolas" w:hAnsi="Consolas"/>
+                <w:sz w:val="19"/>
+              </w:rPr>
+              <w:t>TTX-202610-99c2aab4</w:t>
+            </w:r>
+            <w:r>
+              <w:t xml:space="preserve">, </w:t>
+            </w:r>
+            <w:r>
+              <w:rPr>
+                <w:rFonts w:ascii="Consolas" w:hAnsi="Consolas"/>
+                <w:sz w:val="19"/>
+              </w:rPr>
+              <w:t>EPLTX-a6313dd63966</w:t>
+            </w:r>
+            <w:r>
+              <w:t>, Nợ 1601 / Có 1011 · 960.000 LAK</w:t>
+            </w:r>
+          </w:p>
+        </w:tc>
+        <w:tc>
+          <w:tcPr>
+            <w:tcW w:type="dxa" w:w="2160"/>
+          </w:tcPr>
+          <w:p>
+            <w:r/>
+            <w:r>
+              <w:rPr>
+                <w:b/>
+              </w:rPr>
+              <w:t>còn lại</w:t>
+            </w:r>
+            <w:r>
+              <w:t>, đã ghi sổ chính</w:t>
+            </w:r>
+          </w:p>
+        </w:tc>
+      </w:tr>
+      <w:tr>
+        <w:tc>
+          <w:tcPr>
+            <w:tcW w:type="dxa" w:w="2160"/>
+          </w:tcPr>
+          <w:p>
+            <w:r/>
+            <w:r>
+              <w:rPr>
+                <w:rFonts w:ascii="Consolas" w:hAnsi="Consolas"/>
+                <w:sz w:val="19"/>
+              </w:rPr>
+              <w:t>1368-CKH-261001-00069</w:t>
+            </w:r>
+            <w:r>
+              <w:t xml:space="preserve"> (81429)</w:t>
+            </w:r>
+          </w:p>
+        </w:tc>
+        <w:tc>
+          <w:tcPr>
+            <w:tcW w:type="dxa" w:w="2160"/>
+          </w:tcPr>
+          <w:p>
+            <w:r/>
+            <w:r>
+              <w:t>60 "Chi khác"</w:t>
+            </w:r>
+          </w:p>
+        </w:tc>
+        <w:tc>
+          <w:tcPr>
+            <w:tcW w:type="dxa" w:w="2160"/>
+          </w:tcPr>
+          <w:p>
+            <w:r/>
+            <w:r>
+              <w:t xml:space="preserve">KB-AZ trả chủ xe </w:t>
+            </w:r>
+            <w:r>
+              <w:rPr>
+                <w:rFonts w:ascii="Consolas" w:hAnsi="Consolas"/>
+                <w:sz w:val="19"/>
+              </w:rPr>
+              <w:t>TCX-261001104415-0a07</w:t>
+            </w:r>
+            <w:r>
+              <w:t xml:space="preserve">, </w:t>
+            </w:r>
+            <w:r>
+              <w:rPr>
+                <w:rFonts w:ascii="Consolas" w:hAnsi="Consolas"/>
+                <w:sz w:val="19"/>
+              </w:rPr>
+              <w:t>EPLCX-0a073ea75bb3</w:t>
+            </w:r>
+            <w:r>
+              <w:t>, Nợ 4022 / Có 1012 · 204,95 USD</w:t>
+            </w:r>
+          </w:p>
+        </w:tc>
+        <w:tc>
+          <w:tcPr>
+            <w:tcW w:type="dxa" w:w="2160"/>
+          </w:tcPr>
+          <w:p>
+            <w:r/>
+            <w:r>
+              <w:rPr>
+                <w:b/>
+              </w:rPr>
+              <w:t>còn lại</w:t>
+            </w:r>
+            <w:r>
+              <w:t>, đã ghi sổ chính</w:t>
+            </w:r>
+          </w:p>
+        </w:tc>
+      </w:tr>
+      <w:tr>
+        <w:tc>
+          <w:tcPr>
+            <w:tcW w:type="dxa" w:w="2160"/>
+          </w:tcPr>
+          <w:p>
+            <w:r/>
+            <w:r>
+              <w:rPr>
+                <w:rFonts w:ascii="Consolas" w:hAnsi="Consolas"/>
+                <w:sz w:val="19"/>
+              </w:rPr>
+              <w:t>1368-CKH-261001-00070</w:t>
+            </w:r>
+            <w:r>
+              <w:t xml:space="preserve"> (81431)</w:t>
+            </w:r>
+          </w:p>
+        </w:tc>
+        <w:tc>
+          <w:tcPr>
+            <w:tcW w:type="dxa" w:w="2160"/>
+          </w:tcPr>
+          <w:p>
+            <w:r/>
+            <w:r>
+              <w:t>60 "Chi khác"</w:t>
+            </w:r>
+          </w:p>
+        </w:tc>
+        <w:tc>
+          <w:tcPr>
+            <w:tcW w:type="dxa" w:w="2160"/>
+          </w:tcPr>
+          <w:p>
+            <w:r/>
+            <w:r>
+              <w:t xml:space="preserve">KB-AZ trả nhà cung cấp </w:t>
+            </w:r>
+            <w:r>
+              <w:rPr>
+                <w:rFonts w:ascii="Consolas" w:hAnsi="Consolas"/>
+                <w:sz w:val="19"/>
+              </w:rPr>
+              <w:t>TNCC-261001104417-804c</w:t>
+            </w:r>
+            <w:r>
+              <w:t xml:space="preserve">, </w:t>
+            </w:r>
+            <w:r>
+              <w:rPr>
+                <w:rFonts w:ascii="Consolas" w:hAnsi="Consolas"/>
+                <w:sz w:val="19"/>
+              </w:rPr>
+              <w:t>EPLNCC-804c0e8ff1d8</w:t>
+            </w:r>
+            <w:r>
+              <w:t>, Nợ 4021 / Có 1021 · 620.000 LAK</w:t>
+            </w:r>
+          </w:p>
+        </w:tc>
+        <w:tc>
+          <w:tcPr>
+            <w:tcW w:type="dxa" w:w="2160"/>
+          </w:tcPr>
+          <w:p>
+            <w:r/>
+            <w:r>
+              <w:rPr>
+                <w:b/>
+              </w:rPr>
+              <w:t>còn lại</w:t>
+            </w:r>
+            <w:r>
+              <w:t>, đã ghi sổ chính</w:t>
+            </w:r>
+          </w:p>
+        </w:tc>
+      </w:tr>
     </w:tbl>
     <w:p/>
     <w:p>
@@ -26326,7 +28816,17 @@
         <w:t>SP_CMR_DELETEMCMR_CMRECEIPT</w:t>
       </w:r>
       <w:r>
-        <w:t>. Phiếu chưa ghi sổ do bên em tạo đều đã rút.</w:t>
+        <w:t>. Phiếu chưa ghi sổ do bên em tạo đều đã rút. Chứng từ KB-AZ em đóng vai thủ quỹ ghi sổ (</w:t>
+      </w:r>
+      <w:r>
+        <w:rPr>
+          <w:rFonts w:ascii="Consolas" w:hAnsi="Consolas"/>
+          <w:sz w:val="19"/>
+        </w:rPr>
+        <w:t>…/post</w:t>
+      </w:r>
+      <w:r>
+        <w:t xml:space="preserve"> PostedFinal), giữ lại làm mẫu; anh muốn dọn thì gỡ ghi sổ rồi xoá.</w:t>
       </w:r>
     </w:p>
     <w:p>
@@ -26334,7 +28834,415 @@
         <w:pStyle w:val="Heading2"/>
       </w:pPr>
       <w:r>
-        <w:t>9.5. Những gì chưa ghi</w:t>
+        <w:t>9.5. Thu nợ khách thử (KB-AZ, qua `sales/debt/collection-upsert` → `sp_RES_CreateDebtCollection_COUNTRY`)</w:t>
+      </w:r>
+    </w:p>
+    <w:p>
+      <w:pPr>
+        <w:jc w:val="both"/>
+      </w:pPr>
+      <w:r>
+        <w:t xml:space="preserve">Em gửi đúng lời gọi WEB gửi khi bấm </w:t>
+      </w:r>
+      <w:r>
+        <w:rPr>
+          <w:b/>
+        </w:rPr>
+        <w:t>Xác nhận thu nợ</w:t>
+      </w:r>
+      <w:r>
+        <w:t xml:space="preserve"> (</w:t>
+      </w:r>
+      <w:r>
+        <w:rPr>
+          <w:rFonts w:ascii="Consolas" w:hAnsi="Consolas"/>
+          <w:sz w:val="19"/>
+        </w:rPr>
+        <w:t>TKN</w:t>
+      </w:r>
+      <w:r>
+        <w:t>, chi nhánh 1368, Ngân hàng nội tệ, Chuyển khoản, tỷ giá 1), rồi ghi sổ phiếu thu.</w:t>
+      </w:r>
+    </w:p>
+    <w:tbl>
+      <w:tblPr>
+        <w:tblStyle w:val="LightGrid-Accent1"/>
+        <w:tblW w:type="auto" w:w="0"/>
+        <w:tblLook w:firstColumn="1" w:firstRow="1" w:lastColumn="0" w:lastRow="0" w:noHBand="0" w:noVBand="1" w:val="04A0"/>
+      </w:tblPr>
+      <w:tblGrid>
+        <w:gridCol w:w="1440"/>
+        <w:gridCol w:w="1440"/>
+        <w:gridCol w:w="1440"/>
+        <w:gridCol w:w="1440"/>
+        <w:gridCol w:w="1440"/>
+        <w:gridCol w:w="1440"/>
+      </w:tblGrid>
+      <w:tr>
+        <w:tc>
+          <w:tcPr>
+            <w:tcW w:type="dxa" w:w="1440"/>
+          </w:tcPr>
+          <w:p>
+            <w:r>
+              <w:rPr>
+                <w:b/>
+              </w:rPr>
+            </w:r>
+            <w:r>
+              <w:rPr>
+                <w:b/>
+              </w:rPr>
+              <w:t>Phiếu thu nợ</w:t>
+            </w:r>
+          </w:p>
+        </w:tc>
+        <w:tc>
+          <w:tcPr>
+            <w:tcW w:type="dxa" w:w="1440"/>
+          </w:tcPr>
+          <w:p>
+            <w:r>
+              <w:rPr>
+                <w:b/>
+              </w:rPr>
+            </w:r>
+            <w:r>
+              <w:rPr>
+                <w:b/>
+              </w:rPr>
+              <w:t>SO</w:t>
+            </w:r>
+          </w:p>
+        </w:tc>
+        <w:tc>
+          <w:tcPr>
+            <w:tcW w:type="dxa" w:w="1440"/>
+          </w:tcPr>
+          <w:p>
+            <w:r>
+              <w:rPr>
+                <w:b/>
+              </w:rPr>
+            </w:r>
+            <w:r>
+              <w:rPr>
+                <w:b/>
+              </w:rPr>
+              <w:t>Số thu</w:t>
+            </w:r>
+          </w:p>
+        </w:tc>
+        <w:tc>
+          <w:tcPr>
+            <w:tcW w:type="dxa" w:w="1440"/>
+          </w:tcPr>
+          <w:p>
+            <w:r>
+              <w:rPr>
+                <w:b/>
+              </w:rPr>
+            </w:r>
+            <w:r>
+              <w:rPr>
+                <w:b/>
+              </w:rPr>
+              <w:t>→ Phiếu thu CM</w:t>
+            </w:r>
+          </w:p>
+        </w:tc>
+        <w:tc>
+          <w:tcPr>
+            <w:tcW w:type="dxa" w:w="1440"/>
+          </w:tcPr>
+          <w:p>
+            <w:r>
+              <w:rPr>
+                <w:b/>
+              </w:rPr>
+            </w:r>
+            <w:r>
+              <w:rPr>
+                <w:b/>
+              </w:rPr>
+              <w:t>Định khoản</w:t>
+            </w:r>
+          </w:p>
+        </w:tc>
+        <w:tc>
+          <w:tcPr>
+            <w:tcW w:type="dxa" w:w="1440"/>
+          </w:tcPr>
+          <w:p>
+            <w:r>
+              <w:rPr>
+                <w:b/>
+              </w:rPr>
+            </w:r>
+            <w:r>
+              <w:rPr>
+                <w:b/>
+              </w:rPr>
+              <w:t>Bảng ghi</w:t>
+            </w:r>
+          </w:p>
+        </w:tc>
+      </w:tr>
+      <w:tr>
+        <w:tc>
+          <w:tcPr>
+            <w:tcW w:type="dxa" w:w="1440"/>
+          </w:tcPr>
+          <w:p>
+            <w:r/>
+            <w:r>
+              <w:rPr>
+                <w:rFonts w:ascii="Consolas" w:hAnsi="Consolas"/>
+                <w:sz w:val="19"/>
+              </w:rPr>
+              <w:t>4-TKN-1368-2-261001-0001</w:t>
+            </w:r>
+          </w:p>
+        </w:tc>
+        <w:tc>
+          <w:tcPr>
+            <w:tcW w:type="dxa" w:w="1440"/>
+          </w:tcPr>
+          <w:p>
+            <w:r/>
+            <w:r>
+              <w:rPr>
+                <w:rFonts w:ascii="Consolas" w:hAnsi="Consolas"/>
+                <w:sz w:val="19"/>
+              </w:rPr>
+              <w:t>TK-20261001-000164</w:t>
+            </w:r>
+          </w:p>
+        </w:tc>
+        <w:tc>
+          <w:tcPr>
+            <w:tcW w:type="dxa" w:w="1440"/>
+          </w:tcPr>
+          <w:p>
+            <w:r/>
+            <w:r>
+              <w:t>495,00 USD</w:t>
+            </w:r>
+          </w:p>
+        </w:tc>
+        <w:tc>
+          <w:tcPr>
+            <w:tcW w:type="dxa" w:w="1440"/>
+          </w:tcPr>
+          <w:p>
+            <w:r/>
+            <w:r>
+              <w:rPr>
+                <w:rFonts w:ascii="Consolas" w:hAnsi="Consolas"/>
+                <w:sz w:val="19"/>
+              </w:rPr>
+              <w:t>4-1368-TK-261001-00009</w:t>
+            </w:r>
+            <w:r>
+              <w:t xml:space="preserve"> (DocumentId 81423), CMR 17 "Thu khác", đã ghi sổ</w:t>
+            </w:r>
+          </w:p>
+        </w:tc>
+        <w:tc>
+          <w:tcPr>
+            <w:tcW w:type="dxa" w:w="1440"/>
+          </w:tcPr>
+          <w:p>
+            <w:r/>
+            <w:r>
+              <w:t>Nợ 1021 / Có 1211</w:t>
+            </w:r>
+          </w:p>
+        </w:tc>
+        <w:tc>
+          <w:tcPr>
+            <w:tcW w:type="dxa" w:w="1440"/>
+          </w:tcPr>
+          <w:p>
+            <w:r/>
+            <w:r>
+              <w:rPr>
+                <w:rFonts w:ascii="Consolas" w:hAnsi="Consolas"/>
+                <w:sz w:val="19"/>
+              </w:rPr>
+              <w:t>RESDOCUMENT</w:t>
+            </w:r>
+            <w:r>
+              <w:t xml:space="preserve">, </w:t>
+            </w:r>
+            <w:r>
+              <w:rPr>
+                <w:rFonts w:ascii="Consolas" w:hAnsi="Consolas"/>
+                <w:sz w:val="19"/>
+              </w:rPr>
+              <w:t>RESDOCUMENT_TICKET</w:t>
+            </w:r>
+            <w:r>
+              <w:t xml:space="preserve">, </w:t>
+            </w:r>
+            <w:r>
+              <w:rPr>
+                <w:rFonts w:ascii="Consolas" w:hAnsi="Consolas"/>
+                <w:sz w:val="19"/>
+              </w:rPr>
+              <w:t>RESCUSTOMERSDEBT</w:t>
+            </w:r>
+            <w:r>
+              <w:t xml:space="preserve"> (nợ về 0, </w:t>
+            </w:r>
+            <w:r>
+              <w:rPr>
+                <w:rFonts w:ascii="Consolas" w:hAnsi="Consolas"/>
+                <w:sz w:val="19"/>
+              </w:rPr>
+              <w:t>RCTD_ISPAID = 1</w:t>
+            </w:r>
+            <w:r>
+              <w:t xml:space="preserve">), </w:t>
+            </w:r>
+            <w:r>
+              <w:rPr>
+                <w:rFonts w:ascii="Consolas" w:hAnsi="Consolas"/>
+                <w:sz w:val="19"/>
+              </w:rPr>
+              <w:t>PUBDOCUMENT</w:t>
+            </w:r>
+            <w:r>
+              <w:t xml:space="preserve">, </w:t>
+            </w:r>
+            <w:r>
+              <w:rPr>
+                <w:rFonts w:ascii="Consolas" w:hAnsi="Consolas"/>
+                <w:sz w:val="19"/>
+              </w:rPr>
+              <w:t>CMRECEIPT</w:t>
+            </w:r>
+            <w:r>
+              <w:t xml:space="preserve">, </w:t>
+            </w:r>
+            <w:r>
+              <w:rPr>
+                <w:rFonts w:ascii="Consolas" w:hAnsi="Consolas"/>
+                <w:sz w:val="19"/>
+              </w:rPr>
+              <w:t>PUBENTRY</w:t>
+            </w:r>
+          </w:p>
+        </w:tc>
+      </w:tr>
+      <w:tr>
+        <w:tc>
+          <w:tcPr>
+            <w:tcW w:type="dxa" w:w="1440"/>
+          </w:tcPr>
+          <w:p>
+            <w:r/>
+            <w:r>
+              <w:rPr>
+                <w:rFonts w:ascii="Consolas" w:hAnsi="Consolas"/>
+                <w:sz w:val="19"/>
+              </w:rPr>
+              <w:t>4-TKN-1368-2-261001-0002</w:t>
+            </w:r>
+          </w:p>
+        </w:tc>
+        <w:tc>
+          <w:tcPr>
+            <w:tcW w:type="dxa" w:w="1440"/>
+          </w:tcPr>
+          <w:p>
+            <w:r/>
+            <w:r>
+              <w:rPr>
+                <w:rFonts w:ascii="Consolas" w:hAnsi="Consolas"/>
+                <w:sz w:val="19"/>
+              </w:rPr>
+              <w:t>TK-20261001-000165</w:t>
+            </w:r>
+          </w:p>
+        </w:tc>
+        <w:tc>
+          <w:tcPr>
+            <w:tcW w:type="dxa" w:w="1440"/>
+          </w:tcPr>
+          <w:p>
+            <w:r/>
+            <w:r>
+              <w:t>753,35 USD</w:t>
+            </w:r>
+          </w:p>
+        </w:tc>
+        <w:tc>
+          <w:tcPr>
+            <w:tcW w:type="dxa" w:w="1440"/>
+          </w:tcPr>
+          <w:p>
+            <w:r/>
+            <w:r>
+              <w:rPr>
+                <w:rFonts w:ascii="Consolas" w:hAnsi="Consolas"/>
+                <w:sz w:val="19"/>
+              </w:rPr>
+              <w:t>4-1368-TK-261001-00010</w:t>
+            </w:r>
+            <w:r>
+              <w:t xml:space="preserve"> (81424), CMR 17, đã ghi sổ</w:t>
+            </w:r>
+          </w:p>
+        </w:tc>
+        <w:tc>
+          <w:tcPr>
+            <w:tcW w:type="dxa" w:w="1440"/>
+          </w:tcPr>
+          <w:p>
+            <w:r/>
+            <w:r>
+              <w:t>Nợ 1021 / Có 1211</w:t>
+            </w:r>
+          </w:p>
+        </w:tc>
+        <w:tc>
+          <w:tcPr>
+            <w:tcW w:type="dxa" w:w="1440"/>
+          </w:tcPr>
+          <w:p>
+            <w:r/>
+            <w:r>
+              <w:t>như trên</w:t>
+            </w:r>
+          </w:p>
+        </w:tc>
+      </w:tr>
+    </w:tbl>
+    <w:p/>
+    <w:p>
+      <w:pPr>
+        <w:jc w:val="both"/>
+      </w:pPr>
+      <w:r>
+        <w:t xml:space="preserve">Cả hai mang lỗi tỷ giá cứng 1 (quy đổi = nguyên tệ USD, vế tiền ngân hàng Kíp) — mục 1.5, mục 5 việc 9. Bên em: hai DO </w:t>
+      </w:r>
+      <w:r>
+        <w:rPr>
+          <w:b/>
+        </w:rPr>
+        <w:t>Đã thu đủ</w:t>
+      </w:r>
+      <w:r>
+        <w:t>, khối Công nợ bên hệ kế toán đã thu 1.248,35 USD.</w:t>
+      </w:r>
+    </w:p>
+    <w:p>
+      <w:pPr>
+        <w:pStyle w:val="Heading2"/>
+      </w:pPr>
+      <w:r>
+        <w:t>9.6. Những gì chưa ghi</w:t>
       </w:r>
     </w:p>
     <w:p>
@@ -26372,7 +29280,55 @@
         <w:t>proc_PP_CashVoucherSourceReference_Save</w:t>
       </w:r>
       <w:r>
-        <w:t>): bên em chỉ gọi đường đọc của modal Vụ việc, chưa lưu phiếu nào có Vụ việc DO.</w:t>
+        <w:t xml:space="preserve">): bên em chỉ gọi đường đọc của modal Vụ việc (KB-AZ: </w:t>
+      </w:r>
+      <w:r>
+        <w:rPr>
+          <w:rFonts w:ascii="Consolas" w:hAnsi="Consolas"/>
+          <w:sz w:val="19"/>
+        </w:rPr>
+        <w:t>type=DO&amp;keyword=THU-KBAZ</w:t>
+      </w:r>
+      <w:r>
+        <w:t xml:space="preserve"> trả 2 DO), chưa lưu phiếu nào có Vụ việc DO.</w:t>
+      </w:r>
+    </w:p>
+    <w:p>
+      <w:pPr>
+        <w:pStyle w:val="ListBullet"/>
+      </w:pPr>
+      <w:r>
+        <w:rPr>
+          <w:b/>
+        </w:rPr>
+        <w:t>Bút toán chờ KB-AZ</w:t>
+      </w:r>
+      <w:r>
+        <w:t xml:space="preserve"> (ví dụ </w:t>
+      </w:r>
+      <w:r>
+        <w:rPr>
+          <w:rFonts w:ascii="Consolas" w:hAnsi="Consolas"/>
+          <w:sz w:val="19"/>
+        </w:rPr>
+        <w:t>EPLLAO-tat_toan-a6313dd63966:2026-10:99c2aab478f2</w:t>
+      </w:r>
+      <w:r>
+        <w:t xml:space="preserve"> 625/1601 · 1.210.000 LAK) chỉ nằm ở LAO, chưa sang DB của anh.</w:t>
+      </w:r>
+    </w:p>
+    <w:p>
+      <w:pPr>
+        <w:pStyle w:val="ListBullet"/>
+      </w:pPr>
+      <w:r>
+        <w:rPr>
+          <w:b/>
+        </w:rPr>
+        <w:t>Trừ hàng quầy 4022/707</w:t>
+      </w:r>
+      <w:r>
+        <w:t xml:space="preserve"> chưa đi thật lượt KB-AZ (chủ xe không có phiếu bán chờ trừ).</w:t>
       </w:r>
     </w:p>
     <w:p>

</xml_diff>